<commit_message>
Project setup WIP. Start of .gitignore and README.
</commit_message>
<xml_diff>
--- a/documents/project-proposal-bryce-699.docx
+++ b/documents/project-proposal-bryce-699.docx
@@ -235,15 +235,73 @@
         <w:lastRenderedPageBreak/>
         <w:t>Milestones</w:t>
       </w:r>
-    </w:p>
-    <w:p>
-      <w:pPr>
-        <w:spacing w:line="480" w:lineRule="auto"/>
-        <w:rPr>
-          <w:rFonts w:cs="Times New Roman"/>
-          <w:szCs w:val="24"/>
-        </w:rPr>
-      </w:pPr>
+      <w:r>
+        <w:rPr>
+          <w:rFonts w:cs="Times New Roman"/>
+          <w:b/>
+          <w:bCs/>
+          <w:szCs w:val="24"/>
+        </w:rPr>
+        <w:t>/Deadlines</w:t>
+      </w:r>
+    </w:p>
+    <w:p>
+      <w:pPr>
+        <w:spacing w:line="480" w:lineRule="auto"/>
+        <w:rPr>
+          <w:rFonts w:cs="Times New Roman"/>
+          <w:szCs w:val="24"/>
+        </w:rPr>
+      </w:pPr>
+      <w:r>
+        <w:rPr>
+          <w:rFonts w:cs="Times New Roman"/>
+          <w:szCs w:val="24"/>
+        </w:rPr>
+        <w:t>The table below acts as a general guide for the Milestones set for th</w:t>
+      </w:r>
+      <w:r>
+        <w:rPr>
+          <w:rFonts w:cs="Times New Roman"/>
+          <w:szCs w:val="24"/>
+        </w:rPr>
+        <w:t>is</w:t>
+      </w:r>
+      <w:r>
+        <w:rPr>
+          <w:rFonts w:cs="Times New Roman"/>
+          <w:szCs w:val="24"/>
+        </w:rPr>
+        <w:t xml:space="preserve"> project. The full list of tasks for each milestone is compiled in the </w:t>
+      </w:r>
+      <w:r>
+        <w:rPr>
+          <w:rFonts w:cs="Times New Roman"/>
+          <w:szCs w:val="24"/>
+        </w:rPr>
+        <w:t>Milestones-for-</w:t>
+      </w:r>
+      <w:r>
+        <w:rPr>
+          <w:rFonts w:cs="Times New Roman"/>
+          <w:szCs w:val="24"/>
+        </w:rPr>
+        <w:t>thesis</w:t>
+      </w:r>
+      <w:r>
+        <w:rPr>
+          <w:rFonts w:cs="Times New Roman"/>
+          <w:szCs w:val="24"/>
+        </w:rPr>
+        <w:t>.xlsx</w:t>
+      </w:r>
+      <w:r>
+        <w:rPr>
+          <w:rFonts w:cs="Times New Roman"/>
+          <w:szCs w:val="24"/>
+        </w:rPr>
+        <w:t xml:space="preserve"> under the documents folder in the project GitHub.</w:t>
+      </w:r>
     </w:p>
     <w:tbl>
       <w:tblPr>
@@ -252,13 +310,13 @@
         <w:tblLook w:val="04A0" w:firstRow="1" w:lastRow="0" w:firstColumn="1" w:lastColumn="0" w:noHBand="0" w:noVBand="1"/>
       </w:tblPr>
       <w:tblGrid>
-        <w:gridCol w:w="4675"/>
-        <w:gridCol w:w="4675"/>
+        <w:gridCol w:w="5395"/>
+        <w:gridCol w:w="3955"/>
       </w:tblGrid>
       <w:tr>
         <w:tc>
           <w:tcPr>
-            <w:tcW w:w="4675" w:type="dxa"/>
+            <w:tcW w:w="5395" w:type="dxa"/>
           </w:tcPr>
           <w:p>
             <w:pPr>
@@ -283,7 +341,7 @@
         </w:tc>
         <w:tc>
           <w:tcPr>
-            <w:tcW w:w="4675" w:type="dxa"/>
+            <w:tcW w:w="3955" w:type="dxa"/>
           </w:tcPr>
           <w:p>
             <w:pPr>
@@ -310,7 +368,7 @@
       <w:tr>
         <w:tc>
           <w:tcPr>
-            <w:tcW w:w="4675" w:type="dxa"/>
+            <w:tcW w:w="5395" w:type="dxa"/>
           </w:tcPr>
           <w:p>
             <w:pPr>
@@ -331,7 +389,7 @@
         </w:tc>
         <w:tc>
           <w:tcPr>
-            <w:tcW w:w="4675" w:type="dxa"/>
+            <w:tcW w:w="3955" w:type="dxa"/>
           </w:tcPr>
           <w:p>
             <w:pPr>
@@ -354,7 +412,7 @@
       <w:tr>
         <w:tc>
           <w:tcPr>
-            <w:tcW w:w="4675" w:type="dxa"/>
+            <w:tcW w:w="5395" w:type="dxa"/>
           </w:tcPr>
           <w:p>
             <w:pPr>
@@ -375,7 +433,7 @@
         </w:tc>
         <w:tc>
           <w:tcPr>
-            <w:tcW w:w="4675" w:type="dxa"/>
+            <w:tcW w:w="3955" w:type="dxa"/>
           </w:tcPr>
           <w:p>
             <w:pPr>
@@ -398,7 +456,7 @@
       <w:tr>
         <w:tc>
           <w:tcPr>
-            <w:tcW w:w="4675" w:type="dxa"/>
+            <w:tcW w:w="5395" w:type="dxa"/>
           </w:tcPr>
           <w:p>
             <w:pPr>
@@ -419,7 +477,7 @@
         </w:tc>
         <w:tc>
           <w:tcPr>
-            <w:tcW w:w="4675" w:type="dxa"/>
+            <w:tcW w:w="3955" w:type="dxa"/>
           </w:tcPr>
           <w:p>
             <w:pPr>
@@ -442,7 +500,7 @@
       <w:tr>
         <w:tc>
           <w:tcPr>
-            <w:tcW w:w="4675" w:type="dxa"/>
+            <w:tcW w:w="5395" w:type="dxa"/>
           </w:tcPr>
           <w:p>
             <w:pPr>
@@ -463,7 +521,7 @@
         </w:tc>
         <w:tc>
           <w:tcPr>
-            <w:tcW w:w="4675" w:type="dxa"/>
+            <w:tcW w:w="3955" w:type="dxa"/>
           </w:tcPr>
           <w:p>
             <w:pPr>
@@ -478,7 +536,7 @@
       <w:tr>
         <w:tc>
           <w:tcPr>
-            <w:tcW w:w="4675" w:type="dxa"/>
+            <w:tcW w:w="5395" w:type="dxa"/>
           </w:tcPr>
           <w:p>
             <w:pPr>
@@ -499,7 +557,7 @@
         </w:tc>
         <w:tc>
           <w:tcPr>
-            <w:tcW w:w="4675" w:type="dxa"/>
+            <w:tcW w:w="3955" w:type="dxa"/>
           </w:tcPr>
           <w:p>
             <w:pPr>
@@ -523,7 +581,7 @@
       <w:tr>
         <w:tc>
           <w:tcPr>
-            <w:tcW w:w="4675" w:type="dxa"/>
+            <w:tcW w:w="5395" w:type="dxa"/>
           </w:tcPr>
           <w:p>
             <w:pPr>
@@ -544,7 +602,7 @@
         </w:tc>
         <w:tc>
           <w:tcPr>
-            <w:tcW w:w="4675" w:type="dxa"/>
+            <w:tcW w:w="3955" w:type="dxa"/>
           </w:tcPr>
           <w:p>
             <w:pPr>
@@ -567,7 +625,7 @@
       <w:tr>
         <w:tc>
           <w:tcPr>
-            <w:tcW w:w="4675" w:type="dxa"/>
+            <w:tcW w:w="5395" w:type="dxa"/>
           </w:tcPr>
           <w:p>
             <w:pPr>
@@ -588,7 +646,7 @@
         </w:tc>
         <w:tc>
           <w:tcPr>
-            <w:tcW w:w="4675" w:type="dxa"/>
+            <w:tcW w:w="3955" w:type="dxa"/>
           </w:tcPr>
           <w:p>
             <w:pPr>
@@ -611,7 +669,7 @@
       <w:tr>
         <w:tc>
           <w:tcPr>
-            <w:tcW w:w="4675" w:type="dxa"/>
+            <w:tcW w:w="5395" w:type="dxa"/>
           </w:tcPr>
           <w:p>
             <w:pPr>
@@ -632,7 +690,7 @@
         </w:tc>
         <w:tc>
           <w:tcPr>
-            <w:tcW w:w="4675" w:type="dxa"/>
+            <w:tcW w:w="3955" w:type="dxa"/>
           </w:tcPr>
           <w:p>
             <w:pPr>
@@ -647,7 +705,7 @@
       <w:tr>
         <w:tc>
           <w:tcPr>
-            <w:tcW w:w="4675" w:type="dxa"/>
+            <w:tcW w:w="5395" w:type="dxa"/>
           </w:tcPr>
           <w:p>
             <w:pPr>
@@ -668,7 +726,7 @@
         </w:tc>
         <w:tc>
           <w:tcPr>
-            <w:tcW w:w="4675" w:type="dxa"/>
+            <w:tcW w:w="3955" w:type="dxa"/>
           </w:tcPr>
           <w:p>
             <w:pPr>
@@ -691,7 +749,7 @@
       <w:tr>
         <w:tc>
           <w:tcPr>
-            <w:tcW w:w="4675" w:type="dxa"/>
+            <w:tcW w:w="5395" w:type="dxa"/>
           </w:tcPr>
           <w:p>
             <w:pPr>
@@ -712,7 +770,7 @@
         </w:tc>
         <w:tc>
           <w:tcPr>
-            <w:tcW w:w="4675" w:type="dxa"/>
+            <w:tcW w:w="3955" w:type="dxa"/>
           </w:tcPr>
           <w:p>
             <w:pPr>
@@ -1972,23 +2030,7 @@
           <w:bCs/>
           <w:szCs w:val="24"/>
         </w:rPr>
-        <w:t xml:space="preserve">The simulation must be able to run both a single prey type as well as a full simulation with all three prey types. </w:t>
-      </w:r>
-      <w:r>
-        <w:rPr>
-          <w:rFonts w:cs="Times New Roman"/>
-          <w:bCs/>
-          <w:szCs w:val="24"/>
-        </w:rPr>
-        <w:t>The simulation must keep track of and output correct data on the number of generations simulated, overall population size of each generation, and individual predators in each generation (including their stats) where the correct data will be determined by simulation type.</w:t>
-      </w:r>
-      <w:r>
-        <w:rPr>
-          <w:rFonts w:cs="Times New Roman"/>
-          <w:bCs/>
-          <w:szCs w:val="24"/>
-        </w:rPr>
-        <w:t xml:space="preserve"> Finnly</w:t>
+        <w:t>The simulation must be able to run both a single prey type as well as a full simulation with all three prey types. The simulation must keep track of and output correct data on the number of generations simulated, overall population size of each generation, and individual predators in each generation (including their stats) where the correct data will be determined by simulation type. Finnly</w:t>
       </w:r>
       <w:r>
         <w:rPr>
@@ -3028,6 +3070,7 @@
   <w:style w:type="character" w:default="1" w:styleId="DefaultParagraphFont">
     <w:name w:val="Default Paragraph Font"/>
     <w:uiPriority w:val="1"/>
+    <w:semiHidden/>
     <w:unhideWhenUsed/>
   </w:style>
   <w:style w:type="table" w:default="1" w:styleId="TableNormal">

</xml_diff>

<commit_message>
Week 1 Final update.
</commit_message>
<xml_diff>
--- a/documents/project-proposal-bryce-699.docx
+++ b/documents/project-proposal-bryce-699.docx
@@ -279,21 +279,7 @@
           <w:rFonts w:cs="Times New Roman"/>
           <w:szCs w:val="24"/>
         </w:rPr>
-        <w:t>Milestones-for-</w:t>
-      </w:r>
-      <w:r>
-        <w:rPr>
-          <w:rFonts w:cs="Times New Roman"/>
-          <w:szCs w:val="24"/>
-        </w:rPr>
-        <w:t>thesis</w:t>
-      </w:r>
-      <w:r>
-        <w:rPr>
-          <w:rFonts w:cs="Times New Roman"/>
-          <w:szCs w:val="24"/>
-        </w:rPr>
-        <w:t>.xlsx</w:t>
+        <w:t>Milestones-for-thesis.xlsx</w:t>
       </w:r>
       <w:r>
         <w:rPr>
@@ -857,7 +843,6 @@
           <w:szCs w:val="24"/>
         </w:rPr>
       </w:pPr>
-      <w:commentRangeStart w:id="0"/>
       <w:r>
         <w:rPr>
           <w:rFonts w:cs="Times New Roman"/>
@@ -898,7 +883,14 @@
           <w:rFonts w:cs="Times New Roman"/>
           <w:szCs w:val="24"/>
         </w:rPr>
-        <w:t>Such evolution can be helpful to understand how predators contribute to a stable ecosystem</w:t>
+        <w:t>This is important to because such</w:t>
+      </w:r>
+      <w:r>
+        <w:rPr>
+          <w:rFonts w:cs="Times New Roman"/>
+          <w:szCs w:val="24"/>
+        </w:rPr>
+        <w:t xml:space="preserve"> evolution can be helpful to understand how predators contribute to a stable ecosystem</w:t>
       </w:r>
       <w:r>
         <w:rPr>
@@ -960,14 +952,78 @@
           <w:rFonts w:cs="Times New Roman"/>
           <w:szCs w:val="24"/>
         </w:rPr>
-        <w:t>Without understanding the role predators play, we can inadvertently put both predator and prey populations at risk.</w:t>
-      </w:r>
-      <w:r>
-        <w:rPr>
-          <w:rFonts w:cs="Times New Roman"/>
-          <w:szCs w:val="24"/>
-        </w:rPr>
-        <w:t xml:space="preserve"> The end user will be researchers (myself) using </w:t>
+        <w:t>Without understanding the role predators play, we can inadvertently put both predator and prey populations at risk</w:t>
+      </w:r>
+      <w:r>
+        <w:rPr>
+          <w:rFonts w:cs="Times New Roman"/>
+          <w:szCs w:val="24"/>
+        </w:rPr>
+        <w:t xml:space="preserve"> if we </w:t>
+      </w:r>
+      <w:r>
+        <w:rPr>
+          <w:rFonts w:cs="Times New Roman"/>
+          <w:szCs w:val="24"/>
+        </w:rPr>
+        <w:t>drive</w:t>
+      </w:r>
+      <w:r>
+        <w:rPr>
+          <w:rFonts w:cs="Times New Roman"/>
+          <w:szCs w:val="24"/>
+        </w:rPr>
+        <w:t xml:space="preserve"> </w:t>
+      </w:r>
+      <w:r>
+        <w:rPr>
+          <w:rFonts w:cs="Times New Roman"/>
+          <w:szCs w:val="24"/>
+        </w:rPr>
+        <w:t xml:space="preserve">a species </w:t>
+      </w:r>
+      <w:r>
+        <w:rPr>
+          <w:rFonts w:cs="Times New Roman"/>
+          <w:szCs w:val="24"/>
+        </w:rPr>
+        <w:t xml:space="preserve">to </w:t>
+      </w:r>
+      <w:r>
+        <w:rPr>
+          <w:rFonts w:cs="Times New Roman"/>
+          <w:szCs w:val="24"/>
+        </w:rPr>
+        <w:lastRenderedPageBreak/>
+        <w:t>extinction</w:t>
+      </w:r>
+      <w:r>
+        <w:rPr>
+          <w:rFonts w:cs="Times New Roman"/>
+          <w:szCs w:val="24"/>
+        </w:rPr>
+        <w:t>.</w:t>
+      </w:r>
+      <w:r>
+        <w:rPr>
+          <w:rFonts w:cs="Times New Roman"/>
+          <w:szCs w:val="24"/>
+        </w:rPr>
+        <w:t xml:space="preserve"> </w:t>
+      </w:r>
+      <w:r>
+        <w:rPr>
+          <w:rFonts w:cs="Times New Roman"/>
+          <w:szCs w:val="24"/>
+        </w:rPr>
+        <w:t>Thus, for this project t</w:t>
+      </w:r>
+      <w:r>
+        <w:rPr>
+          <w:rFonts w:cs="Times New Roman"/>
+          <w:szCs w:val="24"/>
+        </w:rPr>
+        <w:t xml:space="preserve">he end user will be researchers (myself) using </w:t>
       </w:r>
       <w:r>
         <w:rPr>
@@ -981,15 +1037,7 @@
           <w:rFonts w:cs="Times New Roman"/>
           <w:szCs w:val="24"/>
         </w:rPr>
-        <w:t xml:space="preserve"> to conduct </w:t>
-      </w:r>
-      <w:r>
-        <w:rPr>
-          <w:rFonts w:cs="Times New Roman"/>
-          <w:szCs w:val="24"/>
-        </w:rPr>
-        <w:lastRenderedPageBreak/>
-        <w:t xml:space="preserve">analysis on predatory evolution. </w:t>
+        <w:t xml:space="preserve"> to conduct analysis on predatory evolution. </w:t>
       </w:r>
       <w:r>
         <w:rPr>
@@ -998,16 +1046,6 @@
         </w:rPr>
         <w:t xml:space="preserve">The final output will be a simulation that mimics the evolution of Ambush and pursuit predators. </w:t>
       </w:r>
-      <w:commentRangeEnd w:id="0"/>
-      <w:r>
-        <w:rPr>
-          <w:rStyle w:val="CommentReference"/>
-          <w:rFonts w:cs="Times New Roman"/>
-          <w:sz w:val="24"/>
-          <w:szCs w:val="24"/>
-        </w:rPr>
-        <w:commentReference w:id="0"/>
-      </w:r>
     </w:p>
     <w:p>
       <w:pPr>
@@ -1033,10 +1071,6 @@
     <w:p>
       <w:pPr>
         <w:spacing w:line="480" w:lineRule="auto"/>
-        <w:rPr>
-          <w:rFonts w:cs="Times New Roman"/>
-          <w:szCs w:val="24"/>
-        </w:rPr>
       </w:pPr>
       <w:r>
         <w:rPr>
@@ -1048,7 +1082,7 @@
       <w:r>
         <w:t xml:space="preserve"> </w:t>
       </w:r>
-      <w:hyperlink r:id="rId12" w:history="1">
+      <w:hyperlink r:id="rId8" w:history="1">
         <w:r>
           <w:rPr>
             <w:rStyle w:val="Hyperlink"/>
@@ -1062,6 +1096,55 @@
     <w:p>
       <w:pPr>
         <w:spacing w:line="480" w:lineRule="auto"/>
+        <w:rPr>
+          <w:rFonts w:cs="Times New Roman"/>
+          <w:szCs w:val="24"/>
+        </w:rPr>
+      </w:pPr>
+      <w:r>
+        <w:rPr>
+          <w:noProof/>
+        </w:rPr>
+        <w:drawing>
+          <wp:inline distT="0" distB="0" distL="0" distR="0" wp14:anchorId="095C4BE8" wp14:editId="445D13F9">
+            <wp:extent cx="5943600" cy="3434080"/>
+            <wp:effectExtent l="0" t="0" r="0" b="0"/>
+            <wp:docPr id="928080370" name="Picture 1"/>
+            <wp:cNvGraphicFramePr>
+              <a:graphicFrameLocks xmlns:a="http://schemas.openxmlformats.org/drawingml/2006/main" noChangeAspect="1"/>
+            </wp:cNvGraphicFramePr>
+            <a:graphic xmlns:a="http://schemas.openxmlformats.org/drawingml/2006/main">
+              <a:graphicData uri="http://schemas.openxmlformats.org/drawingml/2006/picture">
+                <pic:pic xmlns:pic="http://schemas.openxmlformats.org/drawingml/2006/picture">
+                  <pic:nvPicPr>
+                    <pic:cNvPr id="928080370" name=""/>
+                    <pic:cNvPicPr/>
+                  </pic:nvPicPr>
+                  <pic:blipFill>
+                    <a:blip r:embed="rId9"/>
+                    <a:stretch>
+                      <a:fillRect/>
+                    </a:stretch>
+                  </pic:blipFill>
+                  <pic:spPr>
+                    <a:xfrm>
+                      <a:off x="0" y="0"/>
+                      <a:ext cx="5943600" cy="3434080"/>
+                    </a:xfrm>
+                    <a:prstGeom prst="rect">
+                      <a:avLst/>
+                    </a:prstGeom>
+                  </pic:spPr>
+                </pic:pic>
+              </a:graphicData>
+            </a:graphic>
+          </wp:inline>
+        </w:drawing>
+      </w:r>
+    </w:p>
+    <w:p>
+      <w:pPr>
+        <w:spacing w:line="480" w:lineRule="auto"/>
         <w:jc w:val="center"/>
         <w:rPr>
           <w:rFonts w:cs="Times New Roman"/>
@@ -1120,24 +1203,39 @@
           <w:szCs w:val="24"/>
         </w:rPr>
       </w:pPr>
-      <w:commentRangeStart w:id="1"/>
-      <w:r>
-        <w:rPr>
-          <w:rFonts w:cs="Times New Roman"/>
-          <w:szCs w:val="24"/>
-        </w:rPr>
-        <w:t>Allesina, Stefano, and Si Tang. 2012. “Stability Criteria for Complex Ecosystems.” Nature 483(7388):205–8. doi:10.1038/nature10832.</w:t>
-      </w:r>
-    </w:p>
-    <w:p>
-      <w:pPr>
-        <w:spacing w:line="480" w:lineRule="auto"/>
-        <w:ind w:left="360"/>
-        <w:rPr>
-          <w:rFonts w:cs="Times New Roman"/>
-          <w:szCs w:val="24"/>
-        </w:rPr>
-      </w:pPr>
+      <w:proofErr w:type="spellStart"/>
+      <w:r>
+        <w:rPr>
+          <w:rFonts w:cs="Times New Roman"/>
+          <w:szCs w:val="24"/>
+        </w:rPr>
+        <w:t>Allesina</w:t>
+      </w:r>
+      <w:proofErr w:type="spellEnd"/>
+      <w:r>
+        <w:rPr>
+          <w:rFonts w:cs="Times New Roman"/>
+          <w:szCs w:val="24"/>
+        </w:rPr>
+        <w:t>, Stefano, and Si Tang. 2012. “Stability Criteria for Complex Ecosystems.” Nature 483(7388):205–8. doi:10.1038/nature10832.</w:t>
+      </w:r>
+    </w:p>
+    <w:p>
+      <w:pPr>
+        <w:spacing w:line="480" w:lineRule="auto"/>
+        <w:ind w:left="360" w:firstLine="360"/>
+        <w:rPr>
+          <w:rFonts w:cs="Times New Roman"/>
+          <w:szCs w:val="24"/>
+        </w:rPr>
+      </w:pPr>
+      <w:r>
+        <w:rPr>
+          <w:rFonts w:cs="Times New Roman"/>
+          <w:szCs w:val="24"/>
+        </w:rPr>
+        <w:t>This source looks at how animals affect an ecosystem and defines the criteria for a stable ecosystem. The main relevance of this source is in the roles it defines for predators in an ecosystem. It acts as one of the main driving sources for why this project matters and why it matters that we understand the role predators play in an ecosystem.</w:t>
+      </w:r>
     </w:p>
     <w:p>
       <w:pPr>
@@ -1157,17 +1255,47 @@
           <w:rFonts w:cs="Times New Roman"/>
           <w:szCs w:val="24"/>
         </w:rPr>
+        <w:lastRenderedPageBreak/>
         <w:t>Atmar, W. 1994. “Notes on the Simulation of Evolution.” IEEE Transactions on Neural Networks 5(1):130–47. doi:10.1109/72.265967.</w:t>
       </w:r>
     </w:p>
     <w:p>
       <w:pPr>
-        <w:pStyle w:val="ListParagraph"/>
-        <w:rPr>
-          <w:rFonts w:cs="Times New Roman"/>
-          <w:szCs w:val="24"/>
-        </w:rPr>
-      </w:pPr>
+        <w:ind w:left="360"/>
+        <w:rPr>
+          <w:rFonts w:cs="Times New Roman"/>
+          <w:szCs w:val="24"/>
+        </w:rPr>
+      </w:pPr>
+      <w:r>
+        <w:rPr>
+          <w:rFonts w:cs="Times New Roman"/>
+          <w:szCs w:val="24"/>
+        </w:rPr>
+        <w:t>This source acts as a baseline for how to simulate evolution. It highlights important</w:t>
+      </w:r>
+    </w:p>
+    <w:p>
+      <w:pPr>
+        <w:rPr>
+          <w:rFonts w:cs="Times New Roman"/>
+          <w:szCs w:val="24"/>
+        </w:rPr>
+      </w:pPr>
+      <w:r>
+        <w:rPr>
+          <w:rFonts w:cs="Times New Roman"/>
+          <w:szCs w:val="24"/>
+        </w:rPr>
+        <w:t xml:space="preserve">criteria for </w:t>
+      </w:r>
+      <w:r>
+        <w:rPr>
+          <w:rFonts w:cs="Times New Roman"/>
+          <w:szCs w:val="24"/>
+        </w:rPr>
+        <w:t>how to validate evolution simulations. The source also talks about considerations when building out an evolution simulation. For this project it acts as the main checkpoint to validate the correctness of the simulation being built.</w:t>
+      </w:r>
     </w:p>
     <w:p>
       <w:pPr>
@@ -1196,18 +1324,41 @@
           <w:rFonts w:cs="Times New Roman"/>
           <w:szCs w:val="24"/>
         </w:rPr>
-        <w:t>Michalko, Radek, and Stano Pekár. 2016. “Different Hunting Strategies of Generalist Predators Result in Functional Differences.” Oecologia 181(4):1187–97. doi:10.1007/s00442-016-3631-4.</w:t>
-      </w:r>
-    </w:p>
-    <w:p>
-      <w:pPr>
-        <w:spacing w:line="480" w:lineRule="auto"/>
-        <w:ind w:left="360"/>
-        <w:rPr>
-          <w:rFonts w:cs="Times New Roman"/>
-          <w:szCs w:val="24"/>
-        </w:rPr>
-      </w:pPr>
+        <w:t xml:space="preserve">Michalko, Radek, and Stano Pekár. 2016. “Different Hunting Strategies of Generalist Predators Result in Functional Differences.” </w:t>
+      </w:r>
+      <w:proofErr w:type="spellStart"/>
+      <w:r>
+        <w:rPr>
+          <w:rFonts w:cs="Times New Roman"/>
+          <w:szCs w:val="24"/>
+        </w:rPr>
+        <w:t>Oecologia</w:t>
+      </w:r>
+      <w:proofErr w:type="spellEnd"/>
+      <w:r>
+        <w:rPr>
+          <w:rFonts w:cs="Times New Roman"/>
+          <w:szCs w:val="24"/>
+        </w:rPr>
+        <w:t xml:space="preserve"> 181(4):1187–97. doi:10.1007/s00442-016-3631-4.</w:t>
+      </w:r>
+    </w:p>
+    <w:p>
+      <w:pPr>
+        <w:spacing w:line="480" w:lineRule="auto"/>
+        <w:ind w:firstLine="360"/>
+        <w:rPr>
+          <w:rFonts w:cs="Times New Roman"/>
+          <w:szCs w:val="24"/>
+        </w:rPr>
+      </w:pPr>
+      <w:r>
+        <w:rPr>
+          <w:rFonts w:cs="Times New Roman"/>
+          <w:szCs w:val="24"/>
+        </w:rPr>
+        <w:t>This source acts as a reference for the strategies chosen to be explored in this simulation. For this simulation the hunting strategies of predators have been limited to pursuit and ambush. While this source focuses on even more strategies it highlights the pursuit and ambush hunting strategies. For this reason, this source acts as a guide for properties chosen to build out pursuit and ambush predators.</w:t>
+      </w:r>
     </w:p>
     <w:p>
       <w:pPr>
@@ -1227,7 +1378,55 @@
           <w:rFonts w:cs="Times New Roman"/>
           <w:szCs w:val="24"/>
         </w:rPr>
-        <w:t>Murray, Dennis L., Stan Boutin, Mark O’Donoghue, and Vilis O. Nams. 1995. “Hunting Behaviour of a Sympatric Felid and Canid in Relation to Vegetative Cover.” Animal Behaviour 50(5):1203–10. doi:10.1016/0003-3472(95)80037-9.</w:t>
+        <w:t xml:space="preserve">Murray, Dennis L., Stan Boutin, Mark O’Donoghue, and Vilis O. </w:t>
+      </w:r>
+      <w:proofErr w:type="spellStart"/>
+      <w:r>
+        <w:rPr>
+          <w:rFonts w:cs="Times New Roman"/>
+          <w:szCs w:val="24"/>
+        </w:rPr>
+        <w:t>Nams</w:t>
+      </w:r>
+      <w:proofErr w:type="spellEnd"/>
+      <w:r>
+        <w:rPr>
+          <w:rFonts w:cs="Times New Roman"/>
+          <w:szCs w:val="24"/>
+        </w:rPr>
+        <w:t xml:space="preserve">. 1995. “Hunting </w:t>
+      </w:r>
+      <w:proofErr w:type="spellStart"/>
+      <w:r>
+        <w:rPr>
+          <w:rFonts w:cs="Times New Roman"/>
+          <w:szCs w:val="24"/>
+        </w:rPr>
+        <w:t>Behaviour</w:t>
+      </w:r>
+      <w:proofErr w:type="spellEnd"/>
+      <w:r>
+        <w:rPr>
+          <w:rFonts w:cs="Times New Roman"/>
+          <w:szCs w:val="24"/>
+        </w:rPr>
+        <w:t xml:space="preserve"> of a Sympatric Felid and Canid in Relation to Vegetative Cover.” Animal </w:t>
+      </w:r>
+      <w:proofErr w:type="spellStart"/>
+      <w:r>
+        <w:rPr>
+          <w:rFonts w:cs="Times New Roman"/>
+          <w:szCs w:val="24"/>
+        </w:rPr>
+        <w:t>Behaviour</w:t>
+      </w:r>
+      <w:proofErr w:type="spellEnd"/>
+      <w:r>
+        <w:rPr>
+          <w:rFonts w:cs="Times New Roman"/>
+          <w:szCs w:val="24"/>
+        </w:rPr>
+        <w:t xml:space="preserve"> 50(5):1203–10. doi:10.1016/0003-3472(95)80037-9.</w:t>
       </w:r>
     </w:p>
     <w:p>
@@ -1242,11 +1441,78 @@
     <w:p>
       <w:pPr>
         <w:spacing w:line="480" w:lineRule="auto"/>
-        <w:rPr>
-          <w:rFonts w:cs="Times New Roman"/>
-          <w:szCs w:val="24"/>
-        </w:rPr>
-      </w:pPr>
+        <w:ind w:firstLine="360"/>
+        <w:rPr>
+          <w:rFonts w:cs="Times New Roman"/>
+          <w:szCs w:val="24"/>
+        </w:rPr>
+      </w:pPr>
+      <w:r>
+        <w:rPr>
+          <w:rFonts w:cs="Times New Roman"/>
+          <w:szCs w:val="24"/>
+        </w:rPr>
+        <w:t xml:space="preserve">This source acts as the main inspiration for this project. The source highlights how two animals in the same environment hunting the same prey can use the environment in completely different ways. For this source it looks at coyotes and lynxes hunting use of vegetation cover when hunting. However, it also highlights the strategies that </w:t>
+      </w:r>
+      <w:proofErr w:type="gramStart"/>
+      <w:r>
+        <w:rPr>
+          <w:rFonts w:cs="Times New Roman"/>
+          <w:szCs w:val="24"/>
+        </w:rPr>
+        <w:t>both use</w:t>
+      </w:r>
+      <w:proofErr w:type="gramEnd"/>
+      <w:r>
+        <w:rPr>
+          <w:rFonts w:cs="Times New Roman"/>
+          <w:szCs w:val="24"/>
+        </w:rPr>
+        <w:t xml:space="preserve"> when hunting. Coyotes use a method of pursuit hunting while lynxes use a method of ambush hunting. While not the main point of the paper it does go into detail about the two strategies and how they </w:t>
+      </w:r>
+      <w:r>
+        <w:rPr>
+          <w:rFonts w:cs="Times New Roman"/>
+          <w:szCs w:val="24"/>
+        </w:rPr>
+        <w:t>affected</w:t>
+      </w:r>
+      <w:r>
+        <w:rPr>
+          <w:rFonts w:cs="Times New Roman"/>
+          <w:szCs w:val="24"/>
+        </w:rPr>
+        <w:t xml:space="preserve"> the catch </w:t>
+      </w:r>
+      <w:r>
+        <w:rPr>
+          <w:rFonts w:cs="Times New Roman"/>
+          <w:szCs w:val="24"/>
+        </w:rPr>
+        <w:lastRenderedPageBreak/>
+        <w:t xml:space="preserve">rates for each predator. </w:t>
+      </w:r>
+      <w:r>
+        <w:rPr>
+          <w:rFonts w:cs="Times New Roman"/>
+          <w:szCs w:val="24"/>
+        </w:rPr>
+        <w:t>This part of the paper ended up acting as the catalyst for this project</w:t>
+      </w:r>
+      <w:r>
+        <w:rPr>
+          <w:rFonts w:cs="Times New Roman"/>
+          <w:szCs w:val="24"/>
+        </w:rPr>
+        <w:t>’</w:t>
+      </w:r>
+      <w:r>
+        <w:rPr>
+          <w:rFonts w:cs="Times New Roman"/>
+          <w:szCs w:val="24"/>
+        </w:rPr>
+        <w:t>s point of study.</w:t>
+      </w:r>
     </w:p>
     <w:p>
       <w:pPr>
@@ -1266,28 +1532,85 @@
           <w:rFonts w:cs="Times New Roman"/>
           <w:szCs w:val="24"/>
         </w:rPr>
-        <w:t>Netz, Christoph, Hanno Hildenbrandt, and Franz J. Weissing. 2022. “Complex Eco-Evolutionary Dynamics Induced by the Coevolution of Predator–Prey Movement Strategies.” Evolutionary Ecology 36(1):1–17. doi:10.1007/s10682-021-10140-x.</w:t>
-      </w:r>
-      <w:commentRangeEnd w:id="1"/>
-      <w:r>
-        <w:rPr>
-          <w:rStyle w:val="CommentReference"/>
-          <w:rFonts w:cs="Times New Roman"/>
-          <w:sz w:val="24"/>
-          <w:szCs w:val="24"/>
-        </w:rPr>
-        <w:commentReference w:id="1"/>
-      </w:r>
-    </w:p>
-    <w:p>
-      <w:pPr>
-        <w:spacing w:line="480" w:lineRule="auto"/>
-        <w:ind w:left="360"/>
-        <w:rPr>
-          <w:rFonts w:cs="Times New Roman"/>
-          <w:szCs w:val="24"/>
-        </w:rPr>
-      </w:pPr>
+        <w:t xml:space="preserve">Netz, Christoph, Hanno Hildenbrandt, and Franz J. </w:t>
+      </w:r>
+      <w:proofErr w:type="spellStart"/>
+      <w:r>
+        <w:rPr>
+          <w:rFonts w:cs="Times New Roman"/>
+          <w:szCs w:val="24"/>
+        </w:rPr>
+        <w:t>Weissing</w:t>
+      </w:r>
+      <w:proofErr w:type="spellEnd"/>
+      <w:r>
+        <w:rPr>
+          <w:rFonts w:cs="Times New Roman"/>
+          <w:szCs w:val="24"/>
+        </w:rPr>
+        <w:t>. 2022. “Complex Eco-Evolutionary Dynamics Induced by the Coevolution of Predator–Prey Movement Strategies.” Evolutionary Ecology 36(1):1–17. doi:10.1007/s10682-021-10140-x.</w:t>
+      </w:r>
+    </w:p>
+    <w:p>
+      <w:pPr>
+        <w:spacing w:line="480" w:lineRule="auto"/>
+        <w:ind w:firstLine="360"/>
+        <w:rPr>
+          <w:rFonts w:cs="Times New Roman"/>
+          <w:szCs w:val="24"/>
+        </w:rPr>
+      </w:pPr>
+      <w:r>
+        <w:rPr>
+          <w:rFonts w:cs="Times New Roman"/>
+          <w:szCs w:val="24"/>
+        </w:rPr>
+        <w:t xml:space="preserve">This source acts as the main simulation reference when building out the plans for this project’s simulation. The study looks at movement/pathfinding algorithms for predator-prey simulations. The main finding of the study was a statistical pathfinding algorithm that looks at each of the available cells a creature can move to and assign them a weight to calculate the best move for a creature </w:t>
+      </w:r>
+      <w:r>
+        <w:rPr>
+          <w:rFonts w:cs="Times New Roman"/>
+          <w:szCs w:val="24"/>
+        </w:rPr>
+        <w:t>to</w:t>
+      </w:r>
+      <w:r>
+        <w:rPr>
+          <w:rFonts w:cs="Times New Roman"/>
+          <w:szCs w:val="24"/>
+        </w:rPr>
+        <w:t xml:space="preserve"> make. For this project, the study is going to act as a reference for the </w:t>
+      </w:r>
+      <w:proofErr w:type="gramStart"/>
+      <w:r>
+        <w:rPr>
+          <w:rFonts w:cs="Times New Roman"/>
+          <w:szCs w:val="24"/>
+        </w:rPr>
+        <w:t>pathfinding</w:t>
+      </w:r>
+      <w:proofErr w:type="gramEnd"/>
+      <w:r>
+        <w:rPr>
+          <w:rFonts w:cs="Times New Roman"/>
+          <w:szCs w:val="24"/>
+        </w:rPr>
+        <w:t xml:space="preserve"> algorithm</w:t>
+      </w:r>
+      <w:r>
+        <w:rPr>
+          <w:rFonts w:cs="Times New Roman"/>
+          <w:szCs w:val="24"/>
+        </w:rPr>
+        <w:t xml:space="preserve"> that is intended to be</w:t>
+      </w:r>
+      <w:r>
+        <w:rPr>
+          <w:rFonts w:cs="Times New Roman"/>
+          <w:szCs w:val="24"/>
+        </w:rPr>
+        <w:t xml:space="preserve"> built for this simulation. </w:t>
+      </w:r>
     </w:p>
     <w:p>
       <w:pPr>
@@ -1512,7 +1835,7 @@
         </w:rPr>
         <w:t xml:space="preserve">Backup: </w:t>
       </w:r>
-      <w:hyperlink r:id="rId13" w:history="1">
+      <w:hyperlink r:id="rId10" w:history="1">
         <w:r>
           <w:rPr>
             <w:rStyle w:val="Hyperlink"/>
@@ -1748,7 +2071,7 @@
           <w:szCs w:val="24"/>
         </w:rPr>
       </w:pPr>
-      <w:hyperlink r:id="rId14" w:history="1">
+      <w:hyperlink r:id="rId11" w:history="1">
         <w:r>
           <w:rPr>
             <w:rStyle w:val="Hyperlink"/>
@@ -1779,7 +2102,7 @@
           <w:szCs w:val="24"/>
         </w:rPr>
       </w:pPr>
-      <w:hyperlink r:id="rId15" w:history="1">
+      <w:hyperlink r:id="rId12" w:history="1">
         <w:r>
           <w:rPr>
             <w:rStyle w:val="Hyperlink"/>
@@ -1810,7 +2133,7 @@
           <w:szCs w:val="24"/>
         </w:rPr>
       </w:pPr>
-      <w:hyperlink r:id="rId16" w:history="1">
+      <w:hyperlink r:id="rId13" w:history="1">
         <w:r>
           <w:rPr>
             <w:rStyle w:val="Hyperlink"/>
@@ -1841,7 +2164,8 @@
           <w:szCs w:val="24"/>
         </w:rPr>
       </w:pPr>
-      <w:hyperlink r:id="rId17" w:history="1">
+      <w:hyperlink r:id="rId14" w:history="1">
+        <w:proofErr w:type="spellStart"/>
         <w:r>
           <w:rPr>
             <w:rStyle w:val="Hyperlink"/>
@@ -1850,6 +2174,7 @@
           </w:rPr>
           <w:t>Mathplotlib</w:t>
         </w:r>
+        <w:proofErr w:type="spellEnd"/>
       </w:hyperlink>
       <w:r>
         <w:rPr>
@@ -1872,7 +2197,7 @@
           <w:szCs w:val="24"/>
         </w:rPr>
       </w:pPr>
-      <w:hyperlink r:id="rId18" w:history="1">
+      <w:hyperlink r:id="rId15" w:history="1">
         <w:r>
           <w:rPr>
             <w:rStyle w:val="Hyperlink"/>
@@ -1965,7 +2290,25 @@
           <w:bCs/>
           <w:szCs w:val="24"/>
         </w:rPr>
-        <w:t xml:space="preserve">Currently, I need to find a supervisor for my project. The main focus of my project is simulation work with a mixture of Biology and Evolutionary Game Theory. </w:t>
+        <w:t xml:space="preserve">Currently, I need to find a supervisor for my project. The </w:t>
+      </w:r>
+      <w:proofErr w:type="gramStart"/>
+      <w:r>
+        <w:rPr>
+          <w:rFonts w:cs="Times New Roman"/>
+          <w:bCs/>
+          <w:szCs w:val="24"/>
+        </w:rPr>
+        <w:t>main focus</w:t>
+      </w:r>
+      <w:proofErr w:type="gramEnd"/>
+      <w:r>
+        <w:rPr>
+          <w:rFonts w:cs="Times New Roman"/>
+          <w:bCs/>
+          <w:szCs w:val="24"/>
+        </w:rPr>
+        <w:t xml:space="preserve"> of my project is simulation work with a mixture of Biology and Evolutionary Game Theory. </w:t>
       </w:r>
       <w:r>
         <w:rPr>
@@ -1997,16 +2340,7 @@
           <w:bCs/>
           <w:szCs w:val="24"/>
         </w:rPr>
-        <w:t xml:space="preserve">he simulation must run without error for any </w:t>
-      </w:r>
-      <w:r>
-        <w:rPr>
-          <w:rFonts w:cs="Times New Roman"/>
-          <w:bCs/>
-          <w:szCs w:val="24"/>
-        </w:rPr>
-        <w:lastRenderedPageBreak/>
-        <w:t>number of generations given</w:t>
+        <w:t>he simulation must run without error for any number of generations given</w:t>
       </w:r>
       <w:r>
         <w:rPr>
@@ -2030,7 +2364,25 @@
           <w:bCs/>
           <w:szCs w:val="24"/>
         </w:rPr>
-        <w:t>The simulation must be able to run both a single prey type as well as a full simulation with all three prey types. The simulation must keep track of and output correct data on the number of generations simulated, overall population size of each generation, and individual predators in each generation (including their stats) where the correct data will be determined by simulation type. Finnly</w:t>
+        <w:t xml:space="preserve">The simulation must be able to run both a single prey type as well as a full simulation with all three prey types. The simulation must keep track of and output correct data on the number of generations simulated, overall population size of each generation, and individual predators in each generation (including their </w:t>
+      </w:r>
+      <w:proofErr w:type="gramStart"/>
+      <w:r>
+        <w:rPr>
+          <w:rFonts w:cs="Times New Roman"/>
+          <w:bCs/>
+          <w:szCs w:val="24"/>
+        </w:rPr>
+        <w:t>stats</w:t>
+      </w:r>
+      <w:proofErr w:type="gramEnd"/>
+      <w:r>
+        <w:rPr>
+          <w:rFonts w:cs="Times New Roman"/>
+          <w:bCs/>
+          <w:szCs w:val="24"/>
+        </w:rPr>
+        <w:t>) where the correct data will be determined by simulation type. Finnly</w:t>
       </w:r>
       <w:r>
         <w:rPr>
@@ -2166,7 +2518,7 @@
       </w:pPr>
     </w:p>
     <w:sectPr>
-      <w:headerReference w:type="default" r:id="rId19"/>
+      <w:headerReference w:type="default" r:id="rId16"/>
       <w:pgSz w:w="12240" w:h="15840"/>
       <w:pgMar w:top="1440" w:right="1440" w:bottom="1440" w:left="1440" w:header="720" w:footer="720" w:gutter="0"/>
       <w:cols w:space="720"/>
@@ -2174,64 +2526,6 @@
     </w:sectPr>
   </w:body>
 </w:document>
-</file>
-
-<file path=word/comments.xml><?xml version="1.0" encoding="utf-8"?>
-<w:comments xmlns:wpc="http://schemas.microsoft.com/office/word/2010/wordprocessingCanvas" xmlns:cx="http://schemas.microsoft.com/office/drawing/2014/chartex" xmlns:cx1="http://schemas.microsoft.com/office/drawing/2015/9/8/chartex" xmlns:cx2="http://schemas.microsoft.com/office/drawing/2015/10/21/chartex" xmlns:cx3="http://schemas.microsoft.com/office/drawing/2016/5/9/chartex" xmlns:cx4="http://schemas.microsoft.com/office/drawing/2016/5/10/chartex" xmlns:cx5="http://schemas.microsoft.com/office/drawing/2016/5/11/chartex" xmlns:cx6="http://schemas.microsoft.com/office/drawing/2016/5/12/chartex" xmlns:cx7="http://schemas.microsoft.com/office/drawing/2016/5/13/chartex" xmlns:cx8="http://schemas.microsoft.com/office/drawing/2016/5/14/chartex" xmlns:mc="http://schemas.openxmlformats.org/markup-compatibility/2006" xmlns:aink="http://schemas.microsoft.com/office/drawing/2016/ink" xmlns:am3d="http://schemas.microsoft.com/office/drawing/2017/model3d" xmlns:o="urn:schemas-microsoft-com:office:office" xmlns:oel="http://schemas.microsoft.com/office/2019/extlst" xmlns:r="http://schemas.openxmlformats.org/officeDocument/2006/relationships" xmlns:m="http://schemas.openxmlformats.org/officeDocument/2006/math" xmlns:v="urn:schemas-microsoft-com:vml" xmlns:wp14="http://schemas.microsoft.com/office/word/2010/wordprocessingDrawing" xmlns:wp="http://schemas.openxmlformats.org/drawingml/2006/wordprocessingDrawing" xmlns:w10="urn:schemas-microsoft-com:office:word" xmlns:w="http://schemas.openxmlformats.org/wordprocessingml/2006/main" xmlns:w14="http://schemas.microsoft.com/office/word/2010/wordml" xmlns:w15="http://schemas.microsoft.com/office/word/2012/wordml" xmlns:w16cex="http://schemas.microsoft.com/office/word/2018/wordml/cex" xmlns:w16cid="http://schemas.microsoft.com/office/word/2016/wordml/cid" xmlns:w16="http://schemas.microsoft.com/office/word/2018/wordml" xmlns:w16du="http://schemas.microsoft.com/office/word/2023/wordml/word16du" xmlns:w16sdtdh="http://schemas.microsoft.com/office/word/2020/wordml/sdtdatahash" xmlns:w16sdtfl="http://schemas.microsoft.com/office/word/2024/wordml/sdtformatlock" xmlns:w16se="http://schemas.microsoft.com/office/word/2015/wordml/symex" xmlns:wpg="http://schemas.microsoft.com/office/word/2010/wordprocessingGroup" xmlns:wpi="http://schemas.microsoft.com/office/word/2010/wordprocessingInk" xmlns:wne="http://schemas.microsoft.com/office/word/2006/wordml" xmlns:wps="http://schemas.microsoft.com/office/word/2010/wordprocessingShape" mc:Ignorable="w14 w15 w16se w16cid w16 w16cex w16sdtdh w16sdtfl w16du wp14">
-  <w:comment w:id="0" w:author="Mark Camuso" w:date="2026-05-15T22:28:00Z" w:initials="MC">
-    <w:p>
-      <w:pPr>
-        <w:pStyle w:val="CommentText"/>
-      </w:pPr>
-      <w:r>
-        <w:rPr>
-          <w:rStyle w:val="CommentReference"/>
-        </w:rPr>
-        <w:annotationRef/>
-      </w:r>
-      <w:r>
-        <w:t>Relook at this</w:t>
-      </w:r>
-    </w:p>
-  </w:comment>
-  <w:comment w:id="1" w:author="Mark Camuso" w:date="2026-05-15T23:14:00Z" w:initials="MC">
-    <w:p>
-      <w:pPr>
-        <w:pStyle w:val="CommentText"/>
-      </w:pPr>
-      <w:r>
-        <w:rPr>
-          <w:rStyle w:val="CommentReference"/>
-        </w:rPr>
-        <w:annotationRef/>
-      </w:r>
-      <w:r>
-        <w:t>Fill out section</w:t>
-      </w:r>
-    </w:p>
-  </w:comment>
-</w:comments>
-</file>
-
-<file path=word/commentsExtended.xml><?xml version="1.0" encoding="utf-8"?>
-<w15:commentsEx xmlns:wpc="http://schemas.microsoft.com/office/word/2010/wordprocessingCanvas" xmlns:cx="http://schemas.microsoft.com/office/drawing/2014/chartex" xmlns:cx1="http://schemas.microsoft.com/office/drawing/2015/9/8/chartex" xmlns:cx2="http://schemas.microsoft.com/office/drawing/2015/10/21/chartex" xmlns:cx3="http://schemas.microsoft.com/office/drawing/2016/5/9/chartex" xmlns:cx4="http://schemas.microsoft.com/office/drawing/2016/5/10/chartex" xmlns:cx5="http://schemas.microsoft.com/office/drawing/2016/5/11/chartex" xmlns:cx6="http://schemas.microsoft.com/office/drawing/2016/5/12/chartex" xmlns:cx7="http://schemas.microsoft.com/office/drawing/2016/5/13/chartex" xmlns:cx8="http://schemas.microsoft.com/office/drawing/2016/5/14/chartex" xmlns:mc="http://schemas.openxmlformats.org/markup-compatibility/2006" xmlns:aink="http://schemas.microsoft.com/office/drawing/2016/ink" xmlns:am3d="http://schemas.microsoft.com/office/drawing/2017/model3d" xmlns:o="urn:schemas-microsoft-com:office:office" xmlns:oel="http://schemas.microsoft.com/office/2019/extlst" xmlns:r="http://schemas.openxmlformats.org/officeDocument/2006/relationships" xmlns:m="http://schemas.openxmlformats.org/officeDocument/2006/math" xmlns:v="urn:schemas-microsoft-com:vml" xmlns:wp14="http://schemas.microsoft.com/office/word/2010/wordprocessingDrawing" xmlns:wp="http://schemas.openxmlformats.org/drawingml/2006/wordprocessingDrawing" xmlns:w10="urn:schemas-microsoft-com:office:word" xmlns:w="http://schemas.openxmlformats.org/wordprocessingml/2006/main" xmlns:w14="http://schemas.microsoft.com/office/word/2010/wordml" xmlns:w15="http://schemas.microsoft.com/office/word/2012/wordml" xmlns:w16cex="http://schemas.microsoft.com/office/word/2018/wordml/cex" xmlns:w16cid="http://schemas.microsoft.com/office/word/2016/wordml/cid" xmlns:w16="http://schemas.microsoft.com/office/word/2018/wordml" xmlns:w16du="http://schemas.microsoft.com/office/word/2023/wordml/word16du" xmlns:w16sdtdh="http://schemas.microsoft.com/office/word/2020/wordml/sdtdatahash" xmlns:w16sdtfl="http://schemas.microsoft.com/office/word/2024/wordml/sdtformatlock" xmlns:w16se="http://schemas.microsoft.com/office/word/2015/wordml/symex" xmlns:wpg="http://schemas.microsoft.com/office/word/2010/wordprocessingGroup" xmlns:wpi="http://schemas.microsoft.com/office/word/2010/wordprocessingInk" xmlns:wne="http://schemas.microsoft.com/office/word/2006/wordml" xmlns:wps="http://schemas.microsoft.com/office/word/2010/wordprocessingShape" mc:Ignorable="w14 w15 w16se w16cid w16 w16cex w16sdtdh w16sdtfl w16du wp14">
-  <w15:commentEx w15:paraId="6BB9FE17" w15:done="0"/>
-  <w15:commentEx w15:paraId="5109A822" w15:done="0"/>
-</w15:commentsEx>
-</file>
-
-<file path=word/commentsExtensible.xml><?xml version="1.0" encoding="utf-8"?>
-<w16cex:commentsExtensible xmlns:wpc="http://schemas.microsoft.com/office/word/2010/wordprocessingCanvas" xmlns:cx="http://schemas.microsoft.com/office/drawing/2014/chartex" xmlns:cx1="http://schemas.microsoft.com/office/drawing/2015/9/8/chartex" xmlns:cx2="http://schemas.microsoft.com/office/drawing/2015/10/21/chartex" xmlns:cx3="http://schemas.microsoft.com/office/drawing/2016/5/9/chartex" xmlns:cx4="http://schemas.microsoft.com/office/drawing/2016/5/10/chartex" xmlns:cx5="http://schemas.microsoft.com/office/drawing/2016/5/11/chartex" xmlns:cx6="http://schemas.microsoft.com/office/drawing/2016/5/12/chartex" xmlns:cx7="http://schemas.microsoft.com/office/drawing/2016/5/13/chartex" xmlns:cx8="http://schemas.microsoft.com/office/drawing/2016/5/14/chartex" xmlns:cr="http://schemas.microsoft.com/office/comments/2020/reactions" xmlns:mc="http://schemas.openxmlformats.org/markup-compatibility/2006" xmlns:aink="http://schemas.microsoft.com/office/drawing/2016/ink" xmlns:am3d="http://schemas.microsoft.com/office/drawing/2017/model3d" xmlns:o="urn:schemas-microsoft-com:office:office" xmlns:oel="http://schemas.microsoft.com/office/2019/extlst" xmlns:r="http://schemas.openxmlformats.org/officeDocument/2006/relationships" xmlns:m="http://schemas.openxmlformats.org/officeDocument/2006/math" xmlns:v="urn:schemas-microsoft-com:vml" xmlns:wp14="http://schemas.microsoft.com/office/word/2010/wordprocessingDrawing" xmlns:wp="http://schemas.openxmlformats.org/drawingml/2006/wordprocessingDrawing" xmlns:w10="urn:schemas-microsoft-com:office:word" xmlns:w="http://schemas.openxmlformats.org/wordprocessingml/2006/main" xmlns:w14="http://schemas.microsoft.com/office/word/2010/wordml" xmlns:w15="http://schemas.microsoft.com/office/word/2012/wordml" xmlns:w16cex="http://schemas.microsoft.com/office/word/2018/wordml/cex" xmlns:w16cid="http://schemas.microsoft.com/office/word/2016/wordml/cid" xmlns:w16="http://schemas.microsoft.com/office/word/2018/wordml" xmlns:w16du="http://schemas.microsoft.com/office/word/2023/wordml/word16du" xmlns:w16sdtdh="http://schemas.microsoft.com/office/word/2020/wordml/sdtdatahash" xmlns:w16sdtfl="http://schemas.microsoft.com/office/word/2024/wordml/sdtformatlock" xmlns:w16se="http://schemas.microsoft.com/office/word/2015/wordml/symex" xmlns:wpg="http://schemas.microsoft.com/office/word/2010/wordprocessingGroup" xmlns:wpi="http://schemas.microsoft.com/office/word/2010/wordprocessingInk" xmlns:wne="http://schemas.microsoft.com/office/word/2006/wordml" xmlns:wps="http://schemas.microsoft.com/office/word/2010/wordprocessingShape" mc:Ignorable="w14 w15 w16se w16cid w16 w16cex w16sdtdh w16sdtfl cr w16du wp14">
-  <w16cex:commentExtensible w16cex:durableId="046AFD47" w16cex:dateUtc="2026-05-16T02:28:00Z"/>
-  <w16cex:commentExtensible w16cex:durableId="2538D4D3" w16cex:dateUtc="2026-05-16T03:14:00Z"/>
-</w16cex:commentsExtensible>
-</file>
-
-<file path=word/commentsIds.xml><?xml version="1.0" encoding="utf-8"?>
-<w16cid:commentsIds xmlns:wpc="http://schemas.microsoft.com/office/word/2010/wordprocessingCanvas" xmlns:cx="http://schemas.microsoft.com/office/drawing/2014/chartex" xmlns:cx1="http://schemas.microsoft.com/office/drawing/2015/9/8/chartex" xmlns:cx2="http://schemas.microsoft.com/office/drawing/2015/10/21/chartex" xmlns:cx3="http://schemas.microsoft.com/office/drawing/2016/5/9/chartex" xmlns:cx4="http://schemas.microsoft.com/office/drawing/2016/5/10/chartex" xmlns:cx5="http://schemas.microsoft.com/office/drawing/2016/5/11/chartex" xmlns:cx6="http://schemas.microsoft.com/office/drawing/2016/5/12/chartex" xmlns:cx7="http://schemas.microsoft.com/office/drawing/2016/5/13/chartex" xmlns:cx8="http://schemas.microsoft.com/office/drawing/2016/5/14/chartex" xmlns:mc="http://schemas.openxmlformats.org/markup-compatibility/2006" xmlns:aink="http://schemas.microsoft.com/office/drawing/2016/ink" xmlns:am3d="http://schemas.microsoft.com/office/drawing/2017/model3d" xmlns:o="urn:schemas-microsoft-com:office:office" xmlns:oel="http://schemas.microsoft.com/office/2019/extlst" xmlns:r="http://schemas.openxmlformats.org/officeDocument/2006/relationships" xmlns:m="http://schemas.openxmlformats.org/officeDocument/2006/math" xmlns:v="urn:schemas-microsoft-com:vml" xmlns:wp14="http://schemas.microsoft.com/office/word/2010/wordprocessingDrawing" xmlns:wp="http://schemas.openxmlformats.org/drawingml/2006/wordprocessingDrawing" xmlns:w10="urn:schemas-microsoft-com:office:word" xmlns:w="http://schemas.openxmlformats.org/wordprocessingml/2006/main" xmlns:w14="http://schemas.microsoft.com/office/word/2010/wordml" xmlns:w15="http://schemas.microsoft.com/office/word/2012/wordml" xmlns:w16cex="http://schemas.microsoft.com/office/word/2018/wordml/cex" xmlns:w16cid="http://schemas.microsoft.com/office/word/2016/wordml/cid" xmlns:w16="http://schemas.microsoft.com/office/word/2018/wordml" xmlns:w16du="http://schemas.microsoft.com/office/word/2023/wordml/word16du" xmlns:w16sdtdh="http://schemas.microsoft.com/office/word/2020/wordml/sdtdatahash" xmlns:w16sdtfl="http://schemas.microsoft.com/office/word/2024/wordml/sdtformatlock" xmlns:w16se="http://schemas.microsoft.com/office/word/2015/wordml/symex" xmlns:wpg="http://schemas.microsoft.com/office/word/2010/wordprocessingGroup" xmlns:wpi="http://schemas.microsoft.com/office/word/2010/wordprocessingInk" xmlns:wne="http://schemas.microsoft.com/office/word/2006/wordml" xmlns:wps="http://schemas.microsoft.com/office/word/2010/wordprocessingShape" mc:Ignorable="w14 w15 w16se w16cid w16 w16cex w16sdtdh w16sdtfl w16du wp14">
-  <w16cid:commentId w16cid:paraId="6BB9FE17" w16cid:durableId="046AFD47"/>
-  <w16cid:commentId w16cid:paraId="5109A822" w16cid:durableId="2538D4D3"/>
-</w16cid:commentsIds>
 </file>
 
 <file path=word/endnotes.xml><?xml version="1.0" encoding="utf-8"?>
@@ -2662,14 +2956,6 @@
     <w:abstractNumId w:val="2"/>
   </w:num>
 </w:numbering>
-</file>
-
-<file path=word/people.xml><?xml version="1.0" encoding="utf-8"?>
-<w15:people xmlns:wpc="http://schemas.microsoft.com/office/word/2010/wordprocessingCanvas" xmlns:cx="http://schemas.microsoft.com/office/drawing/2014/chartex" xmlns:cx1="http://schemas.microsoft.com/office/drawing/2015/9/8/chartex" xmlns:cx2="http://schemas.microsoft.com/office/drawing/2015/10/21/chartex" xmlns:cx3="http://schemas.microsoft.com/office/drawing/2016/5/9/chartex" xmlns:cx4="http://schemas.microsoft.com/office/drawing/2016/5/10/chartex" xmlns:cx5="http://schemas.microsoft.com/office/drawing/2016/5/11/chartex" xmlns:cx6="http://schemas.microsoft.com/office/drawing/2016/5/12/chartex" xmlns:cx7="http://schemas.microsoft.com/office/drawing/2016/5/13/chartex" xmlns:cx8="http://schemas.microsoft.com/office/drawing/2016/5/14/chartex" xmlns:mc="http://schemas.openxmlformats.org/markup-compatibility/2006" xmlns:aink="http://schemas.microsoft.com/office/drawing/2016/ink" xmlns:am3d="http://schemas.microsoft.com/office/drawing/2017/model3d" xmlns:o="urn:schemas-microsoft-com:office:office" xmlns:oel="http://schemas.microsoft.com/office/2019/extlst" xmlns:r="http://schemas.openxmlformats.org/officeDocument/2006/relationships" xmlns:m="http://schemas.openxmlformats.org/officeDocument/2006/math" xmlns:v="urn:schemas-microsoft-com:vml" xmlns:wp14="http://schemas.microsoft.com/office/word/2010/wordprocessingDrawing" xmlns:wp="http://schemas.openxmlformats.org/drawingml/2006/wordprocessingDrawing" xmlns:w10="urn:schemas-microsoft-com:office:word" xmlns:w="http://schemas.openxmlformats.org/wordprocessingml/2006/main" xmlns:w14="http://schemas.microsoft.com/office/word/2010/wordml" xmlns:w15="http://schemas.microsoft.com/office/word/2012/wordml" xmlns:w16cex="http://schemas.microsoft.com/office/word/2018/wordml/cex" xmlns:w16cid="http://schemas.microsoft.com/office/word/2016/wordml/cid" xmlns:w16="http://schemas.microsoft.com/office/word/2018/wordml" xmlns:w16du="http://schemas.microsoft.com/office/word/2023/wordml/word16du" xmlns:w16sdtdh="http://schemas.microsoft.com/office/word/2020/wordml/sdtdatahash" xmlns:w16sdtfl="http://schemas.microsoft.com/office/word/2024/wordml/sdtformatlock" xmlns:w16se="http://schemas.microsoft.com/office/word/2015/wordml/symex" xmlns:wpg="http://schemas.microsoft.com/office/word/2010/wordprocessingGroup" xmlns:wpi="http://schemas.microsoft.com/office/word/2010/wordprocessingInk" xmlns:wne="http://schemas.microsoft.com/office/word/2006/wordml" xmlns:wps="http://schemas.microsoft.com/office/word/2010/wordprocessingShape" mc:Ignorable="w14 w15 w16se w16cid w16 w16cex w16sdtdh w16sdtfl w16du wp14">
-  <w15:person w15:author="Mark Camuso">
-    <w15:presenceInfo w15:providerId="Windows Live" w15:userId="0c7fadd5931f9bda"/>
-  </w15:person>
-</w15:people>
 </file>
 
 <file path=word/styles.xml><?xml version="1.0" encoding="utf-8"?>

</xml_diff>

<commit_message>
Map class basic outline with getters.
</commit_message>
<xml_diff>
--- a/documents/project-proposal-bryce-699.docx
+++ b/documents/project-proposal-bryce-699.docx
@@ -100,16 +100,133 @@
           <w:bCs/>
           <w:szCs w:val="24"/>
         </w:rPr>
-        <w:t xml:space="preserve">Simulation of Predatory Evolution </w:t>
-      </w:r>
-      <w:r>
-        <w:rPr>
-          <w:rFonts w:cs="Times New Roman"/>
-          <w:b/>
-          <w:bCs/>
-          <w:szCs w:val="24"/>
-        </w:rPr>
-        <w:t>for Ambush and Pursuit Predators</w:t>
+        <w:t xml:space="preserve">Simulation of </w:t>
+      </w:r>
+      <w:r>
+        <w:rPr>
+          <w:rFonts w:cs="Times New Roman"/>
+          <w:b/>
+          <w:bCs/>
+          <w:szCs w:val="24"/>
+        </w:rPr>
+        <w:t>P</w:t>
+      </w:r>
+      <w:r>
+        <w:rPr>
+          <w:rFonts w:cs="Times New Roman"/>
+          <w:b/>
+          <w:bCs/>
+          <w:szCs w:val="24"/>
+        </w:rPr>
+        <w:t xml:space="preserve">redatory </w:t>
+      </w:r>
+      <w:r>
+        <w:rPr>
+          <w:rFonts w:cs="Times New Roman"/>
+          <w:b/>
+          <w:bCs/>
+          <w:szCs w:val="24"/>
+        </w:rPr>
+        <w:t>E</w:t>
+      </w:r>
+      <w:r>
+        <w:rPr>
+          <w:rFonts w:cs="Times New Roman"/>
+          <w:b/>
+          <w:bCs/>
+          <w:szCs w:val="24"/>
+        </w:rPr>
+        <w:t xml:space="preserve">volution </w:t>
+      </w:r>
+      <w:r>
+        <w:rPr>
+          <w:rFonts w:cs="Times New Roman"/>
+          <w:b/>
+          <w:bCs/>
+          <w:szCs w:val="24"/>
+        </w:rPr>
+        <w:t>U</w:t>
+      </w:r>
+      <w:r>
+        <w:rPr>
+          <w:rFonts w:cs="Times New Roman"/>
+          <w:b/>
+          <w:bCs/>
+          <w:szCs w:val="24"/>
+        </w:rPr>
+        <w:t xml:space="preserve">sing Evolutionary Game Theory and </w:t>
+      </w:r>
+      <w:r>
+        <w:rPr>
+          <w:rFonts w:cs="Times New Roman"/>
+          <w:b/>
+          <w:bCs/>
+          <w:szCs w:val="24"/>
+        </w:rPr>
+        <w:t>S</w:t>
+      </w:r>
+      <w:r>
+        <w:rPr>
+          <w:rFonts w:cs="Times New Roman"/>
+          <w:b/>
+          <w:bCs/>
+          <w:szCs w:val="24"/>
+        </w:rPr>
+        <w:t xml:space="preserve">tatistically </w:t>
+      </w:r>
+      <w:r>
+        <w:rPr>
+          <w:rFonts w:cs="Times New Roman"/>
+          <w:b/>
+          <w:bCs/>
+          <w:szCs w:val="24"/>
+        </w:rPr>
+        <w:t>W</w:t>
+      </w:r>
+      <w:r>
+        <w:rPr>
+          <w:rFonts w:cs="Times New Roman"/>
+          <w:b/>
+          <w:bCs/>
+          <w:szCs w:val="24"/>
+        </w:rPr>
+        <w:t xml:space="preserve">eighted </w:t>
+      </w:r>
+      <w:r>
+        <w:rPr>
+          <w:rFonts w:cs="Times New Roman"/>
+          <w:b/>
+          <w:bCs/>
+          <w:szCs w:val="24"/>
+        </w:rPr>
+        <w:t>P</w:t>
+      </w:r>
+      <w:r>
+        <w:rPr>
+          <w:rFonts w:cs="Times New Roman"/>
+          <w:b/>
+          <w:bCs/>
+          <w:szCs w:val="24"/>
+        </w:rPr>
+        <w:t xml:space="preserve">ath </w:t>
+      </w:r>
+      <w:r>
+        <w:rPr>
+          <w:rFonts w:cs="Times New Roman"/>
+          <w:b/>
+          <w:bCs/>
+          <w:szCs w:val="24"/>
+        </w:rPr>
+        <w:t>F</w:t>
+      </w:r>
+      <w:r>
+        <w:rPr>
+          <w:rFonts w:cs="Times New Roman"/>
+          <w:b/>
+          <w:bCs/>
+          <w:szCs w:val="24"/>
+        </w:rPr>
+        <w:t>inding.</w:t>
       </w:r>
     </w:p>
     <w:p>
@@ -213,8 +330,6 @@
         <w:jc w:val="center"/>
         <w:rPr>
           <w:rFonts w:cs="Times New Roman"/>
-          <w:b/>
-          <w:bCs/>
           <w:szCs w:val="24"/>
         </w:rPr>
       </w:pPr>
@@ -225,6 +340,18 @@
         </w:rPr>
         <w:br w:type="page"/>
       </w:r>
+    </w:p>
+    <w:p>
+      <w:pPr>
+        <w:spacing w:line="480" w:lineRule="auto"/>
+        <w:jc w:val="center"/>
+        <w:rPr>
+          <w:rFonts w:cs="Times New Roman"/>
+          <w:b/>
+          <w:bCs/>
+          <w:szCs w:val="24"/>
+        </w:rPr>
+      </w:pPr>
       <w:r>
         <w:rPr>
           <w:rFonts w:cs="Times New Roman"/>
@@ -233,6 +360,176 @@
           <w:szCs w:val="24"/>
         </w:rPr>
         <w:lastRenderedPageBreak/>
+        <w:t>Problem Statement</w:t>
+      </w:r>
+    </w:p>
+    <w:p>
+      <w:pPr>
+        <w:spacing w:line="480" w:lineRule="auto"/>
+        <w:ind w:firstLine="720"/>
+        <w:rPr>
+          <w:rFonts w:cs="Times New Roman"/>
+          <w:szCs w:val="24"/>
+        </w:rPr>
+      </w:pPr>
+      <w:r>
+        <w:rPr>
+          <w:rFonts w:cs="Times New Roman"/>
+          <w:szCs w:val="24"/>
+        </w:rPr>
+        <w:t>T</w:t>
+      </w:r>
+      <w:r>
+        <w:rPr>
+          <w:rFonts w:cs="Times New Roman"/>
+          <w:szCs w:val="24"/>
+        </w:rPr>
+        <w:t xml:space="preserve">he goal of this </w:t>
+      </w:r>
+      <w:r>
+        <w:rPr>
+          <w:rFonts w:cs="Times New Roman"/>
+          <w:szCs w:val="24"/>
+        </w:rPr>
+        <w:t>project</w:t>
+      </w:r>
+      <w:r>
+        <w:rPr>
+          <w:rFonts w:cs="Times New Roman"/>
+          <w:szCs w:val="24"/>
+        </w:rPr>
+        <w:t xml:space="preserve"> is to use a simulation to better understand the evolution of the predator strategies known as ambush and pursuit by modeling land-based predator’s (terrestrial predators) stamina and stealth optimizations against three different prey animals.</w:t>
+      </w:r>
+      <w:r>
+        <w:rPr>
+          <w:rFonts w:cs="Times New Roman"/>
+          <w:szCs w:val="24"/>
+        </w:rPr>
+        <w:t xml:space="preserve"> This is important to because such</w:t>
+      </w:r>
+      <w:r>
+        <w:rPr>
+          <w:rFonts w:cs="Times New Roman"/>
+          <w:szCs w:val="24"/>
+        </w:rPr>
+        <w:t xml:space="preserve"> evolution can be helpful to understand how predators contribute to a stable ecosystem</w:t>
+      </w:r>
+      <w:r>
+        <w:rPr>
+          <w:rFonts w:cs="Times New Roman"/>
+          <w:szCs w:val="24"/>
+        </w:rPr>
+        <w:t xml:space="preserve"> </w:t>
+      </w:r>
+      <w:r>
+        <w:rPr>
+          <w:rFonts w:cs="Times New Roman"/>
+          <w:szCs w:val="24"/>
+        </w:rPr>
+        <w:fldChar w:fldCharType="begin"/>
+      </w:r>
+      <w:r>
+        <w:rPr>
+          <w:rFonts w:cs="Times New Roman"/>
+          <w:szCs w:val="24"/>
+        </w:rPr>
+        <w:instrText xml:space="preserve"> ADDIN ZOTERO_ITEM CSL_CITATION {"citationID":"AGJoAg2O","properties":{"unsorted":false,"formattedCitation":"(Allesina &amp; Tang, 2012)","plainCitation":"(Allesina &amp; Tang, 2012)","noteIndex":0},"citationItems":[{"id":23,"uris":["http://zotero.org/users/20572099/items/B7KBP6GP"],"itemData":{"id":23,"type":"article-journal","container-title":"Nature","DOI":"10.1038/nature10832","ISSN":"0028-0836, 1476-4687","issue":"7388","journalAbbreviation":"Nature","language":"en","license":"http://www.springer.com/tdm","page":"205-208","source":"DOI.org (Crossref)","title":"Stability criteria for complex ecosystems","volume":"483","author":[{"family":"Allesina","given":"Stefano"},{"family":"Tang","given":"Si"}],"issued":{"date-parts":[["2012",3]]}}}],"schema":"https://github.com/citation-style-language/schema/raw/master/csl-citation.json"} </w:instrText>
+      </w:r>
+      <w:r>
+        <w:rPr>
+          <w:rFonts w:cs="Times New Roman"/>
+          <w:szCs w:val="24"/>
+        </w:rPr>
+        <w:fldChar w:fldCharType="separate"/>
+      </w:r>
+      <w:r>
+        <w:rPr>
+          <w:rFonts w:cs="Times New Roman"/>
+        </w:rPr>
+        <w:t>(</w:t>
+      </w:r>
+      <w:proofErr w:type="spellStart"/>
+      <w:r>
+        <w:rPr>
+          <w:rFonts w:cs="Times New Roman"/>
+        </w:rPr>
+        <w:t>Allesina</w:t>
+      </w:r>
+      <w:proofErr w:type="spellEnd"/>
+      <w:r>
+        <w:rPr>
+          <w:rFonts w:cs="Times New Roman"/>
+        </w:rPr>
+        <w:t xml:space="preserve"> &amp; Tang, 2012)</w:t>
+      </w:r>
+      <w:r>
+        <w:rPr>
+          <w:rFonts w:cs="Times New Roman"/>
+          <w:szCs w:val="24"/>
+        </w:rPr>
+        <w:fldChar w:fldCharType="end"/>
+      </w:r>
+      <w:r>
+        <w:rPr>
+          <w:rFonts w:cs="Times New Roman"/>
+          <w:szCs w:val="24"/>
+        </w:rPr>
+        <w:t>.</w:t>
+      </w:r>
+      <w:r>
+        <w:rPr>
+          <w:rFonts w:cs="Times New Roman"/>
+          <w:szCs w:val="24"/>
+        </w:rPr>
+        <w:t xml:space="preserve"> </w:t>
+      </w:r>
+      <w:r>
+        <w:rPr>
+          <w:rFonts w:cs="Times New Roman"/>
+          <w:szCs w:val="24"/>
+        </w:rPr>
+        <w:t>Without understanding the role predators play, we can inadvertently put both predator and prey populations at risk</w:t>
+      </w:r>
+      <w:r>
+        <w:rPr>
+          <w:rFonts w:cs="Times New Roman"/>
+          <w:szCs w:val="24"/>
+        </w:rPr>
+        <w:t xml:space="preserve"> if we drive a species to extinction</w:t>
+      </w:r>
+      <w:r>
+        <w:rPr>
+          <w:rFonts w:cs="Times New Roman"/>
+          <w:szCs w:val="24"/>
+        </w:rPr>
+        <w:t>.</w:t>
+      </w:r>
+      <w:r>
+        <w:rPr>
+          <w:rFonts w:cs="Times New Roman"/>
+          <w:szCs w:val="24"/>
+        </w:rPr>
+        <w:t xml:space="preserve"> Thus, for this project the end user will be researchers (myself) using simulation to conduct analysis on predatory evolution. The final output will be a simulation that mimics the evolution of Ambush and pursuit predators. </w:t>
+      </w:r>
+    </w:p>
+    <w:p>
+      <w:pPr>
+        <w:spacing w:line="480" w:lineRule="auto"/>
+        <w:jc w:val="center"/>
+        <w:rPr>
+          <w:rFonts w:cs="Times New Roman"/>
+          <w:b/>
+          <w:bCs/>
+          <w:szCs w:val="24"/>
+        </w:rPr>
+      </w:pPr>
+      <w:r>
+        <w:rPr>
+          <w:rFonts w:cs="Times New Roman"/>
+          <w:b/>
+          <w:bCs/>
+          <w:szCs w:val="24"/>
+        </w:rPr>
         <w:t>Milestones</w:t>
       </w:r>
       <w:r>
@@ -706,6 +1003,7 @@
                 <w:rFonts w:cs="Times New Roman"/>
                 <w:szCs w:val="24"/>
               </w:rPr>
+              <w:lastRenderedPageBreak/>
               <w:t>Milestone 9: data analysis</w:t>
             </w:r>
           </w:p>
@@ -804,6 +1102,26 @@
           <w:bCs/>
           <w:szCs w:val="24"/>
         </w:rPr>
+        <w:t>Project Charter</w:t>
+      </w:r>
+    </w:p>
+    <w:p>
+      <w:pPr>
+        <w:spacing w:line="480" w:lineRule="auto"/>
+        <w:rPr>
+          <w:rFonts w:cs="Times New Roman"/>
+          <w:b/>
+          <w:bCs/>
+          <w:szCs w:val="24"/>
+        </w:rPr>
+      </w:pPr>
+      <w:r>
+        <w:rPr>
+          <w:rFonts w:cs="Times New Roman"/>
+          <w:b/>
+          <w:bCs/>
+          <w:szCs w:val="24"/>
+        </w:rPr>
         <w:t>P</w:t>
       </w:r>
       <w:r>
@@ -813,7 +1131,192 @@
           <w:bCs/>
           <w:szCs w:val="24"/>
         </w:rPr>
-        <w:t xml:space="preserve">roblem </w:t>
+        <w:t xml:space="preserve">roject </w:t>
+      </w:r>
+      <w:r>
+        <w:rPr>
+          <w:rFonts w:cs="Times New Roman"/>
+          <w:b/>
+          <w:bCs/>
+          <w:szCs w:val="24"/>
+        </w:rPr>
+        <w:t>O</w:t>
+      </w:r>
+      <w:r>
+        <w:rPr>
+          <w:rFonts w:cs="Times New Roman"/>
+          <w:b/>
+          <w:bCs/>
+          <w:szCs w:val="24"/>
+        </w:rPr>
+        <w:t>bjectives</w:t>
+      </w:r>
+    </w:p>
+    <w:p>
+      <w:pPr>
+        <w:spacing w:line="480" w:lineRule="auto"/>
+        <w:rPr>
+          <w:rFonts w:cs="Times New Roman"/>
+          <w:szCs w:val="24"/>
+        </w:rPr>
+      </w:pPr>
+      <w:r>
+        <w:rPr>
+          <w:rFonts w:cs="Times New Roman"/>
+          <w:szCs w:val="24"/>
+        </w:rPr>
+        <w:tab/>
+        <w:t xml:space="preserve">This project aims to create a simulation that modals the evolution of ambush and pursuit predators. </w:t>
+      </w:r>
+      <w:r>
+        <w:rPr>
+          <w:rFonts w:cs="Times New Roman"/>
+          <w:szCs w:val="24"/>
+        </w:rPr>
+        <w:t xml:space="preserve">To do this a discrete event simulation has been chosen. </w:t>
+      </w:r>
+      <w:r>
+        <w:rPr>
+          <w:rFonts w:cs="Times New Roman"/>
+          <w:szCs w:val="24"/>
+        </w:rPr>
+        <w:t>Thus,</w:t>
+      </w:r>
+      <w:r>
+        <w:rPr>
+          <w:rFonts w:cs="Times New Roman"/>
+          <w:szCs w:val="24"/>
+        </w:rPr>
+        <w:t xml:space="preserve"> discrete event driven simulation principles will be implanted including time steps and </w:t>
+      </w:r>
+      <w:r>
+        <w:rPr>
+          <w:rFonts w:cs="Times New Roman"/>
+          <w:szCs w:val="24"/>
+        </w:rPr>
+        <w:t>environmental-based</w:t>
+      </w:r>
+      <w:r>
+        <w:rPr>
+          <w:rFonts w:cs="Times New Roman"/>
+          <w:szCs w:val="24"/>
+        </w:rPr>
+        <w:t xml:space="preserve"> decision making</w:t>
+      </w:r>
+      <w:r>
+        <w:rPr>
+          <w:rFonts w:cs="Times New Roman"/>
+          <w:szCs w:val="24"/>
+        </w:rPr>
+        <w:t xml:space="preserve"> for predators and prey</w:t>
+      </w:r>
+      <w:r>
+        <w:rPr>
+          <w:rFonts w:cs="Times New Roman"/>
+          <w:szCs w:val="24"/>
+        </w:rPr>
+        <w:t xml:space="preserve">. </w:t>
+      </w:r>
+      <w:r>
+        <w:rPr>
+          <w:rFonts w:cs="Times New Roman"/>
+          <w:szCs w:val="24"/>
+        </w:rPr>
+        <w:t xml:space="preserve">This project </w:t>
+      </w:r>
+      <w:r>
+        <w:rPr>
+          <w:rFonts w:cs="Times New Roman"/>
+          <w:szCs w:val="24"/>
+        </w:rPr>
+        <w:t xml:space="preserve">seeks to </w:t>
+      </w:r>
+      <w:r>
+        <w:rPr>
+          <w:rFonts w:cs="Times New Roman"/>
+          <w:szCs w:val="24"/>
+        </w:rPr>
+        <w:t>us</w:t>
+      </w:r>
+      <w:r>
+        <w:rPr>
+          <w:rFonts w:cs="Times New Roman"/>
+          <w:szCs w:val="24"/>
+        </w:rPr>
+        <w:t>e</w:t>
+      </w:r>
+      <w:r>
+        <w:rPr>
+          <w:rFonts w:cs="Times New Roman"/>
+          <w:szCs w:val="24"/>
+        </w:rPr>
+        <w:t xml:space="preserve"> statistical weighing techniques to produce </w:t>
+      </w:r>
+      <w:r>
+        <w:rPr>
+          <w:rFonts w:cs="Times New Roman"/>
+          <w:szCs w:val="24"/>
+        </w:rPr>
+        <w:t>a path</w:t>
+      </w:r>
+      <w:r>
+        <w:rPr>
+          <w:rFonts w:cs="Times New Roman"/>
+          <w:szCs w:val="24"/>
+        </w:rPr>
+        <w:t xml:space="preserve"> finding algorithm. The project finally aims to use the simulation to build out </w:t>
+      </w:r>
+      <w:r>
+        <w:rPr>
+          <w:rFonts w:cs="Times New Roman"/>
+          <w:szCs w:val="24"/>
+        </w:rPr>
+        <w:t>payoff function</w:t>
+      </w:r>
+      <w:r>
+        <w:rPr>
+          <w:rFonts w:cs="Times New Roman"/>
+          <w:szCs w:val="24"/>
+        </w:rPr>
+        <w:t xml:space="preserve"> for each strategy for each hunting strategy per prey item.</w:t>
+      </w:r>
+    </w:p>
+    <w:p>
+      <w:pPr>
+        <w:spacing w:line="480" w:lineRule="auto"/>
+        <w:rPr>
+          <w:rFonts w:cs="Times New Roman"/>
+          <w:szCs w:val="24"/>
+        </w:rPr>
+      </w:pPr>
+    </w:p>
+    <w:p>
+      <w:pPr>
+        <w:spacing w:line="480" w:lineRule="auto"/>
+        <w:rPr>
+          <w:rFonts w:cs="Times New Roman"/>
+          <w:b/>
+          <w:bCs/>
+          <w:szCs w:val="24"/>
+        </w:rPr>
+      </w:pPr>
+      <w:r>
+        <w:rPr>
+          <w:rFonts w:cs="Times New Roman"/>
+          <w:b/>
+          <w:bCs/>
+          <w:szCs w:val="24"/>
+        </w:rPr>
+        <w:t>O</w:t>
+      </w:r>
+      <w:r>
+        <w:rPr>
+          <w:rFonts w:cs="Times New Roman"/>
+          <w:b/>
+          <w:bCs/>
+          <w:szCs w:val="24"/>
+        </w:rPr>
+        <w:t>ut-of-</w:t>
       </w:r>
       <w:r>
         <w:rPr>
@@ -831,45 +1334,295 @@
           <w:bCs/>
           <w:szCs w:val="24"/>
         </w:rPr>
-        <w:t>tatement</w:t>
-      </w:r>
-    </w:p>
-    <w:p>
-      <w:pPr>
-        <w:spacing w:line="480" w:lineRule="auto"/>
-        <w:ind w:firstLine="720"/>
-        <w:rPr>
-          <w:rFonts w:cs="Times New Roman"/>
-          <w:szCs w:val="24"/>
-        </w:rPr>
-      </w:pPr>
-      <w:r>
-        <w:rPr>
-          <w:rFonts w:cs="Times New Roman"/>
-          <w:szCs w:val="24"/>
-        </w:rPr>
-        <w:t>T</w:t>
-      </w:r>
-      <w:r>
-        <w:rPr>
-          <w:rFonts w:cs="Times New Roman"/>
-          <w:szCs w:val="24"/>
-        </w:rPr>
-        <w:t xml:space="preserve">he goal of this </w:t>
-      </w:r>
-      <w:r>
-        <w:rPr>
-          <w:rFonts w:cs="Times New Roman"/>
-          <w:szCs w:val="24"/>
-        </w:rPr>
-        <w:t>project</w:t>
-      </w:r>
-      <w:r>
-        <w:rPr>
-          <w:rFonts w:cs="Times New Roman"/>
-          <w:szCs w:val="24"/>
-        </w:rPr>
-        <w:t xml:space="preserve"> is to use a simulation to better understand the evolution of the predator strategies known as ambush and pursuit by modeling land-based predator’s (terrestrial predators) stamina and stealth optimizations against three different prey animals.</w:t>
+        <w:t xml:space="preserve">cope </w:t>
+      </w:r>
+      <w:r>
+        <w:rPr>
+          <w:rFonts w:cs="Times New Roman"/>
+          <w:b/>
+          <w:bCs/>
+          <w:szCs w:val="24"/>
+        </w:rPr>
+        <w:t>I</w:t>
+      </w:r>
+      <w:r>
+        <w:rPr>
+          <w:rFonts w:cs="Times New Roman"/>
+          <w:b/>
+          <w:bCs/>
+          <w:szCs w:val="24"/>
+        </w:rPr>
+        <w:t>tems</w:t>
+      </w:r>
+    </w:p>
+    <w:p>
+      <w:pPr>
+        <w:spacing w:line="480" w:lineRule="auto"/>
+        <w:rPr>
+          <w:rFonts w:cs="Times New Roman"/>
+          <w:szCs w:val="24"/>
+        </w:rPr>
+      </w:pPr>
+      <w:r>
+        <w:rPr>
+          <w:rFonts w:cs="Times New Roman"/>
+          <w:szCs w:val="24"/>
+        </w:rPr>
+        <w:tab/>
+        <w:t>This project does not seek to make a highly realistic model of predators and prey interactions. This project does will not be implementing any physics</w:t>
+      </w:r>
+      <w:r>
+        <w:rPr>
+          <w:rFonts w:cs="Times New Roman"/>
+          <w:szCs w:val="24"/>
+        </w:rPr>
+        <w:t xml:space="preserve"> or realistic movement accuracy. </w:t>
+      </w:r>
+      <w:r>
+        <w:rPr>
+          <w:rFonts w:cs="Times New Roman"/>
+          <w:szCs w:val="24"/>
+        </w:rPr>
+        <w:t>This project does not se</w:t>
+      </w:r>
+      <w:r>
+        <w:rPr>
+          <w:rFonts w:cs="Times New Roman"/>
+          <w:szCs w:val="24"/>
+        </w:rPr>
+        <w:t xml:space="preserve">ek to represent group hunting strategies or prey selection criteria. </w:t>
+      </w:r>
+      <w:r>
+        <w:rPr>
+          <w:rFonts w:cs="Times New Roman"/>
+          <w:szCs w:val="24"/>
+        </w:rPr>
+        <w:t>This project will not be implementing competition between predators for food.</w:t>
+      </w:r>
+      <w:r>
+        <w:rPr>
+          <w:rFonts w:cs="Times New Roman"/>
+          <w:szCs w:val="24"/>
+        </w:rPr>
+        <w:t xml:space="preserve"> This project will not be implementing sexual reproduction of predators and gene mixing of predator strategies.</w:t>
+      </w:r>
+    </w:p>
+    <w:p>
+      <w:pPr>
+        <w:spacing w:line="480" w:lineRule="auto"/>
+        <w:rPr>
+          <w:rFonts w:cs="Times New Roman"/>
+          <w:b/>
+          <w:bCs/>
+          <w:szCs w:val="24"/>
+        </w:rPr>
+      </w:pPr>
+      <w:r>
+        <w:rPr>
+          <w:rFonts w:cs="Times New Roman"/>
+          <w:b/>
+          <w:bCs/>
+          <w:szCs w:val="24"/>
+        </w:rPr>
+        <w:t>A</w:t>
+      </w:r>
+      <w:r>
+        <w:rPr>
+          <w:rFonts w:cs="Times New Roman"/>
+          <w:b/>
+          <w:bCs/>
+          <w:szCs w:val="24"/>
+        </w:rPr>
+        <w:t>ssumptions</w:t>
+      </w:r>
+    </w:p>
+    <w:p>
+      <w:pPr>
+        <w:spacing w:line="480" w:lineRule="auto"/>
+        <w:rPr>
+          <w:rFonts w:cs="Times New Roman"/>
+          <w:szCs w:val="24"/>
+        </w:rPr>
+      </w:pPr>
+      <w:r>
+        <w:rPr>
+          <w:rFonts w:cs="Times New Roman"/>
+          <w:szCs w:val="24"/>
+        </w:rPr>
+        <w:tab/>
+        <w:t xml:space="preserve">This project has taken assumptions with how predators and prey are simulated. Both are being represented as classes and using stats to determine/represent basic facts about the creature. </w:t>
+      </w:r>
+      <w:r>
+        <w:rPr>
+          <w:rFonts w:cs="Times New Roman"/>
+          <w:szCs w:val="24"/>
+        </w:rPr>
+        <w:t xml:space="preserve">This was done to simplify the creation of predators and pray for quicker modeling. Assumptions </w:t>
+      </w:r>
+      <w:r>
+        <w:rPr>
+          <w:rFonts w:cs="Times New Roman"/>
+          <w:szCs w:val="24"/>
+        </w:rPr>
+        <w:lastRenderedPageBreak/>
+        <w:t>were also made about the basics of predation</w:t>
+      </w:r>
+      <w:r>
+        <w:rPr>
+          <w:rFonts w:cs="Times New Roman"/>
+          <w:szCs w:val="24"/>
+        </w:rPr>
+        <w:t xml:space="preserve"> and reproduction</w:t>
+      </w:r>
+      <w:r>
+        <w:rPr>
+          <w:rFonts w:cs="Times New Roman"/>
+          <w:szCs w:val="24"/>
+        </w:rPr>
+        <w:t xml:space="preserve">. </w:t>
+      </w:r>
+      <w:r>
+        <w:rPr>
+          <w:rFonts w:cs="Times New Roman"/>
+          <w:szCs w:val="24"/>
+        </w:rPr>
+        <w:t xml:space="preserve">A predator will only be allowed to hunt a single prey item. A </w:t>
+      </w:r>
+      <w:r>
+        <w:rPr>
+          <w:rFonts w:cs="Times New Roman"/>
+          <w:szCs w:val="24"/>
+        </w:rPr>
+        <w:t>predator,</w:t>
+      </w:r>
+      <w:r>
+        <w:rPr>
+          <w:rFonts w:cs="Times New Roman"/>
+          <w:szCs w:val="24"/>
+        </w:rPr>
+        <w:t xml:space="preserve"> if it catches prey will get to eat the full prey item and that one prey item will satisfy the </w:t>
+      </w:r>
+      <w:r>
+        <w:rPr>
+          <w:rFonts w:cs="Times New Roman"/>
+          <w:szCs w:val="24"/>
+        </w:rPr>
+        <w:t>predator’s</w:t>
+      </w:r>
+      <w:r>
+        <w:rPr>
+          <w:rFonts w:cs="Times New Roman"/>
+          <w:szCs w:val="24"/>
+        </w:rPr>
+        <w:t xml:space="preserve"> calorie requirements. </w:t>
+      </w:r>
+      <w:r>
+        <w:rPr>
+          <w:rFonts w:cs="Times New Roman"/>
+          <w:szCs w:val="24"/>
+        </w:rPr>
+        <w:t xml:space="preserve">A predator </w:t>
+      </w:r>
+      <w:r>
+        <w:rPr>
+          <w:rFonts w:cs="Times New Roman"/>
+          <w:szCs w:val="24"/>
+        </w:rPr>
+        <w:t>will</w:t>
+      </w:r>
+      <w:r>
+        <w:rPr>
+          <w:rFonts w:cs="Times New Roman"/>
+          <w:szCs w:val="24"/>
+        </w:rPr>
+        <w:t xml:space="preserve"> reproduce </w:t>
+      </w:r>
+      <w:r>
+        <w:rPr>
+          <w:rFonts w:cs="Times New Roman"/>
+          <w:szCs w:val="24"/>
+        </w:rPr>
+        <w:t>Asexually,</w:t>
+      </w:r>
+      <w:r>
+        <w:rPr>
+          <w:rFonts w:cs="Times New Roman"/>
+          <w:szCs w:val="24"/>
+        </w:rPr>
+        <w:t xml:space="preserve"> and offspring will inherit the parents hunting strategy and genes with a chance to mutate genes. </w:t>
+      </w:r>
+    </w:p>
+    <w:p>
+      <w:pPr>
+        <w:spacing w:line="480" w:lineRule="auto"/>
+        <w:rPr>
+          <w:rFonts w:cs="Times New Roman"/>
+          <w:b/>
+          <w:bCs/>
+          <w:szCs w:val="24"/>
+        </w:rPr>
+      </w:pPr>
+      <w:r>
+        <w:rPr>
+          <w:rFonts w:cs="Times New Roman"/>
+          <w:b/>
+          <w:bCs/>
+          <w:szCs w:val="24"/>
+        </w:rPr>
+        <w:t>R</w:t>
+      </w:r>
+      <w:r>
+        <w:rPr>
+          <w:rFonts w:cs="Times New Roman"/>
+          <w:b/>
+          <w:bCs/>
+          <w:szCs w:val="24"/>
+        </w:rPr>
+        <w:t>isks</w:t>
+      </w:r>
+    </w:p>
+    <w:p>
+      <w:pPr>
+        <w:spacing w:line="480" w:lineRule="auto"/>
+        <w:rPr>
+          <w:rFonts w:cs="Times New Roman"/>
+          <w:szCs w:val="24"/>
+        </w:rPr>
+      </w:pPr>
+      <w:r>
+        <w:rPr>
+          <w:rFonts w:cs="Times New Roman"/>
+          <w:szCs w:val="24"/>
+        </w:rPr>
+        <w:tab/>
+      </w:r>
+      <w:r>
+        <w:rPr>
+          <w:rFonts w:cs="Times New Roman"/>
+          <w:szCs w:val="24"/>
+        </w:rPr>
+        <w:t xml:space="preserve">The main risk of this project is failure due to time. </w:t>
+      </w:r>
+      <w:r>
+        <w:rPr>
+          <w:rFonts w:cs="Times New Roman"/>
+          <w:szCs w:val="24"/>
+        </w:rPr>
+        <w:t xml:space="preserve">Due to the constriction of having to complete the project within a semester this has been identified as the main risk. </w:t>
+      </w:r>
+      <w:r>
+        <w:rPr>
+          <w:rFonts w:cs="Times New Roman"/>
+          <w:szCs w:val="24"/>
+        </w:rPr>
+        <w:t xml:space="preserve">A </w:t>
+      </w:r>
+      <w:r>
+        <w:rPr>
+          <w:rFonts w:cs="Times New Roman"/>
+          <w:szCs w:val="24"/>
+        </w:rPr>
+        <w:t>secondary risk</w:t>
       </w:r>
       <w:r>
         <w:rPr>
@@ -883,14 +1636,261 @@
           <w:rFonts w:cs="Times New Roman"/>
           <w:szCs w:val="24"/>
         </w:rPr>
-        <w:t>This is important to because such</w:t>
-      </w:r>
-      <w:r>
-        <w:rPr>
-          <w:rFonts w:cs="Times New Roman"/>
-          <w:szCs w:val="24"/>
-        </w:rPr>
-        <w:t xml:space="preserve"> evolution can be helpful to understand how predators contribute to a stable ecosystem</w:t>
+        <w:t>is</w:t>
+      </w:r>
+      <w:r>
+        <w:rPr>
+          <w:rFonts w:cs="Times New Roman"/>
+          <w:szCs w:val="24"/>
+        </w:rPr>
+        <w:t xml:space="preserve"> computational load requirements. Due to the nature of discrete </w:t>
+      </w:r>
+      <w:r>
+        <w:rPr>
+          <w:rFonts w:cs="Times New Roman"/>
+          <w:szCs w:val="24"/>
+        </w:rPr>
+        <w:t xml:space="preserve">event driven simulations this project will require major computational power. </w:t>
+      </w:r>
+      <w:r>
+        <w:rPr>
+          <w:rFonts w:cs="Times New Roman"/>
+          <w:szCs w:val="24"/>
+        </w:rPr>
+        <w:t xml:space="preserve">This could cause delays in the project due to extreme </w:t>
+      </w:r>
+      <w:proofErr w:type="gramStart"/>
+      <w:r>
+        <w:rPr>
+          <w:rFonts w:cs="Times New Roman"/>
+          <w:szCs w:val="24"/>
+        </w:rPr>
+        <w:t>run</w:t>
+      </w:r>
+      <w:proofErr w:type="gramEnd"/>
+      <w:r>
+        <w:rPr>
+          <w:rFonts w:cs="Times New Roman"/>
+          <w:szCs w:val="24"/>
+        </w:rPr>
+        <w:t xml:space="preserve"> time requirements.</w:t>
+      </w:r>
+      <w:r>
+        <w:rPr>
+          <w:rFonts w:cs="Times New Roman"/>
+          <w:szCs w:val="24"/>
+        </w:rPr>
+        <w:t xml:space="preserve"> This project does not contain data from protected sources and will only be </w:t>
+      </w:r>
+      <w:r>
+        <w:rPr>
+          <w:rFonts w:cs="Times New Roman"/>
+          <w:szCs w:val="24"/>
+        </w:rPr>
+        <w:t>usable</w:t>
+      </w:r>
+      <w:r>
+        <w:rPr>
+          <w:rFonts w:cs="Times New Roman"/>
+          <w:szCs w:val="24"/>
+        </w:rPr>
+        <w:t xml:space="preserve"> in</w:t>
+      </w:r>
+      <w:r>
+        <w:rPr>
+          <w:rFonts w:cs="Times New Roman"/>
+          <w:szCs w:val="24"/>
+        </w:rPr>
+        <w:t xml:space="preserve"> a</w:t>
+      </w:r>
+      <w:r>
+        <w:rPr>
+          <w:rFonts w:cs="Times New Roman"/>
+          <w:szCs w:val="24"/>
+        </w:rPr>
+        <w:t xml:space="preserve"> local environment.</w:t>
+      </w:r>
+      <w:r>
+        <w:rPr>
+          <w:rFonts w:cs="Times New Roman"/>
+          <w:szCs w:val="24"/>
+        </w:rPr>
+        <w:t xml:space="preserve"> This project does not work with real animals, however data from formal studies on animal predation have been used to build background information. Any information gathered from those sources will be cited and given proper recognition.</w:t>
+      </w:r>
+    </w:p>
+    <w:p>
+      <w:pPr>
+        <w:spacing w:line="480" w:lineRule="auto"/>
+        <w:rPr>
+          <w:rFonts w:cs="Times New Roman"/>
+          <w:b/>
+          <w:bCs/>
+          <w:szCs w:val="24"/>
+        </w:rPr>
+      </w:pPr>
+      <w:r>
+        <w:rPr>
+          <w:rFonts w:cs="Times New Roman"/>
+          <w:b/>
+          <w:bCs/>
+          <w:szCs w:val="24"/>
+        </w:rPr>
+        <w:t xml:space="preserve">MVP </w:t>
+      </w:r>
+      <w:r>
+        <w:rPr>
+          <w:rFonts w:cs="Times New Roman"/>
+          <w:b/>
+          <w:bCs/>
+          <w:szCs w:val="24"/>
+        </w:rPr>
+        <w:t>D</w:t>
+      </w:r>
+      <w:r>
+        <w:rPr>
+          <w:rFonts w:cs="Times New Roman"/>
+          <w:b/>
+          <w:bCs/>
+          <w:szCs w:val="24"/>
+        </w:rPr>
+        <w:t>efinition</w:t>
+      </w:r>
+    </w:p>
+    <w:p>
+      <w:pPr>
+        <w:spacing w:line="480" w:lineRule="auto"/>
+        <w:rPr>
+          <w:rFonts w:cs="Times New Roman"/>
+          <w:szCs w:val="24"/>
+        </w:rPr>
+      </w:pPr>
+      <w:r>
+        <w:rPr>
+          <w:rFonts w:cs="Times New Roman"/>
+          <w:szCs w:val="24"/>
+        </w:rPr>
+        <w:tab/>
+      </w:r>
+      <w:r>
+        <w:rPr>
+          <w:rFonts w:cs="Times New Roman"/>
+          <w:szCs w:val="24"/>
+        </w:rPr>
+        <w:t xml:space="preserve">The </w:t>
+      </w:r>
+      <w:r>
+        <w:rPr>
+          <w:rFonts w:cs="Times New Roman"/>
+          <w:szCs w:val="24"/>
+        </w:rPr>
+        <w:t>Minimum Viable Product</w:t>
+      </w:r>
+      <w:r>
+        <w:rPr>
+          <w:rFonts w:cs="Times New Roman"/>
+          <w:szCs w:val="24"/>
+        </w:rPr>
+        <w:t xml:space="preserve"> (MVP)</w:t>
+      </w:r>
+      <w:r>
+        <w:rPr>
+          <w:rFonts w:cs="Times New Roman"/>
+          <w:szCs w:val="24"/>
+        </w:rPr>
+        <w:t xml:space="preserve"> for this project</w:t>
+      </w:r>
+      <w:r>
+        <w:rPr>
+          <w:rFonts w:cs="Times New Roman"/>
+          <w:szCs w:val="24"/>
+        </w:rPr>
+        <w:t xml:space="preserve"> is a working simulation </w:t>
+      </w:r>
+      <w:r>
+        <w:rPr>
+          <w:rFonts w:cs="Times New Roman"/>
+          <w:szCs w:val="24"/>
+        </w:rPr>
+        <w:t xml:space="preserve">for at least one prey item </w:t>
+      </w:r>
+      <w:r>
+        <w:rPr>
+          <w:rFonts w:cs="Times New Roman"/>
+          <w:szCs w:val="24"/>
+        </w:rPr>
+        <w:t xml:space="preserve">(Milestone </w:t>
+      </w:r>
+      <w:r>
+        <w:rPr>
+          <w:rFonts w:cs="Times New Roman"/>
+          <w:szCs w:val="24"/>
+        </w:rPr>
+        <w:t>7</w:t>
+      </w:r>
+      <w:r>
+        <w:rPr>
+          <w:rFonts w:cs="Times New Roman"/>
+          <w:szCs w:val="24"/>
+        </w:rPr>
+        <w:t>)</w:t>
+      </w:r>
+      <w:r>
+        <w:rPr>
+          <w:rFonts w:cs="Times New Roman"/>
+          <w:szCs w:val="24"/>
+        </w:rPr>
+        <w:t xml:space="preserve">. </w:t>
+      </w:r>
+    </w:p>
+    <w:p>
+      <w:pPr>
+        <w:spacing w:line="480" w:lineRule="auto"/>
+        <w:rPr>
+          <w:rFonts w:cs="Times New Roman"/>
+          <w:szCs w:val="24"/>
+        </w:rPr>
+      </w:pPr>
+      <w:r>
+        <w:rPr>
+          <w:rFonts w:cs="Times New Roman"/>
+          <w:szCs w:val="24"/>
+        </w:rPr>
+        <w:t>This includes</w:t>
+      </w:r>
+    </w:p>
+    <w:p>
+      <w:pPr>
+        <w:pStyle w:val="ListParagraph"/>
+        <w:numPr>
+          <w:ilvl w:val="0"/>
+          <w:numId w:val="4"/>
+        </w:numPr>
+        <w:spacing w:line="480" w:lineRule="auto"/>
+        <w:rPr>
+          <w:rFonts w:cs="Times New Roman"/>
+          <w:szCs w:val="24"/>
+        </w:rPr>
+      </w:pPr>
+      <w:r>
+        <w:rPr>
+          <w:rFonts w:cs="Times New Roman"/>
+          <w:szCs w:val="24"/>
+        </w:rPr>
+        <w:t>F</w:t>
+      </w:r>
+      <w:r>
+        <w:rPr>
+          <w:rFonts w:cs="Times New Roman"/>
+          <w:szCs w:val="24"/>
+        </w:rPr>
+        <w:t>ull path finding algorithm</w:t>
+      </w:r>
+      <w:r>
+        <w:rPr>
+          <w:rFonts w:cs="Times New Roman"/>
+          <w:szCs w:val="24"/>
+        </w:rPr>
+        <w:t xml:space="preserve"> for both predators and prey</w:t>
       </w:r>
       <w:r>
         <w:rPr>
@@ -899,46 +1899,33 @@
         </w:rPr>
         <w:t xml:space="preserve"> </w:t>
       </w:r>
-      <w:r>
-        <w:rPr>
-          <w:rFonts w:cs="Times New Roman"/>
-          <w:szCs w:val="24"/>
-        </w:rPr>
-        <w:fldChar w:fldCharType="begin"/>
-      </w:r>
-      <w:r>
-        <w:rPr>
-          <w:rFonts w:cs="Times New Roman"/>
-          <w:szCs w:val="24"/>
-        </w:rPr>
-        <w:instrText xml:space="preserve"> ADDIN ZOTERO_ITEM CSL_CITATION {"citationID":"AGJoAg2O","properties":{"unsorted":false,"formattedCitation":"(Allesina &amp; Tang, 2012)","plainCitation":"(Allesina &amp; Tang, 2012)","noteIndex":0},"citationItems":[{"id":23,"uris":["http://zotero.org/users/20572099/items/B7KBP6GP"],"itemData":{"id":23,"type":"article-journal","container-title":"Nature","DOI":"10.1038/nature10832","ISSN":"0028-0836, 1476-4687","issue":"7388","journalAbbreviation":"Nature","language":"en","license":"http://www.springer.com/tdm","page":"205-208","source":"DOI.org (Crossref)","title":"Stability criteria for complex ecosystems","volume":"483","author":[{"family":"Allesina","given":"Stefano"},{"family":"Tang","given":"Si"}],"issued":{"date-parts":[["2012",3]]}}}],"schema":"https://github.com/citation-style-language/schema/raw/master/csl-citation.json"} </w:instrText>
-      </w:r>
-      <w:r>
-        <w:rPr>
-          <w:rFonts w:cs="Times New Roman"/>
-          <w:szCs w:val="24"/>
-        </w:rPr>
-        <w:fldChar w:fldCharType="separate"/>
-      </w:r>
-      <w:r>
-        <w:rPr>
-          <w:rFonts w:cs="Times New Roman"/>
-        </w:rPr>
-        <w:t>(Allesina &amp; Tang, 2012)</w:t>
-      </w:r>
-      <w:r>
-        <w:rPr>
-          <w:rFonts w:cs="Times New Roman"/>
-          <w:szCs w:val="24"/>
-        </w:rPr>
-        <w:fldChar w:fldCharType="end"/>
-      </w:r>
-      <w:r>
-        <w:rPr>
-          <w:rFonts w:cs="Times New Roman"/>
-          <w:szCs w:val="24"/>
-        </w:rPr>
-        <w:t>.</w:t>
+    </w:p>
+    <w:p>
+      <w:pPr>
+        <w:pStyle w:val="ListParagraph"/>
+        <w:numPr>
+          <w:ilvl w:val="0"/>
+          <w:numId w:val="4"/>
+        </w:numPr>
+        <w:spacing w:line="480" w:lineRule="auto"/>
+        <w:rPr>
+          <w:rFonts w:cs="Times New Roman"/>
+          <w:szCs w:val="24"/>
+        </w:rPr>
+      </w:pPr>
+      <w:r>
+        <w:rPr>
+          <w:rFonts w:cs="Times New Roman"/>
+          <w:szCs w:val="24"/>
+        </w:rPr>
+        <w:t>S</w:t>
+      </w:r>
+      <w:r>
+        <w:rPr>
+          <w:rFonts w:cs="Times New Roman"/>
+          <w:szCs w:val="24"/>
+        </w:rPr>
+        <w:t>imulated 2d environment/map</w:t>
       </w:r>
       <w:r>
         <w:rPr>
@@ -947,26 +1934,111 @@
         </w:rPr>
         <w:t xml:space="preserve"> </w:t>
       </w:r>
-      <w:r>
-        <w:rPr>
-          <w:rFonts w:cs="Times New Roman"/>
-          <w:szCs w:val="24"/>
-        </w:rPr>
-        <w:t>Without understanding the role predators play, we can inadvertently put both predator and prey populations at risk</w:t>
-      </w:r>
-      <w:r>
-        <w:rPr>
-          <w:rFonts w:cs="Times New Roman"/>
-          <w:szCs w:val="24"/>
-        </w:rPr>
-        <w:t xml:space="preserve"> if we </w:t>
-      </w:r>
-      <w:r>
-        <w:rPr>
-          <w:rFonts w:cs="Times New Roman"/>
-          <w:szCs w:val="24"/>
-        </w:rPr>
-        <w:t>drive</w:t>
+    </w:p>
+    <w:p>
+      <w:pPr>
+        <w:pStyle w:val="ListParagraph"/>
+        <w:numPr>
+          <w:ilvl w:val="0"/>
+          <w:numId w:val="4"/>
+        </w:numPr>
+        <w:spacing w:line="480" w:lineRule="auto"/>
+        <w:rPr>
+          <w:rFonts w:cs="Times New Roman"/>
+          <w:szCs w:val="24"/>
+        </w:rPr>
+      </w:pPr>
+      <w:r>
+        <w:rPr>
+          <w:rFonts w:cs="Times New Roman"/>
+          <w:szCs w:val="24"/>
+        </w:rPr>
+        <w:t>C</w:t>
+      </w:r>
+      <w:r>
+        <w:rPr>
+          <w:rFonts w:cs="Times New Roman"/>
+          <w:szCs w:val="24"/>
+        </w:rPr>
+        <w:t xml:space="preserve">lasses to represent predator hunting strategies and </w:t>
+      </w:r>
+      <w:r>
+        <w:rPr>
+          <w:rFonts w:cs="Times New Roman"/>
+          <w:szCs w:val="24"/>
+        </w:rPr>
+        <w:t>chosen prey items</w:t>
+      </w:r>
+    </w:p>
+    <w:p>
+      <w:pPr>
+        <w:pStyle w:val="ListParagraph"/>
+        <w:numPr>
+          <w:ilvl w:val="0"/>
+          <w:numId w:val="4"/>
+        </w:numPr>
+        <w:spacing w:line="480" w:lineRule="auto"/>
+        <w:rPr>
+          <w:rFonts w:cs="Times New Roman"/>
+          <w:szCs w:val="24"/>
+        </w:rPr>
+      </w:pPr>
+      <w:r>
+        <w:rPr>
+          <w:rFonts w:cs="Times New Roman"/>
+          <w:szCs w:val="24"/>
+        </w:rPr>
+        <w:t>A working simulation</w:t>
+      </w:r>
+    </w:p>
+    <w:p>
+      <w:pPr>
+        <w:pStyle w:val="ListParagraph"/>
+        <w:numPr>
+          <w:ilvl w:val="0"/>
+          <w:numId w:val="4"/>
+        </w:numPr>
+        <w:spacing w:line="480" w:lineRule="auto"/>
+        <w:rPr>
+          <w:rFonts w:cs="Times New Roman"/>
+          <w:szCs w:val="24"/>
+        </w:rPr>
+      </w:pPr>
+      <w:r>
+        <w:rPr>
+          <w:rFonts w:cs="Times New Roman"/>
+          <w:szCs w:val="24"/>
+        </w:rPr>
+        <w:lastRenderedPageBreak/>
+        <w:t>A CSV output file with data from simulation</w:t>
+      </w:r>
+    </w:p>
+    <w:p>
+      <w:pPr>
+        <w:pStyle w:val="ListParagraph"/>
+        <w:numPr>
+          <w:ilvl w:val="0"/>
+          <w:numId w:val="4"/>
+        </w:numPr>
+        <w:spacing w:line="480" w:lineRule="auto"/>
+        <w:rPr>
+          <w:rFonts w:cs="Times New Roman"/>
+          <w:szCs w:val="24"/>
+        </w:rPr>
+      </w:pPr>
+      <w:r>
+        <w:rPr>
+          <w:rFonts w:cs="Times New Roman"/>
+          <w:szCs w:val="24"/>
+        </w:rPr>
+        <w:t xml:space="preserve">Code to be run without error on at least two different </w:t>
+      </w:r>
+      <w:r>
+        <w:rPr>
+          <w:rFonts w:cs="Times New Roman"/>
+          <w:szCs w:val="24"/>
+        </w:rPr>
+        <w:t>machines</w:t>
       </w:r>
       <w:r>
         <w:rPr>
@@ -975,76 +2047,986 @@
         </w:rPr>
         <w:t xml:space="preserve"> </w:t>
       </w:r>
-      <w:r>
-        <w:rPr>
-          <w:rFonts w:cs="Times New Roman"/>
-          <w:szCs w:val="24"/>
-        </w:rPr>
-        <w:t xml:space="preserve">a species </w:t>
-      </w:r>
-      <w:r>
-        <w:rPr>
-          <w:rFonts w:cs="Times New Roman"/>
-          <w:szCs w:val="24"/>
-        </w:rPr>
-        <w:t xml:space="preserve">to </w:t>
-      </w:r>
+    </w:p>
+    <w:p>
+      <w:pPr>
+        <w:spacing w:line="480" w:lineRule="auto"/>
+        <w:rPr>
+          <w:rFonts w:cs="Times New Roman"/>
+          <w:szCs w:val="24"/>
+        </w:rPr>
+      </w:pPr>
+      <w:r>
+        <w:rPr>
+          <w:rFonts w:cs="Times New Roman"/>
+          <w:szCs w:val="24"/>
+        </w:rPr>
+        <w:t>Criteria for a working simulation include</w:t>
+      </w:r>
+    </w:p>
+    <w:p>
+      <w:pPr>
+        <w:pStyle w:val="ListParagraph"/>
+        <w:numPr>
+          <w:ilvl w:val="0"/>
+          <w:numId w:val="5"/>
+        </w:numPr>
+        <w:spacing w:line="480" w:lineRule="auto"/>
+        <w:rPr>
+          <w:rFonts w:cs="Times New Roman"/>
+          <w:szCs w:val="24"/>
+        </w:rPr>
+      </w:pPr>
+      <w:r>
+        <w:rPr>
+          <w:rFonts w:cs="Times New Roman"/>
+          <w:szCs w:val="24"/>
+        </w:rPr>
+        <w:t xml:space="preserve">Minimum working state of </w:t>
+      </w:r>
+      <w:r>
+        <w:rPr>
+          <w:rFonts w:cs="Times New Roman"/>
+          <w:szCs w:val="24"/>
+        </w:rPr>
+        <w:t xml:space="preserve">the </w:t>
+      </w:r>
+      <w:r>
+        <w:rPr>
+          <w:rFonts w:cs="Times New Roman"/>
+          <w:szCs w:val="24"/>
+        </w:rPr>
+        <w:t>simulation running for a</w:t>
+      </w:r>
+      <w:r>
+        <w:rPr>
+          <w:rFonts w:cs="Times New Roman"/>
+          <w:szCs w:val="24"/>
+        </w:rPr>
+        <w:t xml:space="preserve"> </w:t>
+      </w:r>
+      <w:r>
+        <w:rPr>
+          <w:rFonts w:cs="Times New Roman"/>
+          <w:szCs w:val="24"/>
+        </w:rPr>
+        <w:t>1</w:t>
+      </w:r>
+      <w:r>
+        <w:rPr>
+          <w:rFonts w:cs="Times New Roman"/>
+          <w:szCs w:val="24"/>
+        </w:rPr>
+        <w:t>,</w:t>
+      </w:r>
+      <w:r>
+        <w:rPr>
+          <w:rFonts w:cs="Times New Roman"/>
+          <w:szCs w:val="24"/>
+        </w:rPr>
+        <w:t>00</w:t>
+      </w:r>
+      <w:r>
+        <w:rPr>
+          <w:rFonts w:cs="Times New Roman"/>
+          <w:szCs w:val="24"/>
+        </w:rPr>
+        <w:t>0</w:t>
+      </w:r>
+      <w:r>
+        <w:rPr>
+          <w:rFonts w:cs="Times New Roman"/>
+          <w:szCs w:val="24"/>
+        </w:rPr>
+        <w:t xml:space="preserve"> generation</w:t>
+      </w:r>
+      <w:r>
+        <w:rPr>
+          <w:rFonts w:cs="Times New Roman"/>
+          <w:szCs w:val="24"/>
+        </w:rPr>
+        <w:t xml:space="preserve"> without any runtime errors</w:t>
+      </w:r>
+      <w:r>
+        <w:rPr>
+          <w:rFonts w:cs="Times New Roman"/>
+          <w:szCs w:val="24"/>
+        </w:rPr>
+        <w:t xml:space="preserve"> and producing output data</w:t>
+      </w:r>
+      <w:r>
+        <w:rPr>
+          <w:rFonts w:cs="Times New Roman"/>
+          <w:szCs w:val="24"/>
+        </w:rPr>
+        <w:t xml:space="preserve"> in a CSV file</w:t>
+      </w:r>
+    </w:p>
+    <w:p>
+      <w:pPr>
+        <w:pStyle w:val="ListParagraph"/>
+        <w:numPr>
+          <w:ilvl w:val="0"/>
+          <w:numId w:val="5"/>
+        </w:numPr>
+        <w:spacing w:line="480" w:lineRule="auto"/>
+        <w:rPr>
+          <w:rFonts w:cs="Times New Roman"/>
+          <w:szCs w:val="24"/>
+        </w:rPr>
+      </w:pPr>
+      <w:r>
+        <w:rPr>
+          <w:rFonts w:cs="Times New Roman"/>
+          <w:szCs w:val="24"/>
+        </w:rPr>
+        <w:t>Minimum of 1 working prey item</w:t>
+      </w:r>
+      <w:r>
+        <w:rPr>
+          <w:rFonts w:cs="Times New Roman"/>
+          <w:szCs w:val="24"/>
+        </w:rPr>
+        <w:t xml:space="preserve"> simulation</w:t>
+      </w:r>
+      <w:r>
+        <w:rPr>
+          <w:rFonts w:cs="Times New Roman"/>
+          <w:szCs w:val="24"/>
+        </w:rPr>
+        <w:t xml:space="preserve"> for predators to evolve against</w:t>
+      </w:r>
+    </w:p>
+    <w:p>
+      <w:pPr>
+        <w:pStyle w:val="ListParagraph"/>
+        <w:numPr>
+          <w:ilvl w:val="0"/>
+          <w:numId w:val="5"/>
+        </w:numPr>
+        <w:spacing w:line="480" w:lineRule="auto"/>
+        <w:rPr>
+          <w:rFonts w:cs="Times New Roman"/>
+          <w:szCs w:val="24"/>
+        </w:rPr>
+      </w:pPr>
+      <w:r>
+        <w:rPr>
+          <w:rFonts w:cs="Times New Roman"/>
+          <w:szCs w:val="24"/>
+        </w:rPr>
+        <w:t>Multi-threading capability to help improve performance</w:t>
+      </w:r>
+    </w:p>
+    <w:p>
+      <w:pPr>
+        <w:spacing w:line="480" w:lineRule="auto"/>
+        <w:rPr>
+          <w:rFonts w:cs="Times New Roman"/>
+          <w:b/>
+          <w:bCs/>
+          <w:szCs w:val="24"/>
+        </w:rPr>
+      </w:pPr>
+      <w:r>
+        <w:rPr>
+          <w:rFonts w:cs="Times New Roman"/>
+          <w:b/>
+          <w:bCs/>
+          <w:szCs w:val="24"/>
+        </w:rPr>
+        <w:t>M</w:t>
+      </w:r>
+      <w:r>
+        <w:rPr>
+          <w:rFonts w:cs="Times New Roman"/>
+          <w:b/>
+          <w:bCs/>
+          <w:szCs w:val="24"/>
+        </w:rPr>
+        <w:t xml:space="preserve">easurable </w:t>
+      </w:r>
+      <w:r>
+        <w:rPr>
+          <w:rFonts w:cs="Times New Roman"/>
+          <w:b/>
+          <w:bCs/>
+          <w:szCs w:val="24"/>
+        </w:rPr>
+        <w:t>C</w:t>
+      </w:r>
+      <w:r>
+        <w:rPr>
+          <w:rFonts w:cs="Times New Roman"/>
+          <w:b/>
+          <w:bCs/>
+          <w:szCs w:val="24"/>
+        </w:rPr>
+        <w:t xml:space="preserve">ompletion </w:t>
+      </w:r>
+      <w:r>
+        <w:rPr>
+          <w:rFonts w:cs="Times New Roman"/>
+          <w:b/>
+          <w:bCs/>
+          <w:szCs w:val="24"/>
+        </w:rPr>
+        <w:t>C</w:t>
+      </w:r>
+      <w:r>
+        <w:rPr>
+          <w:rFonts w:cs="Times New Roman"/>
+          <w:b/>
+          <w:bCs/>
+          <w:szCs w:val="24"/>
+        </w:rPr>
+        <w:t>riteria</w:t>
+      </w:r>
+    </w:p>
+    <w:p>
+      <w:pPr>
+        <w:spacing w:line="480" w:lineRule="auto"/>
+        <w:rPr>
+          <w:rFonts w:cs="Times New Roman"/>
+          <w:szCs w:val="24"/>
+        </w:rPr>
+      </w:pPr>
+      <w:r>
+        <w:rPr>
+          <w:rFonts w:cs="Times New Roman"/>
+          <w:szCs w:val="24"/>
+        </w:rPr>
+        <w:t xml:space="preserve">To </w:t>
+      </w:r>
+      <w:r>
+        <w:t>m</w:t>
+      </w:r>
+      <w:r>
+        <w:t xml:space="preserve">easurable </w:t>
+      </w:r>
+      <w:r>
+        <w:rPr>
+          <w:rFonts w:cs="Times New Roman"/>
+          <w:szCs w:val="24"/>
+        </w:rPr>
+        <w:t>completion for each milestone a list of files</w:t>
+      </w:r>
+      <w:r>
+        <w:rPr>
+          <w:rFonts w:cs="Times New Roman"/>
+          <w:szCs w:val="24"/>
+        </w:rPr>
+        <w:t>/functions</w:t>
+      </w:r>
+      <w:r>
+        <w:rPr>
+          <w:rFonts w:cs="Times New Roman"/>
+          <w:szCs w:val="24"/>
+        </w:rPr>
+        <w:t xml:space="preserve"> that should be produced in said milestone is listed below.</w:t>
+      </w:r>
+    </w:p>
+    <w:p>
+      <w:pPr>
+        <w:spacing w:line="480" w:lineRule="auto"/>
+        <w:rPr>
+          <w:rFonts w:cs="Times New Roman"/>
+          <w:szCs w:val="24"/>
+        </w:rPr>
+      </w:pPr>
+      <w:r>
+        <w:rPr>
+          <w:rFonts w:cs="Times New Roman"/>
+          <w:szCs w:val="24"/>
+        </w:rPr>
+        <w:t>Milestone 1</w:t>
+      </w:r>
+    </w:p>
+    <w:p>
+      <w:pPr>
+        <w:pStyle w:val="ListParagraph"/>
+        <w:numPr>
+          <w:ilvl w:val="0"/>
+          <w:numId w:val="6"/>
+        </w:numPr>
+        <w:spacing w:line="480" w:lineRule="auto"/>
+        <w:rPr>
+          <w:rFonts w:cs="Times New Roman"/>
+          <w:szCs w:val="24"/>
+        </w:rPr>
+      </w:pPr>
+      <w:r>
+        <w:rPr>
+          <w:rFonts w:cs="Times New Roman"/>
+          <w:szCs w:val="24"/>
+        </w:rPr>
+        <w:t>Git hub repository with basic file structure</w:t>
+      </w:r>
+    </w:p>
+    <w:p>
+      <w:pPr>
+        <w:pStyle w:val="ListParagraph"/>
+        <w:numPr>
+          <w:ilvl w:val="0"/>
+          <w:numId w:val="6"/>
+        </w:numPr>
+        <w:spacing w:line="480" w:lineRule="auto"/>
+        <w:rPr>
+          <w:rFonts w:cs="Times New Roman"/>
+          <w:szCs w:val="24"/>
+        </w:rPr>
+      </w:pPr>
+      <w:r>
+        <w:rPr>
+          <w:rFonts w:cs="Times New Roman"/>
+          <w:szCs w:val="24"/>
+        </w:rPr>
+        <w:t>Milestone chart with listed tasks</w:t>
+      </w:r>
+    </w:p>
+    <w:p>
+      <w:pPr>
+        <w:spacing w:line="480" w:lineRule="auto"/>
+        <w:ind w:left="360"/>
+        <w:rPr>
+          <w:rFonts w:cs="Times New Roman"/>
+          <w:szCs w:val="24"/>
+        </w:rPr>
+      </w:pPr>
+    </w:p>
+    <w:p>
+      <w:pPr>
+        <w:spacing w:line="480" w:lineRule="auto"/>
+        <w:rPr>
+          <w:rFonts w:cs="Times New Roman"/>
+          <w:szCs w:val="24"/>
+        </w:rPr>
+      </w:pPr>
+      <w:r>
+        <w:rPr>
+          <w:rFonts w:cs="Times New Roman"/>
+          <w:szCs w:val="24"/>
+        </w:rPr>
+        <w:t xml:space="preserve">Milestone </w:t>
+      </w:r>
+      <w:r>
+        <w:rPr>
+          <w:rFonts w:cs="Times New Roman"/>
+          <w:szCs w:val="24"/>
+        </w:rPr>
+        <w:t>2</w:t>
+      </w:r>
+    </w:p>
+    <w:p>
+      <w:pPr>
+        <w:pStyle w:val="ListParagraph"/>
+        <w:numPr>
+          <w:ilvl w:val="0"/>
+          <w:numId w:val="8"/>
+        </w:numPr>
+        <w:spacing w:line="480" w:lineRule="auto"/>
+        <w:rPr>
+          <w:rFonts w:cs="Times New Roman"/>
+          <w:szCs w:val="24"/>
+        </w:rPr>
+      </w:pPr>
+      <w:r>
+        <w:rPr>
+          <w:rFonts w:cs="Times New Roman"/>
+          <w:szCs w:val="24"/>
+        </w:rPr>
+        <w:t>Animal class file</w:t>
+      </w:r>
+    </w:p>
+    <w:p>
+      <w:pPr>
+        <w:spacing w:line="480" w:lineRule="auto"/>
+        <w:rPr>
+          <w:rFonts w:cs="Times New Roman"/>
+          <w:szCs w:val="24"/>
+        </w:rPr>
+      </w:pPr>
+      <w:r>
+        <w:rPr>
+          <w:rFonts w:cs="Times New Roman"/>
+          <w:szCs w:val="24"/>
+        </w:rPr>
+        <w:t xml:space="preserve">Milestone </w:t>
+      </w:r>
+      <w:r>
+        <w:rPr>
+          <w:rFonts w:cs="Times New Roman"/>
+          <w:szCs w:val="24"/>
+        </w:rPr>
+        <w:t>3</w:t>
+      </w:r>
+    </w:p>
+    <w:p>
+      <w:pPr>
+        <w:pStyle w:val="ListParagraph"/>
+        <w:numPr>
+          <w:ilvl w:val="0"/>
+          <w:numId w:val="8"/>
+        </w:numPr>
+        <w:spacing w:line="480" w:lineRule="auto"/>
+        <w:rPr>
+          <w:rFonts w:cs="Times New Roman"/>
+          <w:szCs w:val="24"/>
+        </w:rPr>
+      </w:pPr>
+      <w:r>
+        <w:rPr>
+          <w:rFonts w:cs="Times New Roman"/>
+          <w:szCs w:val="24"/>
+        </w:rPr>
+        <w:t>Map class</w:t>
+      </w:r>
+    </w:p>
+    <w:p>
+      <w:pPr>
+        <w:spacing w:line="480" w:lineRule="auto"/>
+        <w:rPr>
+          <w:rFonts w:cs="Times New Roman"/>
+          <w:szCs w:val="24"/>
+        </w:rPr>
+      </w:pPr>
+      <w:r>
+        <w:rPr>
+          <w:rFonts w:cs="Times New Roman"/>
+          <w:szCs w:val="24"/>
+        </w:rPr>
+        <w:t xml:space="preserve">Milestone </w:t>
+      </w:r>
+      <w:r>
+        <w:rPr>
+          <w:rFonts w:cs="Times New Roman"/>
+          <w:szCs w:val="24"/>
+        </w:rPr>
+        <w:t>4</w:t>
+      </w:r>
+    </w:p>
+    <w:p>
+      <w:pPr>
+        <w:pStyle w:val="ListParagraph"/>
+        <w:numPr>
+          <w:ilvl w:val="0"/>
+          <w:numId w:val="8"/>
+        </w:numPr>
+        <w:spacing w:line="480" w:lineRule="auto"/>
+        <w:rPr>
+          <w:rFonts w:cs="Times New Roman"/>
+          <w:szCs w:val="24"/>
+        </w:rPr>
+      </w:pPr>
+      <w:r>
+        <w:rPr>
+          <w:rFonts w:cs="Times New Roman"/>
+          <w:szCs w:val="24"/>
+        </w:rPr>
+        <w:t>Path finding function with helper functions</w:t>
+      </w:r>
+    </w:p>
+    <w:p>
+      <w:pPr>
+        <w:pStyle w:val="ListParagraph"/>
+        <w:numPr>
+          <w:ilvl w:val="0"/>
+          <w:numId w:val="8"/>
+        </w:numPr>
+        <w:spacing w:line="480" w:lineRule="auto"/>
+        <w:rPr>
+          <w:rFonts w:cs="Times New Roman"/>
+          <w:szCs w:val="24"/>
+        </w:rPr>
+      </w:pPr>
+      <w:r>
+        <w:rPr>
+          <w:rFonts w:cs="Times New Roman"/>
+          <w:szCs w:val="24"/>
+        </w:rPr>
+        <w:t>Movement calculation function</w:t>
+      </w:r>
+    </w:p>
+    <w:p>
+      <w:pPr>
+        <w:pStyle w:val="ListParagraph"/>
+        <w:numPr>
+          <w:ilvl w:val="0"/>
+          <w:numId w:val="8"/>
+        </w:numPr>
+        <w:spacing w:line="480" w:lineRule="auto"/>
+        <w:rPr>
+          <w:rFonts w:cs="Times New Roman"/>
+          <w:szCs w:val="24"/>
+        </w:rPr>
+      </w:pPr>
+      <w:r>
+        <w:rPr>
+          <w:rFonts w:cs="Times New Roman"/>
+          <w:szCs w:val="24"/>
+        </w:rPr>
+        <w:t>Movement update function</w:t>
+      </w:r>
+    </w:p>
+    <w:p>
+      <w:pPr>
+        <w:pStyle w:val="ListParagraph"/>
+        <w:numPr>
+          <w:ilvl w:val="0"/>
+          <w:numId w:val="8"/>
+        </w:numPr>
+        <w:spacing w:line="480" w:lineRule="auto"/>
+        <w:rPr>
+          <w:rFonts w:cs="Times New Roman"/>
+          <w:szCs w:val="24"/>
+        </w:rPr>
+      </w:pPr>
+      <w:r>
+        <w:rPr>
+          <w:rFonts w:cs="Times New Roman"/>
+          <w:szCs w:val="24"/>
+        </w:rPr>
+        <w:t>E</w:t>
+      </w:r>
+      <w:r>
+        <w:rPr>
+          <w:rFonts w:cs="Times New Roman"/>
+          <w:szCs w:val="24"/>
+        </w:rPr>
+        <w:t>nergy usage calculation</w:t>
+      </w:r>
+      <w:r>
+        <w:rPr>
+          <w:rFonts w:cs="Times New Roman"/>
+          <w:szCs w:val="24"/>
+        </w:rPr>
+        <w:t xml:space="preserve"> function</w:t>
+      </w:r>
+    </w:p>
+    <w:p>
+      <w:pPr>
+        <w:pStyle w:val="ListParagraph"/>
+        <w:numPr>
+          <w:ilvl w:val="0"/>
+          <w:numId w:val="8"/>
+        </w:numPr>
+        <w:spacing w:line="480" w:lineRule="auto"/>
+        <w:rPr>
+          <w:rFonts w:cs="Times New Roman"/>
+          <w:szCs w:val="24"/>
+        </w:rPr>
+      </w:pPr>
       <w:r>
         <w:rPr>
           <w:rFonts w:cs="Times New Roman"/>
           <w:szCs w:val="24"/>
         </w:rPr>
         <w:lastRenderedPageBreak/>
-        <w:t>extinction</w:t>
-      </w:r>
-      <w:r>
-        <w:rPr>
-          <w:rFonts w:cs="Times New Roman"/>
-          <w:szCs w:val="24"/>
-        </w:rPr>
-        <w:t>.</w:t>
-      </w:r>
-      <w:r>
-        <w:rPr>
-          <w:rFonts w:cs="Times New Roman"/>
-          <w:szCs w:val="24"/>
-        </w:rPr>
-        <w:t xml:space="preserve"> </w:t>
-      </w:r>
-      <w:r>
-        <w:rPr>
-          <w:rFonts w:cs="Times New Roman"/>
-          <w:szCs w:val="24"/>
-        </w:rPr>
-        <w:t>Thus, for this project t</w:t>
-      </w:r>
-      <w:r>
-        <w:rPr>
-          <w:rFonts w:cs="Times New Roman"/>
-          <w:szCs w:val="24"/>
-        </w:rPr>
-        <w:t xml:space="preserve">he end user will be researchers (myself) using </w:t>
-      </w:r>
-      <w:r>
-        <w:rPr>
-          <w:rFonts w:cs="Times New Roman"/>
-          <w:szCs w:val="24"/>
-        </w:rPr>
-        <w:t>simulation</w:t>
-      </w:r>
-      <w:r>
-        <w:rPr>
-          <w:rFonts w:cs="Times New Roman"/>
-          <w:szCs w:val="24"/>
-        </w:rPr>
-        <w:t xml:space="preserve"> to conduct analysis on predatory evolution. </w:t>
-      </w:r>
-      <w:r>
-        <w:rPr>
-          <w:rFonts w:cs="Times New Roman"/>
-          <w:szCs w:val="24"/>
-        </w:rPr>
-        <w:t xml:space="preserve">The final output will be a simulation that mimics the evolution of Ambush and pursuit predators. </w:t>
+        <w:t xml:space="preserve">Full movement cycle for creatures including energy usage, updating </w:t>
+      </w:r>
+      <w:r>
+        <w:rPr>
+          <w:rFonts w:cs="Times New Roman"/>
+          <w:szCs w:val="24"/>
+        </w:rPr>
+        <w:t>objects</w:t>
+      </w:r>
+      <w:r>
+        <w:rPr>
+          <w:rFonts w:cs="Times New Roman"/>
+          <w:szCs w:val="24"/>
+        </w:rPr>
+        <w:t xml:space="preserve"> position, and environment decision making</w:t>
+      </w:r>
+    </w:p>
+    <w:p>
+      <w:pPr>
+        <w:spacing w:line="480" w:lineRule="auto"/>
+        <w:rPr>
+          <w:rFonts w:cs="Times New Roman"/>
+          <w:szCs w:val="24"/>
+        </w:rPr>
+      </w:pPr>
+      <w:r>
+        <w:rPr>
+          <w:rFonts w:cs="Times New Roman"/>
+          <w:szCs w:val="24"/>
+        </w:rPr>
+        <w:t xml:space="preserve">Milestone </w:t>
+      </w:r>
+      <w:r>
+        <w:rPr>
+          <w:rFonts w:cs="Times New Roman"/>
+          <w:szCs w:val="24"/>
+        </w:rPr>
+        <w:t>5</w:t>
+      </w:r>
+    </w:p>
+    <w:p>
+      <w:pPr>
+        <w:pStyle w:val="ListParagraph"/>
+        <w:numPr>
+          <w:ilvl w:val="0"/>
+          <w:numId w:val="9"/>
+        </w:numPr>
+        <w:spacing w:line="480" w:lineRule="auto"/>
+        <w:rPr>
+          <w:rFonts w:cs="Times New Roman"/>
+          <w:szCs w:val="24"/>
+        </w:rPr>
+      </w:pPr>
+      <w:r>
+        <w:rPr>
+          <w:rFonts w:cs="Times New Roman"/>
+          <w:szCs w:val="24"/>
+        </w:rPr>
+        <w:t>Rabbit class</w:t>
+      </w:r>
+    </w:p>
+    <w:p>
+      <w:pPr>
+        <w:pStyle w:val="ListParagraph"/>
+        <w:numPr>
+          <w:ilvl w:val="0"/>
+          <w:numId w:val="9"/>
+        </w:numPr>
+        <w:spacing w:line="480" w:lineRule="auto"/>
+        <w:rPr>
+          <w:rFonts w:cs="Times New Roman"/>
+          <w:szCs w:val="24"/>
+        </w:rPr>
+      </w:pPr>
+      <w:r>
+        <w:rPr>
+          <w:rFonts w:cs="Times New Roman"/>
+          <w:szCs w:val="24"/>
+        </w:rPr>
+        <w:t>Mice class</w:t>
+      </w:r>
+    </w:p>
+    <w:p>
+      <w:pPr>
+        <w:pStyle w:val="ListParagraph"/>
+        <w:numPr>
+          <w:ilvl w:val="0"/>
+          <w:numId w:val="9"/>
+        </w:numPr>
+        <w:spacing w:line="480" w:lineRule="auto"/>
+        <w:rPr>
+          <w:rFonts w:cs="Times New Roman"/>
+          <w:szCs w:val="24"/>
+        </w:rPr>
+      </w:pPr>
+      <w:r>
+        <w:rPr>
+          <w:rFonts w:cs="Times New Roman"/>
+          <w:szCs w:val="24"/>
+        </w:rPr>
+        <w:t>Bird class</w:t>
+      </w:r>
+    </w:p>
+    <w:p>
+      <w:pPr>
+        <w:spacing w:line="480" w:lineRule="auto"/>
+        <w:rPr>
+          <w:rFonts w:cs="Times New Roman"/>
+          <w:szCs w:val="24"/>
+        </w:rPr>
+      </w:pPr>
+      <w:r>
+        <w:rPr>
+          <w:rFonts w:cs="Times New Roman"/>
+          <w:szCs w:val="24"/>
+        </w:rPr>
+        <w:t xml:space="preserve">Milestone </w:t>
+      </w:r>
+      <w:r>
+        <w:rPr>
+          <w:rFonts w:cs="Times New Roman"/>
+          <w:szCs w:val="24"/>
+        </w:rPr>
+        <w:t>6</w:t>
+      </w:r>
+    </w:p>
+    <w:p>
+      <w:pPr>
+        <w:pStyle w:val="ListParagraph"/>
+        <w:numPr>
+          <w:ilvl w:val="0"/>
+          <w:numId w:val="10"/>
+        </w:numPr>
+        <w:spacing w:line="480" w:lineRule="auto"/>
+        <w:rPr>
+          <w:rFonts w:cs="Times New Roman"/>
+          <w:szCs w:val="24"/>
+        </w:rPr>
+      </w:pPr>
+      <w:r>
+        <w:rPr>
+          <w:rFonts w:cs="Times New Roman"/>
+          <w:szCs w:val="24"/>
+        </w:rPr>
+        <w:t>Predator class</w:t>
+      </w:r>
+    </w:p>
+    <w:p>
+      <w:pPr>
+        <w:spacing w:line="480" w:lineRule="auto"/>
+        <w:rPr>
+          <w:rFonts w:cs="Times New Roman"/>
+          <w:szCs w:val="24"/>
+        </w:rPr>
+      </w:pPr>
+      <w:r>
+        <w:rPr>
+          <w:rFonts w:cs="Times New Roman"/>
+          <w:szCs w:val="24"/>
+        </w:rPr>
+        <w:t xml:space="preserve">Milestone </w:t>
+      </w:r>
+      <w:r>
+        <w:rPr>
+          <w:rFonts w:cs="Times New Roman"/>
+          <w:szCs w:val="24"/>
+        </w:rPr>
+        <w:t>7</w:t>
+      </w:r>
+    </w:p>
+    <w:p>
+      <w:pPr>
+        <w:pStyle w:val="ListParagraph"/>
+        <w:numPr>
+          <w:ilvl w:val="0"/>
+          <w:numId w:val="10"/>
+        </w:numPr>
+        <w:spacing w:line="480" w:lineRule="auto"/>
+        <w:rPr>
+          <w:rFonts w:cs="Times New Roman"/>
+          <w:szCs w:val="24"/>
+        </w:rPr>
+      </w:pPr>
+      <w:r>
+        <w:rPr>
+          <w:rFonts w:cs="Times New Roman"/>
+          <w:szCs w:val="24"/>
+        </w:rPr>
+        <w:t>Simulation file</w:t>
+      </w:r>
+    </w:p>
+    <w:p>
+      <w:pPr>
+        <w:pStyle w:val="ListParagraph"/>
+        <w:numPr>
+          <w:ilvl w:val="0"/>
+          <w:numId w:val="10"/>
+        </w:numPr>
+        <w:spacing w:line="480" w:lineRule="auto"/>
+        <w:rPr>
+          <w:rFonts w:cs="Times New Roman"/>
+          <w:szCs w:val="24"/>
+        </w:rPr>
+      </w:pPr>
+      <w:r>
+        <w:rPr>
+          <w:rFonts w:cs="Times New Roman"/>
+          <w:szCs w:val="24"/>
+        </w:rPr>
+        <w:t>CSV with simulation testing results</w:t>
+      </w:r>
+    </w:p>
+    <w:p>
+      <w:pPr>
+        <w:spacing w:line="480" w:lineRule="auto"/>
+        <w:rPr>
+          <w:rFonts w:cs="Times New Roman"/>
+          <w:szCs w:val="24"/>
+        </w:rPr>
+      </w:pPr>
+      <w:r>
+        <w:rPr>
+          <w:rFonts w:cs="Times New Roman"/>
+          <w:szCs w:val="24"/>
+        </w:rPr>
+        <w:t xml:space="preserve">Milestone </w:t>
+      </w:r>
+      <w:r>
+        <w:rPr>
+          <w:rFonts w:cs="Times New Roman"/>
+          <w:szCs w:val="24"/>
+        </w:rPr>
+        <w:t>8</w:t>
+      </w:r>
+    </w:p>
+    <w:p>
+      <w:pPr>
+        <w:pStyle w:val="ListParagraph"/>
+        <w:numPr>
+          <w:ilvl w:val="0"/>
+          <w:numId w:val="11"/>
+        </w:numPr>
+        <w:spacing w:line="480" w:lineRule="auto"/>
+        <w:rPr>
+          <w:rFonts w:cs="Times New Roman"/>
+          <w:szCs w:val="24"/>
+        </w:rPr>
+      </w:pPr>
+      <w:r>
+        <w:rPr>
+          <w:rFonts w:cs="Times New Roman"/>
+          <w:szCs w:val="24"/>
+        </w:rPr>
+        <w:t>Final CSV that will be used for Analysis</w:t>
+      </w:r>
+    </w:p>
+    <w:p>
+      <w:pPr>
+        <w:spacing w:line="480" w:lineRule="auto"/>
+        <w:rPr>
+          <w:rFonts w:cs="Times New Roman"/>
+          <w:szCs w:val="24"/>
+        </w:rPr>
+      </w:pPr>
+      <w:r>
+        <w:rPr>
+          <w:rFonts w:cs="Times New Roman"/>
+          <w:szCs w:val="24"/>
+        </w:rPr>
+        <w:t xml:space="preserve">Milestone </w:t>
+      </w:r>
+      <w:r>
+        <w:rPr>
+          <w:rFonts w:cs="Times New Roman"/>
+          <w:szCs w:val="24"/>
+        </w:rPr>
+        <w:t>9</w:t>
+      </w:r>
+    </w:p>
+    <w:p>
+      <w:pPr>
+        <w:pStyle w:val="ListParagraph"/>
+        <w:numPr>
+          <w:ilvl w:val="0"/>
+          <w:numId w:val="11"/>
+        </w:numPr>
+        <w:spacing w:line="480" w:lineRule="auto"/>
+        <w:rPr>
+          <w:rFonts w:cs="Times New Roman"/>
+          <w:szCs w:val="24"/>
+        </w:rPr>
+      </w:pPr>
+      <w:r>
+        <w:rPr>
+          <w:rFonts w:cs="Times New Roman"/>
+          <w:szCs w:val="24"/>
+        </w:rPr>
+        <w:t>Data visualization in excel</w:t>
+      </w:r>
+    </w:p>
+    <w:p>
+      <w:pPr>
+        <w:pStyle w:val="ListParagraph"/>
+        <w:numPr>
+          <w:ilvl w:val="0"/>
+          <w:numId w:val="11"/>
+        </w:numPr>
+        <w:spacing w:line="480" w:lineRule="auto"/>
+        <w:rPr>
+          <w:rFonts w:cs="Times New Roman"/>
+          <w:szCs w:val="24"/>
+        </w:rPr>
+      </w:pPr>
+      <w:r>
+        <w:rPr>
+          <w:rFonts w:cs="Times New Roman"/>
+          <w:szCs w:val="24"/>
+        </w:rPr>
+        <w:t>Partial report with conclusions</w:t>
+      </w:r>
+    </w:p>
+    <w:p>
+      <w:pPr>
+        <w:spacing w:line="480" w:lineRule="auto"/>
+        <w:rPr>
+          <w:rFonts w:cs="Times New Roman"/>
+          <w:szCs w:val="24"/>
+        </w:rPr>
+      </w:pPr>
+      <w:r>
+        <w:rPr>
+          <w:rFonts w:cs="Times New Roman"/>
+          <w:szCs w:val="24"/>
+        </w:rPr>
+        <w:t>Milestone 1</w:t>
+      </w:r>
+      <w:r>
+        <w:rPr>
+          <w:rFonts w:cs="Times New Roman"/>
+          <w:szCs w:val="24"/>
+        </w:rPr>
+        <w:t>0</w:t>
+      </w:r>
+    </w:p>
+    <w:p>
+      <w:pPr>
+        <w:pStyle w:val="ListParagraph"/>
+        <w:numPr>
+          <w:ilvl w:val="0"/>
+          <w:numId w:val="12"/>
+        </w:numPr>
+        <w:spacing w:line="480" w:lineRule="auto"/>
+        <w:rPr>
+          <w:rFonts w:cs="Times New Roman"/>
+          <w:szCs w:val="24"/>
+        </w:rPr>
+      </w:pPr>
+      <w:r>
+        <w:rPr>
+          <w:rFonts w:cs="Times New Roman"/>
+          <w:szCs w:val="24"/>
+        </w:rPr>
+        <w:t>Final paper</w:t>
+      </w:r>
+    </w:p>
+    <w:p>
+      <w:pPr>
+        <w:pStyle w:val="ListParagraph"/>
+        <w:numPr>
+          <w:ilvl w:val="0"/>
+          <w:numId w:val="12"/>
+        </w:numPr>
+        <w:spacing w:line="480" w:lineRule="auto"/>
+        <w:rPr>
+          <w:rFonts w:cs="Times New Roman"/>
+          <w:szCs w:val="24"/>
+        </w:rPr>
+      </w:pPr>
+      <w:r>
+        <w:rPr>
+          <w:rFonts w:cs="Times New Roman"/>
+          <w:szCs w:val="24"/>
+        </w:rPr>
+        <w:t>Final presentation</w:t>
+      </w:r>
+    </w:p>
+    <w:p>
+      <w:pPr>
+        <w:pStyle w:val="ListParagraph"/>
+        <w:numPr>
+          <w:ilvl w:val="0"/>
+          <w:numId w:val="12"/>
+        </w:numPr>
+        <w:spacing w:line="480" w:lineRule="auto"/>
+        <w:rPr>
+          <w:rFonts w:cs="Times New Roman"/>
+          <w:szCs w:val="24"/>
+        </w:rPr>
+      </w:pPr>
+      <w:r>
+        <w:rPr>
+          <w:rFonts w:cs="Times New Roman"/>
+          <w:szCs w:val="24"/>
+        </w:rPr>
+        <w:t>Final zip file with full project</w:t>
       </w:r>
     </w:p>
     <w:p>
@@ -1105,6 +3087,7 @@
         <w:rPr>
           <w:noProof/>
         </w:rPr>
+        <w:lastRenderedPageBreak/>
         <w:drawing>
           <wp:inline distT="0" distB="0" distL="0" distR="0" wp14:anchorId="095C4BE8" wp14:editId="445D13F9">
             <wp:extent cx="5943600" cy="3434080"/>
@@ -1205,20 +3188,40 @@
       </w:pPr>
       <w:proofErr w:type="spellStart"/>
       <w:r>
-        <w:rPr>
-          <w:rFonts w:cs="Times New Roman"/>
-          <w:szCs w:val="24"/>
-        </w:rPr>
         <w:t>Allesina</w:t>
       </w:r>
       <w:proofErr w:type="spellEnd"/>
       <w:r>
-        <w:rPr>
-          <w:rFonts w:cs="Times New Roman"/>
-          <w:szCs w:val="24"/>
-        </w:rPr>
-        <w:t>, Stefano, and Si Tang. 2012. “Stability Criteria for Complex Ecosystems.” Nature 483(7388):205–8. doi:10.1038/nature10832.</w:t>
-      </w:r>
+        <w:t xml:space="preserve">, S., &amp; Tang, S. (2012). Stability criteria for complex ecosystems. </w:t>
+      </w:r>
+      <w:r>
+        <w:rPr>
+          <w:i/>
+          <w:iCs/>
+        </w:rPr>
+        <w:t>Nature</w:t>
+      </w:r>
+      <w:r>
+        <w:t xml:space="preserve">, </w:t>
+      </w:r>
+      <w:r>
+        <w:rPr>
+          <w:i/>
+          <w:iCs/>
+        </w:rPr>
+        <w:t>483</w:t>
+      </w:r>
+      <w:r>
+        <w:t xml:space="preserve">(7388), 205–208. </w:t>
+      </w:r>
+      <w:hyperlink r:id="rId10" w:history="1">
+        <w:r>
+          <w:rPr>
+            <w:rStyle w:val="Hyperlink"/>
+          </w:rPr>
+          <w:t>https://doi.org/10.1038/nature10832</w:t>
+        </w:r>
+      </w:hyperlink>
     </w:p>
     <w:p>
       <w:pPr>
@@ -1245,19 +3248,38 @@
           <w:numId w:val="3"/>
         </w:numPr>
         <w:spacing w:line="480" w:lineRule="auto"/>
-        <w:rPr>
-          <w:rFonts w:cs="Times New Roman"/>
-          <w:szCs w:val="24"/>
-        </w:rPr>
-      </w:pPr>
-      <w:r>
-        <w:rPr>
-          <w:rFonts w:cs="Times New Roman"/>
-          <w:szCs w:val="24"/>
-        </w:rPr>
-        <w:lastRenderedPageBreak/>
-        <w:t>Atmar, W. 1994. “Notes on the Simulation of Evolution.” IEEE Transactions on Neural Networks 5(1):130–47. doi:10.1109/72.265967.</w:t>
-      </w:r>
+      </w:pPr>
+      <w:r>
+        <w:t xml:space="preserve">Atmar, W. (1994). Notes on the simulation of evolution. </w:t>
+      </w:r>
+      <w:r>
+        <w:rPr>
+          <w:i/>
+          <w:iCs/>
+        </w:rPr>
+        <w:t>IEEE Transactions on Neural Networks</w:t>
+      </w:r>
+      <w:r>
+        <w:t xml:space="preserve">, </w:t>
+      </w:r>
+      <w:r>
+        <w:rPr>
+          <w:i/>
+          <w:iCs/>
+        </w:rPr>
+        <w:t>5</w:t>
+      </w:r>
+      <w:r>
+        <w:t xml:space="preserve">(1), 130–147. </w:t>
+      </w:r>
+      <w:hyperlink r:id="rId11" w:history="1">
+        <w:r>
+          <w:rPr>
+            <w:rStyle w:val="Hyperlink"/>
+          </w:rPr>
+          <w:t>https://doi.org/10.1109/72.265967</w:t>
+        </w:r>
+      </w:hyperlink>
     </w:p>
     <w:p>
       <w:pPr>
@@ -1314,34 +3336,41 @@
           <w:numId w:val="3"/>
         </w:numPr>
         <w:spacing w:line="480" w:lineRule="auto"/>
-        <w:rPr>
-          <w:rFonts w:cs="Times New Roman"/>
-          <w:szCs w:val="24"/>
-        </w:rPr>
-      </w:pPr>
-      <w:r>
-        <w:rPr>
-          <w:rFonts w:cs="Times New Roman"/>
-          <w:szCs w:val="24"/>
-        </w:rPr>
-        <w:t xml:space="preserve">Michalko, Radek, and Stano Pekár. 2016. “Different Hunting Strategies of Generalist Predators Result in Functional Differences.” </w:t>
+      </w:pPr>
+      <w:r>
+        <w:lastRenderedPageBreak/>
+        <w:t xml:space="preserve">Michalko, R., &amp; Pekár, S. (2016). Different hunting strategies of generalist predators result in functional differences. </w:t>
       </w:r>
       <w:proofErr w:type="spellStart"/>
       <w:r>
         <w:rPr>
-          <w:rFonts w:cs="Times New Roman"/>
-          <w:szCs w:val="24"/>
+          <w:i/>
+          <w:iCs/>
         </w:rPr>
         <w:t>Oecologia</w:t>
       </w:r>
       <w:proofErr w:type="spellEnd"/>
       <w:r>
-        <w:rPr>
-          <w:rFonts w:cs="Times New Roman"/>
-          <w:szCs w:val="24"/>
-        </w:rPr>
-        <w:t xml:space="preserve"> 181(4):1187–97. doi:10.1007/s00442-016-3631-4.</w:t>
-      </w:r>
+        <w:t xml:space="preserve">, </w:t>
+      </w:r>
+      <w:r>
+        <w:rPr>
+          <w:i/>
+          <w:iCs/>
+        </w:rPr>
+        <w:t>181</w:t>
+      </w:r>
+      <w:r>
+        <w:t xml:space="preserve">(4), 1187–1197. </w:t>
+      </w:r>
+      <w:hyperlink r:id="rId12" w:history="1">
+        <w:r>
+          <w:rPr>
+            <w:rStyle w:val="Hyperlink"/>
+          </w:rPr>
+          <w:t>https://doi.org/10.1007/s00442-016-3631-4</w:t>
+        </w:r>
+      </w:hyperlink>
     </w:p>
     <w:p>
       <w:pPr>
@@ -1368,66 +3397,63 @@
           <w:numId w:val="3"/>
         </w:numPr>
         <w:spacing w:line="480" w:lineRule="auto"/>
-        <w:rPr>
-          <w:rFonts w:cs="Times New Roman"/>
-          <w:szCs w:val="24"/>
-        </w:rPr>
-      </w:pPr>
-      <w:r>
-        <w:rPr>
-          <w:rFonts w:cs="Times New Roman"/>
-          <w:szCs w:val="24"/>
-        </w:rPr>
-        <w:t xml:space="preserve">Murray, Dennis L., Stan Boutin, Mark O’Donoghue, and Vilis O. </w:t>
+      </w:pPr>
+      <w:r>
+        <w:t xml:space="preserve">Murray, D. L., Boutin, S., O’Donoghue, M., &amp; </w:t>
       </w:r>
       <w:proofErr w:type="spellStart"/>
       <w:r>
-        <w:rPr>
-          <w:rFonts w:cs="Times New Roman"/>
-          <w:szCs w:val="24"/>
-        </w:rPr>
         <w:t>Nams</w:t>
       </w:r>
       <w:proofErr w:type="spellEnd"/>
       <w:r>
-        <w:rPr>
-          <w:rFonts w:cs="Times New Roman"/>
-          <w:szCs w:val="24"/>
-        </w:rPr>
-        <w:t xml:space="preserve">. 1995. “Hunting </w:t>
+        <w:t xml:space="preserve">, V. O. (1995). Hunting </w:t>
       </w:r>
       <w:proofErr w:type="spellStart"/>
       <w:r>
-        <w:rPr>
-          <w:rFonts w:cs="Times New Roman"/>
-          <w:szCs w:val="24"/>
+        <w:t>behaviour</w:t>
+      </w:r>
+      <w:proofErr w:type="spellEnd"/>
+      <w:r>
+        <w:t xml:space="preserve"> of a sympatric felid and canid in relation to vegetative cover. </w:t>
+      </w:r>
+      <w:r>
+        <w:rPr>
+          <w:i/>
+          <w:iCs/>
+        </w:rPr>
+        <w:t xml:space="preserve">Animal </w:t>
+      </w:r>
+      <w:proofErr w:type="spellStart"/>
+      <w:r>
+        <w:rPr>
+          <w:i/>
+          <w:iCs/>
         </w:rPr>
         <w:t>Behaviour</w:t>
       </w:r>
       <w:proofErr w:type="spellEnd"/>
       <w:r>
-        <w:rPr>
-          <w:rFonts w:cs="Times New Roman"/>
-          <w:szCs w:val="24"/>
-        </w:rPr>
-        <w:t xml:space="preserve"> of a Sympatric Felid and Canid in Relation to Vegetative Cover.” Animal </w:t>
-      </w:r>
-      <w:proofErr w:type="spellStart"/>
-      <w:r>
-        <w:rPr>
-          <w:rFonts w:cs="Times New Roman"/>
-          <w:szCs w:val="24"/>
-        </w:rPr>
-        <w:t>Behaviour</w:t>
-      </w:r>
-      <w:proofErr w:type="spellEnd"/>
-      <w:r>
-        <w:rPr>
-          <w:rFonts w:cs="Times New Roman"/>
-          <w:szCs w:val="24"/>
-        </w:rPr>
-        <w:t xml:space="preserve"> 50(5):1203–10. doi:10.1016/0003-3472(95)80037-9.</w:t>
-      </w:r>
+        <w:t xml:space="preserve">, </w:t>
+      </w:r>
+      <w:r>
+        <w:rPr>
+          <w:i/>
+          <w:iCs/>
+        </w:rPr>
+        <w:t>50</w:t>
+      </w:r>
+      <w:r>
+        <w:t xml:space="preserve">(5), 1203–1210. </w:t>
+      </w:r>
+      <w:hyperlink r:id="rId13" w:history="1">
+        <w:r>
+          <w:rPr>
+            <w:rStyle w:val="Hyperlink"/>
+          </w:rPr>
+          <w:t>https://doi.org/10.1016/0003-3472(95)80037-9</w:t>
+        </w:r>
+      </w:hyperlink>
     </w:p>
     <w:p>
       <w:pPr>
@@ -1452,23 +3478,28 @@
           <w:rFonts w:cs="Times New Roman"/>
           <w:szCs w:val="24"/>
         </w:rPr>
-        <w:t xml:space="preserve">This source acts as the main inspiration for this project. The source highlights how two animals in the same environment hunting the same prey can use the environment in completely different ways. For this source it looks at coyotes and lynxes hunting use of vegetation cover when hunting. However, it also highlights the strategies that </w:t>
-      </w:r>
-      <w:proofErr w:type="gramStart"/>
-      <w:r>
-        <w:rPr>
-          <w:rFonts w:cs="Times New Roman"/>
-          <w:szCs w:val="24"/>
-        </w:rPr>
-        <w:t>both use</w:t>
-      </w:r>
-      <w:proofErr w:type="gramEnd"/>
-      <w:r>
-        <w:rPr>
-          <w:rFonts w:cs="Times New Roman"/>
-          <w:szCs w:val="24"/>
-        </w:rPr>
-        <w:t xml:space="preserve"> when hunting. Coyotes use a method of pursuit hunting while lynxes use a method of ambush hunting. While not the main point of the paper it does go into detail about the two strategies and how they </w:t>
+        <w:t>This source acts as the main inspiration for this project. The source highlights how two animals in the same environment hunting the same prey can use the environment in completely different ways. For this source it looks at coyotes and lynxes hunting use of vegetation cover when hunting. However, it also highlights the strategies that both</w:t>
+      </w:r>
+      <w:r>
+        <w:rPr>
+          <w:rFonts w:cs="Times New Roman"/>
+          <w:szCs w:val="24"/>
+        </w:rPr>
+        <w:t xml:space="preserve"> </w:t>
+      </w:r>
+      <w:r>
+        <w:rPr>
+          <w:rFonts w:cs="Times New Roman"/>
+          <w:szCs w:val="24"/>
+        </w:rPr>
+        <w:t>creatures</w:t>
+      </w:r>
+      <w:r>
+        <w:rPr>
+          <w:rFonts w:cs="Times New Roman"/>
+          <w:szCs w:val="24"/>
+        </w:rPr>
+        <w:t xml:space="preserve"> use when hunting. Coyotes use a method of pursuit hunting while lynxes use a method of ambush hunting. While not the main point of the paper it does go into detail about the two strategies and how they </w:t>
       </w:r>
       <w:r>
         <w:rPr>
@@ -1482,15 +3513,7 @@
           <w:rFonts w:cs="Times New Roman"/>
           <w:szCs w:val="24"/>
         </w:rPr>
-        <w:t xml:space="preserve"> the catch </w:t>
-      </w:r>
-      <w:r>
-        <w:rPr>
-          <w:rFonts w:cs="Times New Roman"/>
-          <w:szCs w:val="24"/>
-        </w:rPr>
-        <w:lastRenderedPageBreak/>
-        <w:t xml:space="preserve">rates for each predator. </w:t>
+        <w:t xml:space="preserve"> the catch rates for each predator. </w:t>
       </w:r>
       <w:r>
         <w:rPr>
@@ -1522,34 +3545,46 @@
           <w:numId w:val="3"/>
         </w:numPr>
         <w:spacing w:line="480" w:lineRule="auto"/>
-        <w:rPr>
-          <w:rFonts w:cs="Times New Roman"/>
-          <w:szCs w:val="24"/>
-        </w:rPr>
-      </w:pPr>
-      <w:r>
-        <w:rPr>
-          <w:rFonts w:cs="Times New Roman"/>
-          <w:szCs w:val="24"/>
-        </w:rPr>
-        <w:t xml:space="preserve">Netz, Christoph, Hanno Hildenbrandt, and Franz J. </w:t>
+      </w:pPr>
+      <w:r>
+        <w:t xml:space="preserve">Netz, C., Hildenbrandt, H., &amp; </w:t>
       </w:r>
       <w:proofErr w:type="spellStart"/>
       <w:r>
-        <w:rPr>
-          <w:rFonts w:cs="Times New Roman"/>
-          <w:szCs w:val="24"/>
-        </w:rPr>
         <w:t>Weissing</w:t>
       </w:r>
       <w:proofErr w:type="spellEnd"/>
       <w:r>
-        <w:rPr>
-          <w:rFonts w:cs="Times New Roman"/>
-          <w:szCs w:val="24"/>
-        </w:rPr>
-        <w:t>. 2022. “Complex Eco-Evolutionary Dynamics Induced by the Coevolution of Predator–Prey Movement Strategies.” Evolutionary Ecology 36(1):1–17. doi:10.1007/s10682-021-10140-x.</w:t>
-      </w:r>
+        <w:t xml:space="preserve">, F. J. (2022). Complex eco-evolutionary dynamics induced by the coevolution of predator–prey movement strategies. </w:t>
+      </w:r>
+      <w:r>
+        <w:rPr>
+          <w:i/>
+          <w:iCs/>
+        </w:rPr>
+        <w:t>Evolutionary Ecology</w:t>
+      </w:r>
+      <w:r>
+        <w:t xml:space="preserve">, </w:t>
+      </w:r>
+      <w:r>
+        <w:rPr>
+          <w:i/>
+          <w:iCs/>
+        </w:rPr>
+        <w:t>36</w:t>
+      </w:r>
+      <w:r>
+        <w:t xml:space="preserve">(1), 1–17. </w:t>
+      </w:r>
+      <w:hyperlink r:id="rId14" w:history="1">
+        <w:r>
+          <w:rPr>
+            <w:rStyle w:val="Hyperlink"/>
+          </w:rPr>
+          <w:t>https://doi.org/10.1007/s10682-021-10140-x</w:t>
+        </w:r>
+      </w:hyperlink>
     </w:p>
     <w:p>
       <w:pPr>
@@ -1565,6 +3600,7 @@
           <w:rFonts w:cs="Times New Roman"/>
           <w:szCs w:val="24"/>
         </w:rPr>
+        <w:lastRenderedPageBreak/>
         <w:t xml:space="preserve">This source acts as the main simulation reference when building out the plans for this project’s simulation. The study looks at movement/pathfinding algorithms for predator-prey simulations. The main finding of the study was a statistical pathfinding algorithm that looks at each of the available cells a creature can move to and assign them a weight to calculate the best move for a creature </w:t>
       </w:r>
       <w:r>
@@ -1581,15 +3617,13 @@
         </w:rPr>
         <w:t xml:space="preserve"> make. For this project, the study is going to act as a reference for the </w:t>
       </w:r>
-      <w:proofErr w:type="gramStart"/>
-      <w:r>
-        <w:rPr>
-          <w:rFonts w:cs="Times New Roman"/>
-          <w:szCs w:val="24"/>
-        </w:rPr>
-        <w:t>pathfinding</w:t>
-      </w:r>
-      <w:proofErr w:type="gramEnd"/>
+      <w:r>
+        <w:rPr>
+          <w:rFonts w:cs="Times New Roman"/>
+          <w:szCs w:val="24"/>
+        </w:rPr>
+        <w:t>path finding</w:t>
+      </w:r>
       <w:r>
         <w:rPr>
           <w:rFonts w:cs="Times New Roman"/>
@@ -1835,7 +3869,7 @@
         </w:rPr>
         <w:t xml:space="preserve">Backup: </w:t>
       </w:r>
-      <w:hyperlink r:id="rId10" w:history="1">
+      <w:hyperlink r:id="rId15" w:history="1">
         <w:r>
           <w:rPr>
             <w:rStyle w:val="Hyperlink"/>
@@ -2071,7 +4105,7 @@
           <w:szCs w:val="24"/>
         </w:rPr>
       </w:pPr>
-      <w:hyperlink r:id="rId11" w:history="1">
+      <w:hyperlink r:id="rId16" w:history="1">
         <w:r>
           <w:rPr>
             <w:rStyle w:val="Hyperlink"/>
@@ -2102,7 +4136,7 @@
           <w:szCs w:val="24"/>
         </w:rPr>
       </w:pPr>
-      <w:hyperlink r:id="rId12" w:history="1">
+      <w:hyperlink r:id="rId17" w:history="1">
         <w:r>
           <w:rPr>
             <w:rStyle w:val="Hyperlink"/>
@@ -2133,7 +4167,7 @@
           <w:szCs w:val="24"/>
         </w:rPr>
       </w:pPr>
-      <w:hyperlink r:id="rId13" w:history="1">
+      <w:hyperlink r:id="rId18" w:history="1">
         <w:r>
           <w:rPr>
             <w:rStyle w:val="Hyperlink"/>
@@ -2164,7 +4198,7 @@
           <w:szCs w:val="24"/>
         </w:rPr>
       </w:pPr>
-      <w:hyperlink r:id="rId14" w:history="1">
+      <w:hyperlink r:id="rId19" w:history="1">
         <w:proofErr w:type="spellStart"/>
         <w:r>
           <w:rPr>
@@ -2197,7 +4231,7 @@
           <w:szCs w:val="24"/>
         </w:rPr>
       </w:pPr>
-      <w:hyperlink r:id="rId15" w:history="1">
+      <w:hyperlink r:id="rId20" w:history="1">
         <w:r>
           <w:rPr>
             <w:rStyle w:val="Hyperlink"/>
@@ -2218,10 +4252,762 @@
     <w:p>
       <w:pPr>
         <w:spacing w:line="480" w:lineRule="auto"/>
+        <w:rPr>
+          <w:rFonts w:cs="Times New Roman"/>
+          <w:b/>
+          <w:bCs/>
+          <w:szCs w:val="24"/>
+        </w:rPr>
+      </w:pPr>
+      <w:r>
+        <w:rPr>
+          <w:rFonts w:cs="Times New Roman"/>
+          <w:b/>
+          <w:bCs/>
+          <w:szCs w:val="24"/>
+        </w:rPr>
+        <w:lastRenderedPageBreak/>
+        <w:t>Simulation Evaluation Criteria</w:t>
+      </w:r>
+    </w:p>
+    <w:p>
+      <w:pPr>
+        <w:spacing w:line="480" w:lineRule="auto"/>
+        <w:rPr>
+          <w:rFonts w:cs="Times New Roman"/>
+          <w:b/>
+          <w:bCs/>
+          <w:i/>
+          <w:iCs/>
+          <w:szCs w:val="24"/>
+        </w:rPr>
+      </w:pPr>
+      <w:r>
+        <w:rPr>
+          <w:rFonts w:cs="Times New Roman"/>
+          <w:b/>
+          <w:bCs/>
+          <w:i/>
+          <w:iCs/>
+          <w:szCs w:val="24"/>
+        </w:rPr>
+        <w:t>C</w:t>
+      </w:r>
+      <w:r>
+        <w:rPr>
+          <w:rFonts w:cs="Times New Roman"/>
+          <w:b/>
+          <w:bCs/>
+          <w:i/>
+          <w:iCs/>
+          <w:szCs w:val="24"/>
+        </w:rPr>
+        <w:t xml:space="preserve">onvergence </w:t>
+      </w:r>
+      <w:r>
+        <w:rPr>
+          <w:rFonts w:cs="Times New Roman"/>
+          <w:b/>
+          <w:bCs/>
+          <w:i/>
+          <w:iCs/>
+          <w:szCs w:val="24"/>
+        </w:rPr>
+        <w:t>M</w:t>
+      </w:r>
+      <w:r>
+        <w:rPr>
+          <w:rFonts w:cs="Times New Roman"/>
+          <w:b/>
+          <w:bCs/>
+          <w:i/>
+          <w:iCs/>
+          <w:szCs w:val="24"/>
+        </w:rPr>
+        <w:t>etrics</w:t>
+      </w:r>
+    </w:p>
+    <w:p>
+      <w:pPr>
+        <w:spacing w:line="480" w:lineRule="auto"/>
+        <w:ind w:firstLine="720"/>
+        <w:rPr>
+          <w:rFonts w:cs="Times New Roman"/>
+          <w:szCs w:val="24"/>
+        </w:rPr>
+      </w:pPr>
+      <w:r>
+        <w:rPr>
+          <w:rFonts w:cs="Times New Roman"/>
+          <w:szCs w:val="24"/>
+        </w:rPr>
+        <w:t xml:space="preserve">This project is to use </w:t>
+      </w:r>
+      <w:r>
+        <w:rPr>
+          <w:rFonts w:cs="Times New Roman"/>
+          <w:szCs w:val="24"/>
+        </w:rPr>
+        <w:t>Bayesian inference</w:t>
+      </w:r>
+      <w:r>
+        <w:rPr>
+          <w:rFonts w:cs="Times New Roman"/>
+          <w:szCs w:val="24"/>
+        </w:rPr>
+        <w:t xml:space="preserve"> models to justify </w:t>
+      </w:r>
+      <w:r>
+        <w:rPr>
+          <w:rFonts w:cs="Times New Roman"/>
+          <w:szCs w:val="24"/>
+        </w:rPr>
+        <w:t>convergence metrics</w:t>
+      </w:r>
+      <w:r>
+        <w:rPr>
+          <w:rFonts w:cs="Times New Roman"/>
+          <w:szCs w:val="24"/>
+        </w:rPr>
+        <w:t xml:space="preserve"> of the simulation. This will be done by judging the closeness of the current generation stats vs previous generation. </w:t>
+      </w:r>
+    </w:p>
+    <w:p>
+      <w:pPr>
+        <w:spacing w:line="480" w:lineRule="auto"/>
+        <w:rPr>
+          <w:rFonts w:cs="Times New Roman"/>
+          <w:b/>
+          <w:bCs/>
+          <w:i/>
+          <w:iCs/>
+          <w:szCs w:val="24"/>
+        </w:rPr>
+      </w:pPr>
+      <w:r>
+        <w:rPr>
+          <w:rFonts w:cs="Times New Roman"/>
+          <w:b/>
+          <w:bCs/>
+          <w:i/>
+          <w:iCs/>
+          <w:szCs w:val="24"/>
+        </w:rPr>
+        <w:t>P</w:t>
+      </w:r>
+      <w:r>
+        <w:rPr>
+          <w:rFonts w:cs="Times New Roman"/>
+          <w:b/>
+          <w:bCs/>
+          <w:i/>
+          <w:iCs/>
+          <w:szCs w:val="24"/>
+        </w:rPr>
+        <w:t xml:space="preserve">redator </w:t>
+      </w:r>
+      <w:r>
+        <w:rPr>
+          <w:rFonts w:cs="Times New Roman"/>
+          <w:b/>
+          <w:bCs/>
+          <w:i/>
+          <w:iCs/>
+          <w:szCs w:val="24"/>
+        </w:rPr>
+        <w:t>F</w:t>
+      </w:r>
+      <w:r>
+        <w:rPr>
+          <w:rFonts w:cs="Times New Roman"/>
+          <w:b/>
+          <w:bCs/>
+          <w:i/>
+          <w:iCs/>
+          <w:szCs w:val="24"/>
+        </w:rPr>
+        <w:t xml:space="preserve">itness </w:t>
+      </w:r>
+      <w:r>
+        <w:rPr>
+          <w:rFonts w:cs="Times New Roman"/>
+          <w:b/>
+          <w:bCs/>
+          <w:i/>
+          <w:iCs/>
+          <w:szCs w:val="24"/>
+        </w:rPr>
+        <w:t>M</w:t>
+      </w:r>
+      <w:r>
+        <w:rPr>
+          <w:rFonts w:cs="Times New Roman"/>
+          <w:b/>
+          <w:bCs/>
+          <w:i/>
+          <w:iCs/>
+          <w:szCs w:val="24"/>
+        </w:rPr>
+        <w:t>easurements</w:t>
+      </w:r>
+    </w:p>
+    <w:p>
+      <w:pPr>
+        <w:spacing w:line="480" w:lineRule="auto"/>
+        <w:ind w:firstLine="720"/>
+        <w:rPr>
+          <w:rFonts w:cs="Times New Roman"/>
+          <w:szCs w:val="24"/>
+        </w:rPr>
+      </w:pPr>
+      <w:r>
+        <w:rPr>
+          <w:rFonts w:cs="Times New Roman"/>
+          <w:szCs w:val="24"/>
+        </w:rPr>
+        <w:t xml:space="preserve">This project will only have one true fitness measurement for predators. That being whether the predator caught prey or not in that generation. Predators that caught prey </w:t>
+      </w:r>
+      <w:r>
+        <w:rPr>
+          <w:rFonts w:cs="Times New Roman"/>
+          <w:szCs w:val="24"/>
+        </w:rPr>
+        <w:t>will</w:t>
+      </w:r>
+      <w:r>
+        <w:rPr>
+          <w:rFonts w:cs="Times New Roman"/>
+          <w:szCs w:val="24"/>
+        </w:rPr>
+        <w:t xml:space="preserve"> move onto the next generation with the ability to reproduce 0-2 offspring. After the simulation/during analysis seconder measures such as focus stats (stealth for ambush predators &amp; stamina for pursuit predators)</w:t>
+      </w:r>
+      <w:r>
+        <w:rPr>
+          <w:rFonts w:cs="Times New Roman"/>
+          <w:szCs w:val="24"/>
+        </w:rPr>
+        <w:t xml:space="preserve"> will be used measure how close the predator was to its hunting strategy architype</w:t>
+      </w:r>
+      <w:r>
+        <w:rPr>
+          <w:rFonts w:cs="Times New Roman"/>
+          <w:szCs w:val="24"/>
+        </w:rPr>
+        <w:t xml:space="preserve">. </w:t>
+      </w:r>
+      <w:r>
+        <w:rPr>
+          <w:rFonts w:cs="Times New Roman"/>
+          <w:szCs w:val="24"/>
+        </w:rPr>
+        <w:t>These stats will also be used to create payoff functions for each hunting strategy</w:t>
+      </w:r>
+    </w:p>
+    <w:p>
+      <w:pPr>
+        <w:spacing w:line="480" w:lineRule="auto"/>
+        <w:rPr>
+          <w:rFonts w:cs="Times New Roman"/>
+          <w:b/>
+          <w:bCs/>
+          <w:i/>
+          <w:iCs/>
+          <w:szCs w:val="24"/>
+        </w:rPr>
+      </w:pPr>
+      <w:r>
+        <w:rPr>
+          <w:rFonts w:cs="Times New Roman"/>
+          <w:b/>
+          <w:bCs/>
+          <w:i/>
+          <w:iCs/>
+          <w:szCs w:val="24"/>
+        </w:rPr>
+        <w:t>S</w:t>
+      </w:r>
+      <w:r>
+        <w:rPr>
+          <w:rFonts w:cs="Times New Roman"/>
+          <w:b/>
+          <w:bCs/>
+          <w:i/>
+          <w:iCs/>
+          <w:szCs w:val="24"/>
+        </w:rPr>
+        <w:t xml:space="preserve">tatistical </w:t>
+      </w:r>
+      <w:r>
+        <w:rPr>
+          <w:rFonts w:cs="Times New Roman"/>
+          <w:b/>
+          <w:bCs/>
+          <w:i/>
+          <w:iCs/>
+          <w:szCs w:val="24"/>
+        </w:rPr>
+        <w:t>C</w:t>
+      </w:r>
+      <w:r>
+        <w:rPr>
+          <w:rFonts w:cs="Times New Roman"/>
+          <w:b/>
+          <w:bCs/>
+          <w:i/>
+          <w:iCs/>
+          <w:szCs w:val="24"/>
+        </w:rPr>
+        <w:t xml:space="preserve">omparison </w:t>
+      </w:r>
+      <w:r>
+        <w:rPr>
+          <w:rFonts w:cs="Times New Roman"/>
+          <w:b/>
+          <w:bCs/>
+          <w:i/>
+          <w:iCs/>
+          <w:szCs w:val="24"/>
+        </w:rPr>
+        <w:t>M</w:t>
+      </w:r>
+      <w:r>
+        <w:rPr>
+          <w:rFonts w:cs="Times New Roman"/>
+          <w:b/>
+          <w:bCs/>
+          <w:i/>
+          <w:iCs/>
+          <w:szCs w:val="24"/>
+        </w:rPr>
+        <w:t>ethods</w:t>
+      </w:r>
+    </w:p>
+    <w:p>
+      <w:pPr>
+        <w:spacing w:line="480" w:lineRule="auto"/>
+        <w:ind w:firstLine="720"/>
+        <w:rPr>
+          <w:rFonts w:cs="Times New Roman"/>
+          <w:szCs w:val="24"/>
+        </w:rPr>
+      </w:pPr>
+      <w:r>
+        <w:rPr>
+          <w:rFonts w:cs="Times New Roman"/>
+          <w:szCs w:val="24"/>
+        </w:rPr>
+        <w:t xml:space="preserve">The main method that will be used for statistical </w:t>
+      </w:r>
+      <w:r>
+        <w:rPr>
+          <w:rFonts w:cs="Times New Roman"/>
+          <w:szCs w:val="24"/>
+        </w:rPr>
+        <w:t>comparison</w:t>
+      </w:r>
+      <w:r>
+        <w:rPr>
+          <w:rFonts w:cs="Times New Roman"/>
+          <w:szCs w:val="24"/>
+        </w:rPr>
+        <w:t xml:space="preserve"> is payoff functions built off the data of the final generation from a simulation. These functions will provide a statistical metric of how a hunting strategy did compared to the other for each prey item.</w:t>
+      </w:r>
+      <w:r>
+        <w:rPr>
+          <w:rFonts w:cs="Times New Roman"/>
+          <w:szCs w:val="24"/>
+        </w:rPr>
+        <w:t xml:space="preserve"> </w:t>
+      </w:r>
+    </w:p>
+    <w:p>
+      <w:pPr>
+        <w:spacing w:line="480" w:lineRule="auto"/>
+        <w:rPr>
+          <w:rFonts w:cs="Times New Roman"/>
+          <w:b/>
+          <w:bCs/>
+          <w:i/>
+          <w:iCs/>
+          <w:szCs w:val="24"/>
+        </w:rPr>
+      </w:pPr>
+      <w:r>
+        <w:rPr>
+          <w:rFonts w:cs="Times New Roman"/>
+          <w:b/>
+          <w:bCs/>
+          <w:i/>
+          <w:iCs/>
+          <w:szCs w:val="24"/>
+        </w:rPr>
+        <w:t>R</w:t>
+      </w:r>
+      <w:r>
+        <w:rPr>
+          <w:rFonts w:cs="Times New Roman"/>
+          <w:b/>
+          <w:bCs/>
+          <w:i/>
+          <w:iCs/>
+          <w:szCs w:val="24"/>
+        </w:rPr>
+        <w:t xml:space="preserve">eproducibility </w:t>
+      </w:r>
+      <w:r>
+        <w:rPr>
+          <w:rFonts w:cs="Times New Roman"/>
+          <w:b/>
+          <w:bCs/>
+          <w:i/>
+          <w:iCs/>
+          <w:szCs w:val="24"/>
+        </w:rPr>
+        <w:t>C</w:t>
+      </w:r>
+      <w:r>
+        <w:rPr>
+          <w:rFonts w:cs="Times New Roman"/>
+          <w:b/>
+          <w:bCs/>
+          <w:i/>
+          <w:iCs/>
+          <w:szCs w:val="24"/>
+        </w:rPr>
+        <w:t>riteria</w:t>
+      </w:r>
+    </w:p>
+    <w:p>
+      <w:pPr>
+        <w:spacing w:line="480" w:lineRule="auto"/>
+        <w:ind w:firstLine="720"/>
+        <w:rPr>
+          <w:rFonts w:cs="Times New Roman"/>
+          <w:szCs w:val="24"/>
+        </w:rPr>
+      </w:pPr>
+      <w:r>
+        <w:rPr>
+          <w:rFonts w:cs="Times New Roman"/>
+          <w:szCs w:val="24"/>
+        </w:rPr>
+        <w:t xml:space="preserve">The reproducibility of this project will be based on convergent metrics for simulation. As a general assumption for </w:t>
+      </w:r>
+      <w:r>
+        <w:rPr>
+          <w:rFonts w:cs="Times New Roman"/>
+          <w:szCs w:val="24"/>
+        </w:rPr>
+        <w:t>reproducibility</w:t>
+      </w:r>
+      <w:r>
+        <w:rPr>
+          <w:rFonts w:cs="Times New Roman"/>
+          <w:szCs w:val="24"/>
+        </w:rPr>
+        <w:t xml:space="preserve"> this simulation will aim to produce metrics from simulations that have run </w:t>
+      </w:r>
+      <w:r>
+        <w:rPr>
+          <w:rFonts w:cs="Times New Roman"/>
+          <w:szCs w:val="24"/>
+        </w:rPr>
+        <w:t xml:space="preserve">at least </w:t>
+      </w:r>
+      <w:r>
+        <w:rPr>
+          <w:rFonts w:cs="Times New Roman"/>
+          <w:szCs w:val="24"/>
+        </w:rPr>
+        <w:t xml:space="preserve">10,000 generations. </w:t>
+      </w:r>
+      <w:r>
+        <w:rPr>
+          <w:rFonts w:cs="Times New Roman"/>
+          <w:szCs w:val="24"/>
+        </w:rPr>
+        <w:t>Due to limited foresight into general runtime of the simulation</w:t>
+      </w:r>
+      <w:r>
+        <w:rPr>
+          <w:rFonts w:cs="Times New Roman"/>
+          <w:szCs w:val="24"/>
+        </w:rPr>
+        <w:t xml:space="preserve">, </w:t>
+      </w:r>
+      <w:r>
+        <w:rPr>
+          <w:rFonts w:cs="Times New Roman"/>
+          <w:szCs w:val="24"/>
+        </w:rPr>
+        <w:t xml:space="preserve">this project will consider this the minimum safe </w:t>
+      </w:r>
+      <w:r>
+        <w:rPr>
+          <w:rFonts w:cs="Times New Roman"/>
+          <w:szCs w:val="24"/>
+        </w:rPr>
+        <w:t xml:space="preserve">assumption for reproducibility. </w:t>
+      </w:r>
+      <w:r>
+        <w:rPr>
+          <w:rFonts w:cs="Times New Roman"/>
+          <w:szCs w:val="24"/>
+        </w:rPr>
+        <w:t>Additionally, for conclusions based on data the final data set used for this project will be provided with the paper.</w:t>
+      </w:r>
+      <w:r>
+        <w:rPr>
+          <w:rFonts w:cs="Times New Roman"/>
+          <w:szCs w:val="24"/>
+        </w:rPr>
+        <w:t xml:space="preserve"> If upon testing of the final simulation 10,000 is not deemed </w:t>
+      </w:r>
+      <w:r>
+        <w:rPr>
+          <w:rFonts w:cs="Times New Roman"/>
+          <w:szCs w:val="24"/>
+        </w:rPr>
+        <w:lastRenderedPageBreak/>
+        <w:t>satisfactory</w:t>
+      </w:r>
+      <w:r>
+        <w:rPr>
+          <w:rFonts w:cs="Times New Roman"/>
+          <w:szCs w:val="24"/>
+        </w:rPr>
+        <w:t xml:space="preserve"> for reproducibility</w:t>
+      </w:r>
+      <w:r>
+        <w:rPr>
+          <w:rFonts w:cs="Times New Roman"/>
+          <w:szCs w:val="24"/>
+        </w:rPr>
+        <w:t xml:space="preserve"> (if there is still a large variability in </w:t>
+      </w:r>
+      <w:proofErr w:type="gramStart"/>
+      <w:r>
+        <w:rPr>
+          <w:rFonts w:cs="Times New Roman"/>
+          <w:szCs w:val="24"/>
+        </w:rPr>
+        <w:t>stat</w:t>
+      </w:r>
+      <w:proofErr w:type="gramEnd"/>
+      <w:r>
+        <w:rPr>
+          <w:rFonts w:cs="Times New Roman"/>
+          <w:szCs w:val="24"/>
+        </w:rPr>
+        <w:t xml:space="preserve"> spread) </w:t>
+      </w:r>
+      <w:r>
+        <w:rPr>
+          <w:rFonts w:cs="Times New Roman"/>
+          <w:szCs w:val="24"/>
+        </w:rPr>
+        <w:t>a</w:t>
+      </w:r>
+      <w:r>
+        <w:rPr>
+          <w:rFonts w:cs="Times New Roman"/>
+          <w:szCs w:val="24"/>
+        </w:rPr>
+        <w:t xml:space="preserve"> larger number will be chosen</w:t>
+      </w:r>
+      <w:r>
+        <w:rPr>
+          <w:rFonts w:cs="Times New Roman"/>
+          <w:szCs w:val="24"/>
+        </w:rPr>
+        <w:t xml:space="preserve"> for the final paper</w:t>
+      </w:r>
+      <w:r>
+        <w:rPr>
+          <w:rFonts w:cs="Times New Roman"/>
+          <w:szCs w:val="24"/>
+        </w:rPr>
+        <w:t>.</w:t>
+      </w:r>
+    </w:p>
+    <w:p>
+      <w:pPr>
+        <w:spacing w:line="480" w:lineRule="auto"/>
         <w:jc w:val="center"/>
         <w:rPr>
           <w:rFonts w:cs="Times New Roman"/>
           <w:b/>
+          <w:bCs/>
+          <w:szCs w:val="24"/>
+        </w:rPr>
+      </w:pPr>
+      <w:r>
+        <w:rPr>
+          <w:rFonts w:cs="Times New Roman"/>
+          <w:b/>
+          <w:bCs/>
+          <w:szCs w:val="24"/>
+        </w:rPr>
+        <w:t>AI Usage Log</w:t>
+      </w:r>
+    </w:p>
+    <w:p>
+      <w:pPr>
+        <w:spacing w:line="480" w:lineRule="auto"/>
+        <w:ind w:firstLine="720"/>
+        <w:rPr>
+          <w:rFonts w:cs="Times New Roman"/>
+          <w:szCs w:val="24"/>
+        </w:rPr>
+      </w:pPr>
+      <w:r>
+        <w:rPr>
+          <w:rFonts w:cs="Times New Roman"/>
+          <w:szCs w:val="24"/>
+        </w:rPr>
+        <w:t>Generative AI</w:t>
+      </w:r>
+      <w:r>
+        <w:rPr>
+          <w:rFonts w:cs="Times New Roman"/>
+          <w:szCs w:val="24"/>
+        </w:rPr>
+        <w:t xml:space="preserve"> is</w:t>
+      </w:r>
+      <w:r>
+        <w:rPr>
+          <w:rFonts w:cs="Times New Roman"/>
+          <w:szCs w:val="24"/>
+        </w:rPr>
+        <w:t xml:space="preserve"> not intended to be used for this project.</w:t>
+      </w:r>
+      <w:r>
+        <w:rPr>
+          <w:rFonts w:cs="Times New Roman"/>
+          <w:szCs w:val="24"/>
+        </w:rPr>
+        <w:t xml:space="preserve"> Any code</w:t>
+      </w:r>
+      <w:r>
+        <w:rPr>
+          <w:rFonts w:cs="Times New Roman"/>
+          <w:szCs w:val="24"/>
+        </w:rPr>
+        <w:t xml:space="preserve"> or documents</w:t>
+      </w:r>
+      <w:r>
+        <w:rPr>
+          <w:rFonts w:cs="Times New Roman"/>
+          <w:szCs w:val="24"/>
+        </w:rPr>
+        <w:t xml:space="preserve"> produced for this project is intended to be done by hand. </w:t>
+      </w:r>
+      <w:r>
+        <w:rPr>
+          <w:rFonts w:cs="Times New Roman"/>
+          <w:szCs w:val="24"/>
+        </w:rPr>
+        <w:t xml:space="preserve">If </w:t>
+      </w:r>
+      <w:r>
+        <w:rPr>
+          <w:rFonts w:cs="Times New Roman"/>
+          <w:szCs w:val="24"/>
+        </w:rPr>
+        <w:t xml:space="preserve">Generative </w:t>
+      </w:r>
+      <w:r>
+        <w:rPr>
+          <w:rFonts w:cs="Times New Roman"/>
+          <w:szCs w:val="24"/>
+        </w:rPr>
+        <w:t>AI is used it</w:t>
+      </w:r>
+      <w:r>
+        <w:rPr>
+          <w:rFonts w:cs="Times New Roman"/>
+          <w:szCs w:val="24"/>
+        </w:rPr>
+        <w:t xml:space="preserve"> will be </w:t>
+      </w:r>
+      <w:r>
+        <w:rPr>
+          <w:rFonts w:cs="Times New Roman"/>
+          <w:szCs w:val="24"/>
+        </w:rPr>
+        <w:t>credited</w:t>
+      </w:r>
+      <w:r>
+        <w:rPr>
+          <w:rFonts w:cs="Times New Roman"/>
+          <w:szCs w:val="24"/>
+        </w:rPr>
+        <w:t xml:space="preserve"> as a comment in the code or as </w:t>
+      </w:r>
+      <w:r>
+        <w:rPr>
+          <w:rFonts w:cs="Times New Roman"/>
+          <w:szCs w:val="24"/>
+        </w:rPr>
+        <w:t>an</w:t>
+      </w:r>
+      <w:r>
+        <w:rPr>
+          <w:rFonts w:cs="Times New Roman"/>
+          <w:szCs w:val="24"/>
+        </w:rPr>
+        <w:t xml:space="preserve"> APA citation in the corresponding document. </w:t>
+      </w:r>
+      <w:r>
+        <w:rPr>
+          <w:rFonts w:cs="Times New Roman"/>
+          <w:szCs w:val="24"/>
+        </w:rPr>
+        <w:t xml:space="preserve">Basic AI </w:t>
+      </w:r>
+      <w:r>
+        <w:rPr>
+          <w:rFonts w:cs="Times New Roman"/>
+          <w:szCs w:val="24"/>
+        </w:rPr>
+        <w:t>principles</w:t>
+      </w:r>
+      <w:r>
+        <w:rPr>
+          <w:rFonts w:cs="Times New Roman"/>
+          <w:szCs w:val="24"/>
+        </w:rPr>
+        <w:t xml:space="preserve"> </w:t>
+      </w:r>
+      <w:r>
+        <w:rPr>
+          <w:rFonts w:cs="Times New Roman"/>
+          <w:szCs w:val="24"/>
+        </w:rPr>
+        <w:t xml:space="preserve">seen in games/simulations </w:t>
+      </w:r>
+      <w:r>
+        <w:rPr>
+          <w:rFonts w:cs="Times New Roman"/>
+          <w:szCs w:val="24"/>
+        </w:rPr>
+        <w:t xml:space="preserve">will be used as a basis for the predator and prey decision making process. </w:t>
+      </w:r>
+      <w:r>
+        <w:rPr>
+          <w:rFonts w:cs="Times New Roman"/>
+          <w:szCs w:val="24"/>
+        </w:rPr>
+        <w:t xml:space="preserve">These systems are intended to be built as part of the project and thus under the copyright of this project. </w:t>
+      </w:r>
+    </w:p>
+    <w:p>
+      <w:pPr>
+        <w:spacing w:line="480" w:lineRule="auto"/>
+        <w:jc w:val="center"/>
+        <w:rPr>
+          <w:rFonts w:cs="Times New Roman"/>
+          <w:b/>
           <w:szCs w:val="24"/>
         </w:rPr>
       </w:pPr>
@@ -2290,7 +5076,7 @@
           <w:bCs/>
           <w:szCs w:val="24"/>
         </w:rPr>
-        <w:t xml:space="preserve">Currently, I need to find a supervisor for my project. The </w:t>
+        <w:t xml:space="preserve">The </w:t>
       </w:r>
       <w:proofErr w:type="gramStart"/>
       <w:r>
@@ -2518,7 +5304,7 @@
       </w:pPr>
     </w:p>
     <w:sectPr>
-      <w:headerReference w:type="default" r:id="rId16"/>
+      <w:headerReference w:type="default" r:id="rId21"/>
       <w:pgSz w:w="12240" w:h="15840"/>
       <w:pgMar w:top="1440" w:right="1440" w:bottom="1440" w:left="1440" w:header="720" w:footer="720" w:gutter="0"/>
       <w:cols w:space="720"/>
@@ -2659,6 +5445,318 @@
 <file path=word/numbering.xml><?xml version="1.0" encoding="utf-8"?>
 <w:numbering xmlns:wpc="http://schemas.microsoft.com/office/word/2010/wordprocessingCanvas" xmlns:cx="http://schemas.microsoft.com/office/drawing/2014/chartex" xmlns:cx1="http://schemas.microsoft.com/office/drawing/2015/9/8/chartex" xmlns:cx2="http://schemas.microsoft.com/office/drawing/2015/10/21/chartex" xmlns:cx3="http://schemas.microsoft.com/office/drawing/2016/5/9/chartex" xmlns:cx4="http://schemas.microsoft.com/office/drawing/2016/5/10/chartex" xmlns:cx5="http://schemas.microsoft.com/office/drawing/2016/5/11/chartex" xmlns:cx6="http://schemas.microsoft.com/office/drawing/2016/5/12/chartex" xmlns:cx7="http://schemas.microsoft.com/office/drawing/2016/5/13/chartex" xmlns:cx8="http://schemas.microsoft.com/office/drawing/2016/5/14/chartex" xmlns:mc="http://schemas.openxmlformats.org/markup-compatibility/2006" xmlns:aink="http://schemas.microsoft.com/office/drawing/2016/ink" xmlns:am3d="http://schemas.microsoft.com/office/drawing/2017/model3d" xmlns:o="urn:schemas-microsoft-com:office:office" xmlns:oel="http://schemas.microsoft.com/office/2019/extlst" xmlns:r="http://schemas.openxmlformats.org/officeDocument/2006/relationships" xmlns:m="http://schemas.openxmlformats.org/officeDocument/2006/math" xmlns:v="urn:schemas-microsoft-com:vml" xmlns:wp14="http://schemas.microsoft.com/office/word/2010/wordprocessingDrawing" xmlns:wp="http://schemas.openxmlformats.org/drawingml/2006/wordprocessingDrawing" xmlns:w10="urn:schemas-microsoft-com:office:word" xmlns:w="http://schemas.openxmlformats.org/wordprocessingml/2006/main" xmlns:w14="http://schemas.microsoft.com/office/word/2010/wordml" xmlns:w15="http://schemas.microsoft.com/office/word/2012/wordml" xmlns:w16cex="http://schemas.microsoft.com/office/word/2018/wordml/cex" xmlns:w16cid="http://schemas.microsoft.com/office/word/2016/wordml/cid" xmlns:w16="http://schemas.microsoft.com/office/word/2018/wordml" xmlns:w16du="http://schemas.microsoft.com/office/word/2023/wordml/word16du" xmlns:w16sdtdh="http://schemas.microsoft.com/office/word/2020/wordml/sdtdatahash" xmlns:w16sdtfl="http://schemas.microsoft.com/office/word/2024/wordml/sdtformatlock" xmlns:w16se="http://schemas.microsoft.com/office/word/2015/wordml/symex" xmlns:wpg="http://schemas.microsoft.com/office/word/2010/wordprocessingGroup" xmlns:wpi="http://schemas.microsoft.com/office/word/2010/wordprocessingInk" xmlns:wne="http://schemas.microsoft.com/office/word/2006/wordml" xmlns:wps="http://schemas.microsoft.com/office/word/2010/wordprocessingShape" mc:Ignorable="w14 w15 w16se w16cid w16 w16cex w16sdtdh w16sdtfl w16du wp14">
   <w:abstractNum w:abstractNumId="0" w15:restartNumberingAfterBreak="0">
+    <w:nsid w:val="1AD8174E"/>
+    <w:multiLevelType w:val="hybridMultilevel"/>
+    <w:tmpl w:val="84F07AE2"/>
+    <w:lvl w:ilvl="0" w:tplc="0409000F">
+      <w:start w:val="1"/>
+      <w:numFmt w:val="decimal"/>
+      <w:lvlText w:val="%1."/>
+      <w:lvlJc w:val="left"/>
+      <w:pPr>
+        <w:ind w:left="720" w:hanging="360"/>
+      </w:pPr>
+    </w:lvl>
+    <w:lvl w:ilvl="1" w:tplc="04090019" w:tentative="1">
+      <w:start w:val="1"/>
+      <w:numFmt w:val="lowerLetter"/>
+      <w:lvlText w:val="%2."/>
+      <w:lvlJc w:val="left"/>
+      <w:pPr>
+        <w:ind w:left="1440" w:hanging="360"/>
+      </w:pPr>
+    </w:lvl>
+    <w:lvl w:ilvl="2" w:tplc="0409001B" w:tentative="1">
+      <w:start w:val="1"/>
+      <w:numFmt w:val="lowerRoman"/>
+      <w:lvlText w:val="%3."/>
+      <w:lvlJc w:val="right"/>
+      <w:pPr>
+        <w:ind w:left="2160" w:hanging="180"/>
+      </w:pPr>
+    </w:lvl>
+    <w:lvl w:ilvl="3" w:tplc="0409000F" w:tentative="1">
+      <w:start w:val="1"/>
+      <w:numFmt w:val="decimal"/>
+      <w:lvlText w:val="%4."/>
+      <w:lvlJc w:val="left"/>
+      <w:pPr>
+        <w:ind w:left="2880" w:hanging="360"/>
+      </w:pPr>
+    </w:lvl>
+    <w:lvl w:ilvl="4" w:tplc="04090019" w:tentative="1">
+      <w:start w:val="1"/>
+      <w:numFmt w:val="lowerLetter"/>
+      <w:lvlText w:val="%5."/>
+      <w:lvlJc w:val="left"/>
+      <w:pPr>
+        <w:ind w:left="3600" w:hanging="360"/>
+      </w:pPr>
+    </w:lvl>
+    <w:lvl w:ilvl="5" w:tplc="0409001B" w:tentative="1">
+      <w:start w:val="1"/>
+      <w:numFmt w:val="lowerRoman"/>
+      <w:lvlText w:val="%6."/>
+      <w:lvlJc w:val="right"/>
+      <w:pPr>
+        <w:ind w:left="4320" w:hanging="180"/>
+      </w:pPr>
+    </w:lvl>
+    <w:lvl w:ilvl="6" w:tplc="0409000F" w:tentative="1">
+      <w:start w:val="1"/>
+      <w:numFmt w:val="decimal"/>
+      <w:lvlText w:val="%7."/>
+      <w:lvlJc w:val="left"/>
+      <w:pPr>
+        <w:ind w:left="5040" w:hanging="360"/>
+      </w:pPr>
+    </w:lvl>
+    <w:lvl w:ilvl="7" w:tplc="04090019" w:tentative="1">
+      <w:start w:val="1"/>
+      <w:numFmt w:val="lowerLetter"/>
+      <w:lvlText w:val="%8."/>
+      <w:lvlJc w:val="left"/>
+      <w:pPr>
+        <w:ind w:left="5760" w:hanging="360"/>
+      </w:pPr>
+    </w:lvl>
+    <w:lvl w:ilvl="8" w:tplc="0409001B" w:tentative="1">
+      <w:start w:val="1"/>
+      <w:numFmt w:val="lowerRoman"/>
+      <w:lvlText w:val="%9."/>
+      <w:lvlJc w:val="right"/>
+      <w:pPr>
+        <w:ind w:left="6480" w:hanging="180"/>
+      </w:pPr>
+    </w:lvl>
+  </w:abstractNum>
+  <w:abstractNum w:abstractNumId="1" w15:restartNumberingAfterBreak="0">
+    <w:nsid w:val="1F3861E2"/>
+    <w:multiLevelType w:val="hybridMultilevel"/>
+    <w:tmpl w:val="EE26AFE2"/>
+    <w:lvl w:ilvl="0" w:tplc="04090001">
+      <w:start w:val="1"/>
+      <w:numFmt w:val="bullet"/>
+      <w:lvlText w:val=""/>
+      <w:lvlJc w:val="left"/>
+      <w:pPr>
+        <w:ind w:left="720" w:hanging="360"/>
+      </w:pPr>
+      <w:rPr>
+        <w:rFonts w:ascii="Symbol" w:hAnsi="Symbol" w:hint="default"/>
+      </w:rPr>
+    </w:lvl>
+    <w:lvl w:ilvl="1" w:tplc="04090003" w:tentative="1">
+      <w:start w:val="1"/>
+      <w:numFmt w:val="bullet"/>
+      <w:lvlText w:val="o"/>
+      <w:lvlJc w:val="left"/>
+      <w:pPr>
+        <w:ind w:left="1440" w:hanging="360"/>
+      </w:pPr>
+      <w:rPr>
+        <w:rFonts w:ascii="Courier New" w:hAnsi="Courier New" w:cs="Courier New" w:hint="default"/>
+      </w:rPr>
+    </w:lvl>
+    <w:lvl w:ilvl="2" w:tplc="04090005" w:tentative="1">
+      <w:start w:val="1"/>
+      <w:numFmt w:val="bullet"/>
+      <w:lvlText w:val=""/>
+      <w:lvlJc w:val="left"/>
+      <w:pPr>
+        <w:ind w:left="2160" w:hanging="360"/>
+      </w:pPr>
+      <w:rPr>
+        <w:rFonts w:ascii="Wingdings" w:hAnsi="Wingdings" w:hint="default"/>
+      </w:rPr>
+    </w:lvl>
+    <w:lvl w:ilvl="3" w:tplc="04090001" w:tentative="1">
+      <w:start w:val="1"/>
+      <w:numFmt w:val="bullet"/>
+      <w:lvlText w:val=""/>
+      <w:lvlJc w:val="left"/>
+      <w:pPr>
+        <w:ind w:left="2880" w:hanging="360"/>
+      </w:pPr>
+      <w:rPr>
+        <w:rFonts w:ascii="Symbol" w:hAnsi="Symbol" w:hint="default"/>
+      </w:rPr>
+    </w:lvl>
+    <w:lvl w:ilvl="4" w:tplc="04090003" w:tentative="1">
+      <w:start w:val="1"/>
+      <w:numFmt w:val="bullet"/>
+      <w:lvlText w:val="o"/>
+      <w:lvlJc w:val="left"/>
+      <w:pPr>
+        <w:ind w:left="3600" w:hanging="360"/>
+      </w:pPr>
+      <w:rPr>
+        <w:rFonts w:ascii="Courier New" w:hAnsi="Courier New" w:cs="Courier New" w:hint="default"/>
+      </w:rPr>
+    </w:lvl>
+    <w:lvl w:ilvl="5" w:tplc="04090005" w:tentative="1">
+      <w:start w:val="1"/>
+      <w:numFmt w:val="bullet"/>
+      <w:lvlText w:val=""/>
+      <w:lvlJc w:val="left"/>
+      <w:pPr>
+        <w:ind w:left="4320" w:hanging="360"/>
+      </w:pPr>
+      <w:rPr>
+        <w:rFonts w:ascii="Wingdings" w:hAnsi="Wingdings" w:hint="default"/>
+      </w:rPr>
+    </w:lvl>
+    <w:lvl w:ilvl="6" w:tplc="04090001" w:tentative="1">
+      <w:start w:val="1"/>
+      <w:numFmt w:val="bullet"/>
+      <w:lvlText w:val=""/>
+      <w:lvlJc w:val="left"/>
+      <w:pPr>
+        <w:ind w:left="5040" w:hanging="360"/>
+      </w:pPr>
+      <w:rPr>
+        <w:rFonts w:ascii="Symbol" w:hAnsi="Symbol" w:hint="default"/>
+      </w:rPr>
+    </w:lvl>
+    <w:lvl w:ilvl="7" w:tplc="04090003" w:tentative="1">
+      <w:start w:val="1"/>
+      <w:numFmt w:val="bullet"/>
+      <w:lvlText w:val="o"/>
+      <w:lvlJc w:val="left"/>
+      <w:pPr>
+        <w:ind w:left="5760" w:hanging="360"/>
+      </w:pPr>
+      <w:rPr>
+        <w:rFonts w:ascii="Courier New" w:hAnsi="Courier New" w:cs="Courier New" w:hint="default"/>
+      </w:rPr>
+    </w:lvl>
+    <w:lvl w:ilvl="8" w:tplc="04090005" w:tentative="1">
+      <w:start w:val="1"/>
+      <w:numFmt w:val="bullet"/>
+      <w:lvlText w:val=""/>
+      <w:lvlJc w:val="left"/>
+      <w:pPr>
+        <w:ind w:left="6480" w:hanging="360"/>
+      </w:pPr>
+      <w:rPr>
+        <w:rFonts w:ascii="Wingdings" w:hAnsi="Wingdings" w:hint="default"/>
+      </w:rPr>
+    </w:lvl>
+  </w:abstractNum>
+  <w:abstractNum w:abstractNumId="2" w15:restartNumberingAfterBreak="0">
+    <w:nsid w:val="2283259E"/>
+    <w:multiLevelType w:val="hybridMultilevel"/>
+    <w:tmpl w:val="CE8EC3AE"/>
+    <w:lvl w:ilvl="0" w:tplc="04090001">
+      <w:start w:val="1"/>
+      <w:numFmt w:val="bullet"/>
+      <w:lvlText w:val=""/>
+      <w:lvlJc w:val="left"/>
+      <w:pPr>
+        <w:ind w:left="720" w:hanging="360"/>
+      </w:pPr>
+      <w:rPr>
+        <w:rFonts w:ascii="Symbol" w:hAnsi="Symbol" w:hint="default"/>
+      </w:rPr>
+    </w:lvl>
+    <w:lvl w:ilvl="1" w:tplc="04090003" w:tentative="1">
+      <w:start w:val="1"/>
+      <w:numFmt w:val="bullet"/>
+      <w:lvlText w:val="o"/>
+      <w:lvlJc w:val="left"/>
+      <w:pPr>
+        <w:ind w:left="1440" w:hanging="360"/>
+      </w:pPr>
+      <w:rPr>
+        <w:rFonts w:ascii="Courier New" w:hAnsi="Courier New" w:cs="Courier New" w:hint="default"/>
+      </w:rPr>
+    </w:lvl>
+    <w:lvl w:ilvl="2" w:tplc="04090005" w:tentative="1">
+      <w:start w:val="1"/>
+      <w:numFmt w:val="bullet"/>
+      <w:lvlText w:val=""/>
+      <w:lvlJc w:val="left"/>
+      <w:pPr>
+        <w:ind w:left="2160" w:hanging="360"/>
+      </w:pPr>
+      <w:rPr>
+        <w:rFonts w:ascii="Wingdings" w:hAnsi="Wingdings" w:hint="default"/>
+      </w:rPr>
+    </w:lvl>
+    <w:lvl w:ilvl="3" w:tplc="04090001" w:tentative="1">
+      <w:start w:val="1"/>
+      <w:numFmt w:val="bullet"/>
+      <w:lvlText w:val=""/>
+      <w:lvlJc w:val="left"/>
+      <w:pPr>
+        <w:ind w:left="2880" w:hanging="360"/>
+      </w:pPr>
+      <w:rPr>
+        <w:rFonts w:ascii="Symbol" w:hAnsi="Symbol" w:hint="default"/>
+      </w:rPr>
+    </w:lvl>
+    <w:lvl w:ilvl="4" w:tplc="04090003" w:tentative="1">
+      <w:start w:val="1"/>
+      <w:numFmt w:val="bullet"/>
+      <w:lvlText w:val="o"/>
+      <w:lvlJc w:val="left"/>
+      <w:pPr>
+        <w:ind w:left="3600" w:hanging="360"/>
+      </w:pPr>
+      <w:rPr>
+        <w:rFonts w:ascii="Courier New" w:hAnsi="Courier New" w:cs="Courier New" w:hint="default"/>
+      </w:rPr>
+    </w:lvl>
+    <w:lvl w:ilvl="5" w:tplc="04090005" w:tentative="1">
+      <w:start w:val="1"/>
+      <w:numFmt w:val="bullet"/>
+      <w:lvlText w:val=""/>
+      <w:lvlJc w:val="left"/>
+      <w:pPr>
+        <w:ind w:left="4320" w:hanging="360"/>
+      </w:pPr>
+      <w:rPr>
+        <w:rFonts w:ascii="Wingdings" w:hAnsi="Wingdings" w:hint="default"/>
+      </w:rPr>
+    </w:lvl>
+    <w:lvl w:ilvl="6" w:tplc="04090001" w:tentative="1">
+      <w:start w:val="1"/>
+      <w:numFmt w:val="bullet"/>
+      <w:lvlText w:val=""/>
+      <w:lvlJc w:val="left"/>
+      <w:pPr>
+        <w:ind w:left="5040" w:hanging="360"/>
+      </w:pPr>
+      <w:rPr>
+        <w:rFonts w:ascii="Symbol" w:hAnsi="Symbol" w:hint="default"/>
+      </w:rPr>
+    </w:lvl>
+    <w:lvl w:ilvl="7" w:tplc="04090003" w:tentative="1">
+      <w:start w:val="1"/>
+      <w:numFmt w:val="bullet"/>
+      <w:lvlText w:val="o"/>
+      <w:lvlJc w:val="left"/>
+      <w:pPr>
+        <w:ind w:left="5760" w:hanging="360"/>
+      </w:pPr>
+      <w:rPr>
+        <w:rFonts w:ascii="Courier New" w:hAnsi="Courier New" w:cs="Courier New" w:hint="default"/>
+      </w:rPr>
+    </w:lvl>
+    <w:lvl w:ilvl="8" w:tplc="04090005" w:tentative="1">
+      <w:start w:val="1"/>
+      <w:numFmt w:val="bullet"/>
+      <w:lvlText w:val=""/>
+      <w:lvlJc w:val="left"/>
+      <w:pPr>
+        <w:ind w:left="6480" w:hanging="360"/>
+      </w:pPr>
+      <w:rPr>
+        <w:rFonts w:ascii="Wingdings" w:hAnsi="Wingdings" w:hint="default"/>
+      </w:rPr>
+    </w:lvl>
+  </w:abstractNum>
+  <w:abstractNum w:abstractNumId="3" w15:restartNumberingAfterBreak="0">
     <w:nsid w:val="30270555"/>
     <w:multiLevelType w:val="hybridMultilevel"/>
     <w:tmpl w:val="5B589B0C"/>
@@ -2747,7 +5845,7 @@
       </w:pPr>
     </w:lvl>
   </w:abstractNum>
-  <w:abstractNum w:abstractNumId="1" w15:restartNumberingAfterBreak="0">
+  <w:abstractNum w:abstractNumId="4" w15:restartNumberingAfterBreak="0">
     <w:nsid w:val="338B0DAF"/>
     <w:multiLevelType w:val="hybridMultilevel"/>
     <w:tmpl w:val="3550AA58"/>
@@ -2860,7 +5958,120 @@
       </w:rPr>
     </w:lvl>
   </w:abstractNum>
-  <w:abstractNum w:abstractNumId="2" w15:restartNumberingAfterBreak="0">
+  <w:abstractNum w:abstractNumId="5" w15:restartNumberingAfterBreak="0">
+    <w:nsid w:val="3A3D756B"/>
+    <w:multiLevelType w:val="hybridMultilevel"/>
+    <w:tmpl w:val="AFB40178"/>
+    <w:lvl w:ilvl="0" w:tplc="04090001">
+      <w:start w:val="1"/>
+      <w:numFmt w:val="bullet"/>
+      <w:lvlText w:val=""/>
+      <w:lvlJc w:val="left"/>
+      <w:pPr>
+        <w:ind w:left="720" w:hanging="360"/>
+      </w:pPr>
+      <w:rPr>
+        <w:rFonts w:ascii="Symbol" w:hAnsi="Symbol" w:hint="default"/>
+      </w:rPr>
+    </w:lvl>
+    <w:lvl w:ilvl="1" w:tplc="04090003" w:tentative="1">
+      <w:start w:val="1"/>
+      <w:numFmt w:val="bullet"/>
+      <w:lvlText w:val="o"/>
+      <w:lvlJc w:val="left"/>
+      <w:pPr>
+        <w:ind w:left="1440" w:hanging="360"/>
+      </w:pPr>
+      <w:rPr>
+        <w:rFonts w:ascii="Courier New" w:hAnsi="Courier New" w:cs="Courier New" w:hint="default"/>
+      </w:rPr>
+    </w:lvl>
+    <w:lvl w:ilvl="2" w:tplc="04090005" w:tentative="1">
+      <w:start w:val="1"/>
+      <w:numFmt w:val="bullet"/>
+      <w:lvlText w:val=""/>
+      <w:lvlJc w:val="left"/>
+      <w:pPr>
+        <w:ind w:left="2160" w:hanging="360"/>
+      </w:pPr>
+      <w:rPr>
+        <w:rFonts w:ascii="Wingdings" w:hAnsi="Wingdings" w:hint="default"/>
+      </w:rPr>
+    </w:lvl>
+    <w:lvl w:ilvl="3" w:tplc="04090001" w:tentative="1">
+      <w:start w:val="1"/>
+      <w:numFmt w:val="bullet"/>
+      <w:lvlText w:val=""/>
+      <w:lvlJc w:val="left"/>
+      <w:pPr>
+        <w:ind w:left="2880" w:hanging="360"/>
+      </w:pPr>
+      <w:rPr>
+        <w:rFonts w:ascii="Symbol" w:hAnsi="Symbol" w:hint="default"/>
+      </w:rPr>
+    </w:lvl>
+    <w:lvl w:ilvl="4" w:tplc="04090003" w:tentative="1">
+      <w:start w:val="1"/>
+      <w:numFmt w:val="bullet"/>
+      <w:lvlText w:val="o"/>
+      <w:lvlJc w:val="left"/>
+      <w:pPr>
+        <w:ind w:left="3600" w:hanging="360"/>
+      </w:pPr>
+      <w:rPr>
+        <w:rFonts w:ascii="Courier New" w:hAnsi="Courier New" w:cs="Courier New" w:hint="default"/>
+      </w:rPr>
+    </w:lvl>
+    <w:lvl w:ilvl="5" w:tplc="04090005" w:tentative="1">
+      <w:start w:val="1"/>
+      <w:numFmt w:val="bullet"/>
+      <w:lvlText w:val=""/>
+      <w:lvlJc w:val="left"/>
+      <w:pPr>
+        <w:ind w:left="4320" w:hanging="360"/>
+      </w:pPr>
+      <w:rPr>
+        <w:rFonts w:ascii="Wingdings" w:hAnsi="Wingdings" w:hint="default"/>
+      </w:rPr>
+    </w:lvl>
+    <w:lvl w:ilvl="6" w:tplc="04090001" w:tentative="1">
+      <w:start w:val="1"/>
+      <w:numFmt w:val="bullet"/>
+      <w:lvlText w:val=""/>
+      <w:lvlJc w:val="left"/>
+      <w:pPr>
+        <w:ind w:left="5040" w:hanging="360"/>
+      </w:pPr>
+      <w:rPr>
+        <w:rFonts w:ascii="Symbol" w:hAnsi="Symbol" w:hint="default"/>
+      </w:rPr>
+    </w:lvl>
+    <w:lvl w:ilvl="7" w:tplc="04090003" w:tentative="1">
+      <w:start w:val="1"/>
+      <w:numFmt w:val="bullet"/>
+      <w:lvlText w:val="o"/>
+      <w:lvlJc w:val="left"/>
+      <w:pPr>
+        <w:ind w:left="5760" w:hanging="360"/>
+      </w:pPr>
+      <w:rPr>
+        <w:rFonts w:ascii="Courier New" w:hAnsi="Courier New" w:cs="Courier New" w:hint="default"/>
+      </w:rPr>
+    </w:lvl>
+    <w:lvl w:ilvl="8" w:tplc="04090005" w:tentative="1">
+      <w:start w:val="1"/>
+      <w:numFmt w:val="bullet"/>
+      <w:lvlText w:val=""/>
+      <w:lvlJc w:val="left"/>
+      <w:pPr>
+        <w:ind w:left="6480" w:hanging="360"/>
+      </w:pPr>
+      <w:rPr>
+        <w:rFonts w:ascii="Wingdings" w:hAnsi="Wingdings" w:hint="default"/>
+      </w:rPr>
+    </w:lvl>
+  </w:abstractNum>
+  <w:abstractNum w:abstractNumId="6" w15:restartNumberingAfterBreak="0">
     <w:nsid w:val="3C3C7B80"/>
     <w:multiLevelType w:val="hybridMultilevel"/>
     <w:tmpl w:val="57305A56"/>
@@ -2946,14 +6157,606 @@
       </w:pPr>
     </w:lvl>
   </w:abstractNum>
+  <w:abstractNum w:abstractNumId="7" w15:restartNumberingAfterBreak="0">
+    <w:nsid w:val="3DC14879"/>
+    <w:multiLevelType w:val="hybridMultilevel"/>
+    <w:tmpl w:val="DED409F8"/>
+    <w:lvl w:ilvl="0" w:tplc="04090001">
+      <w:start w:val="1"/>
+      <w:numFmt w:val="bullet"/>
+      <w:lvlText w:val=""/>
+      <w:lvlJc w:val="left"/>
+      <w:pPr>
+        <w:ind w:left="720" w:hanging="360"/>
+      </w:pPr>
+      <w:rPr>
+        <w:rFonts w:ascii="Symbol" w:hAnsi="Symbol" w:hint="default"/>
+      </w:rPr>
+    </w:lvl>
+    <w:lvl w:ilvl="1" w:tplc="04090003" w:tentative="1">
+      <w:start w:val="1"/>
+      <w:numFmt w:val="bullet"/>
+      <w:lvlText w:val="o"/>
+      <w:lvlJc w:val="left"/>
+      <w:pPr>
+        <w:ind w:left="1440" w:hanging="360"/>
+      </w:pPr>
+      <w:rPr>
+        <w:rFonts w:ascii="Courier New" w:hAnsi="Courier New" w:cs="Courier New" w:hint="default"/>
+      </w:rPr>
+    </w:lvl>
+    <w:lvl w:ilvl="2" w:tplc="04090005" w:tentative="1">
+      <w:start w:val="1"/>
+      <w:numFmt w:val="bullet"/>
+      <w:lvlText w:val=""/>
+      <w:lvlJc w:val="left"/>
+      <w:pPr>
+        <w:ind w:left="2160" w:hanging="360"/>
+      </w:pPr>
+      <w:rPr>
+        <w:rFonts w:ascii="Wingdings" w:hAnsi="Wingdings" w:hint="default"/>
+      </w:rPr>
+    </w:lvl>
+    <w:lvl w:ilvl="3" w:tplc="04090001" w:tentative="1">
+      <w:start w:val="1"/>
+      <w:numFmt w:val="bullet"/>
+      <w:lvlText w:val=""/>
+      <w:lvlJc w:val="left"/>
+      <w:pPr>
+        <w:ind w:left="2880" w:hanging="360"/>
+      </w:pPr>
+      <w:rPr>
+        <w:rFonts w:ascii="Symbol" w:hAnsi="Symbol" w:hint="default"/>
+      </w:rPr>
+    </w:lvl>
+    <w:lvl w:ilvl="4" w:tplc="04090003" w:tentative="1">
+      <w:start w:val="1"/>
+      <w:numFmt w:val="bullet"/>
+      <w:lvlText w:val="o"/>
+      <w:lvlJc w:val="left"/>
+      <w:pPr>
+        <w:ind w:left="3600" w:hanging="360"/>
+      </w:pPr>
+      <w:rPr>
+        <w:rFonts w:ascii="Courier New" w:hAnsi="Courier New" w:cs="Courier New" w:hint="default"/>
+      </w:rPr>
+    </w:lvl>
+    <w:lvl w:ilvl="5" w:tplc="04090005" w:tentative="1">
+      <w:start w:val="1"/>
+      <w:numFmt w:val="bullet"/>
+      <w:lvlText w:val=""/>
+      <w:lvlJc w:val="left"/>
+      <w:pPr>
+        <w:ind w:left="4320" w:hanging="360"/>
+      </w:pPr>
+      <w:rPr>
+        <w:rFonts w:ascii="Wingdings" w:hAnsi="Wingdings" w:hint="default"/>
+      </w:rPr>
+    </w:lvl>
+    <w:lvl w:ilvl="6" w:tplc="04090001" w:tentative="1">
+      <w:start w:val="1"/>
+      <w:numFmt w:val="bullet"/>
+      <w:lvlText w:val=""/>
+      <w:lvlJc w:val="left"/>
+      <w:pPr>
+        <w:ind w:left="5040" w:hanging="360"/>
+      </w:pPr>
+      <w:rPr>
+        <w:rFonts w:ascii="Symbol" w:hAnsi="Symbol" w:hint="default"/>
+      </w:rPr>
+    </w:lvl>
+    <w:lvl w:ilvl="7" w:tplc="04090003" w:tentative="1">
+      <w:start w:val="1"/>
+      <w:numFmt w:val="bullet"/>
+      <w:lvlText w:val="o"/>
+      <w:lvlJc w:val="left"/>
+      <w:pPr>
+        <w:ind w:left="5760" w:hanging="360"/>
+      </w:pPr>
+      <w:rPr>
+        <w:rFonts w:ascii="Courier New" w:hAnsi="Courier New" w:cs="Courier New" w:hint="default"/>
+      </w:rPr>
+    </w:lvl>
+    <w:lvl w:ilvl="8" w:tplc="04090005" w:tentative="1">
+      <w:start w:val="1"/>
+      <w:numFmt w:val="bullet"/>
+      <w:lvlText w:val=""/>
+      <w:lvlJc w:val="left"/>
+      <w:pPr>
+        <w:ind w:left="6480" w:hanging="360"/>
+      </w:pPr>
+      <w:rPr>
+        <w:rFonts w:ascii="Wingdings" w:hAnsi="Wingdings" w:hint="default"/>
+      </w:rPr>
+    </w:lvl>
+  </w:abstractNum>
+  <w:abstractNum w:abstractNumId="8" w15:restartNumberingAfterBreak="0">
+    <w:nsid w:val="48274DD2"/>
+    <w:multiLevelType w:val="hybridMultilevel"/>
+    <w:tmpl w:val="7C3ED29E"/>
+    <w:lvl w:ilvl="0" w:tplc="04090001">
+      <w:start w:val="1"/>
+      <w:numFmt w:val="bullet"/>
+      <w:lvlText w:val=""/>
+      <w:lvlJc w:val="left"/>
+      <w:pPr>
+        <w:ind w:left="720" w:hanging="360"/>
+      </w:pPr>
+      <w:rPr>
+        <w:rFonts w:ascii="Symbol" w:hAnsi="Symbol" w:hint="default"/>
+      </w:rPr>
+    </w:lvl>
+    <w:lvl w:ilvl="1" w:tplc="04090003" w:tentative="1">
+      <w:start w:val="1"/>
+      <w:numFmt w:val="bullet"/>
+      <w:lvlText w:val="o"/>
+      <w:lvlJc w:val="left"/>
+      <w:pPr>
+        <w:ind w:left="1440" w:hanging="360"/>
+      </w:pPr>
+      <w:rPr>
+        <w:rFonts w:ascii="Courier New" w:hAnsi="Courier New" w:cs="Courier New" w:hint="default"/>
+      </w:rPr>
+    </w:lvl>
+    <w:lvl w:ilvl="2" w:tplc="04090005" w:tentative="1">
+      <w:start w:val="1"/>
+      <w:numFmt w:val="bullet"/>
+      <w:lvlText w:val=""/>
+      <w:lvlJc w:val="left"/>
+      <w:pPr>
+        <w:ind w:left="2160" w:hanging="360"/>
+      </w:pPr>
+      <w:rPr>
+        <w:rFonts w:ascii="Wingdings" w:hAnsi="Wingdings" w:hint="default"/>
+      </w:rPr>
+    </w:lvl>
+    <w:lvl w:ilvl="3" w:tplc="04090001" w:tentative="1">
+      <w:start w:val="1"/>
+      <w:numFmt w:val="bullet"/>
+      <w:lvlText w:val=""/>
+      <w:lvlJc w:val="left"/>
+      <w:pPr>
+        <w:ind w:left="2880" w:hanging="360"/>
+      </w:pPr>
+      <w:rPr>
+        <w:rFonts w:ascii="Symbol" w:hAnsi="Symbol" w:hint="default"/>
+      </w:rPr>
+    </w:lvl>
+    <w:lvl w:ilvl="4" w:tplc="04090003" w:tentative="1">
+      <w:start w:val="1"/>
+      <w:numFmt w:val="bullet"/>
+      <w:lvlText w:val="o"/>
+      <w:lvlJc w:val="left"/>
+      <w:pPr>
+        <w:ind w:left="3600" w:hanging="360"/>
+      </w:pPr>
+      <w:rPr>
+        <w:rFonts w:ascii="Courier New" w:hAnsi="Courier New" w:cs="Courier New" w:hint="default"/>
+      </w:rPr>
+    </w:lvl>
+    <w:lvl w:ilvl="5" w:tplc="04090005" w:tentative="1">
+      <w:start w:val="1"/>
+      <w:numFmt w:val="bullet"/>
+      <w:lvlText w:val=""/>
+      <w:lvlJc w:val="left"/>
+      <w:pPr>
+        <w:ind w:left="4320" w:hanging="360"/>
+      </w:pPr>
+      <w:rPr>
+        <w:rFonts w:ascii="Wingdings" w:hAnsi="Wingdings" w:hint="default"/>
+      </w:rPr>
+    </w:lvl>
+    <w:lvl w:ilvl="6" w:tplc="04090001" w:tentative="1">
+      <w:start w:val="1"/>
+      <w:numFmt w:val="bullet"/>
+      <w:lvlText w:val=""/>
+      <w:lvlJc w:val="left"/>
+      <w:pPr>
+        <w:ind w:left="5040" w:hanging="360"/>
+      </w:pPr>
+      <w:rPr>
+        <w:rFonts w:ascii="Symbol" w:hAnsi="Symbol" w:hint="default"/>
+      </w:rPr>
+    </w:lvl>
+    <w:lvl w:ilvl="7" w:tplc="04090003" w:tentative="1">
+      <w:start w:val="1"/>
+      <w:numFmt w:val="bullet"/>
+      <w:lvlText w:val="o"/>
+      <w:lvlJc w:val="left"/>
+      <w:pPr>
+        <w:ind w:left="5760" w:hanging="360"/>
+      </w:pPr>
+      <w:rPr>
+        <w:rFonts w:ascii="Courier New" w:hAnsi="Courier New" w:cs="Courier New" w:hint="default"/>
+      </w:rPr>
+    </w:lvl>
+    <w:lvl w:ilvl="8" w:tplc="04090005" w:tentative="1">
+      <w:start w:val="1"/>
+      <w:numFmt w:val="bullet"/>
+      <w:lvlText w:val=""/>
+      <w:lvlJc w:val="left"/>
+      <w:pPr>
+        <w:ind w:left="6480" w:hanging="360"/>
+      </w:pPr>
+      <w:rPr>
+        <w:rFonts w:ascii="Wingdings" w:hAnsi="Wingdings" w:hint="default"/>
+      </w:rPr>
+    </w:lvl>
+  </w:abstractNum>
+  <w:abstractNum w:abstractNumId="9" w15:restartNumberingAfterBreak="0">
+    <w:nsid w:val="515D25B4"/>
+    <w:multiLevelType w:val="hybridMultilevel"/>
+    <w:tmpl w:val="54F83574"/>
+    <w:lvl w:ilvl="0" w:tplc="04090001">
+      <w:start w:val="1"/>
+      <w:numFmt w:val="bullet"/>
+      <w:lvlText w:val=""/>
+      <w:lvlJc w:val="left"/>
+      <w:pPr>
+        <w:ind w:left="720" w:hanging="360"/>
+      </w:pPr>
+      <w:rPr>
+        <w:rFonts w:ascii="Symbol" w:hAnsi="Symbol" w:hint="default"/>
+      </w:rPr>
+    </w:lvl>
+    <w:lvl w:ilvl="1" w:tplc="04090003" w:tentative="1">
+      <w:start w:val="1"/>
+      <w:numFmt w:val="bullet"/>
+      <w:lvlText w:val="o"/>
+      <w:lvlJc w:val="left"/>
+      <w:pPr>
+        <w:ind w:left="1440" w:hanging="360"/>
+      </w:pPr>
+      <w:rPr>
+        <w:rFonts w:ascii="Courier New" w:hAnsi="Courier New" w:cs="Courier New" w:hint="default"/>
+      </w:rPr>
+    </w:lvl>
+    <w:lvl w:ilvl="2" w:tplc="04090005" w:tentative="1">
+      <w:start w:val="1"/>
+      <w:numFmt w:val="bullet"/>
+      <w:lvlText w:val=""/>
+      <w:lvlJc w:val="left"/>
+      <w:pPr>
+        <w:ind w:left="2160" w:hanging="360"/>
+      </w:pPr>
+      <w:rPr>
+        <w:rFonts w:ascii="Wingdings" w:hAnsi="Wingdings" w:hint="default"/>
+      </w:rPr>
+    </w:lvl>
+    <w:lvl w:ilvl="3" w:tplc="04090001" w:tentative="1">
+      <w:start w:val="1"/>
+      <w:numFmt w:val="bullet"/>
+      <w:lvlText w:val=""/>
+      <w:lvlJc w:val="left"/>
+      <w:pPr>
+        <w:ind w:left="2880" w:hanging="360"/>
+      </w:pPr>
+      <w:rPr>
+        <w:rFonts w:ascii="Symbol" w:hAnsi="Symbol" w:hint="default"/>
+      </w:rPr>
+    </w:lvl>
+    <w:lvl w:ilvl="4" w:tplc="04090003" w:tentative="1">
+      <w:start w:val="1"/>
+      <w:numFmt w:val="bullet"/>
+      <w:lvlText w:val="o"/>
+      <w:lvlJc w:val="left"/>
+      <w:pPr>
+        <w:ind w:left="3600" w:hanging="360"/>
+      </w:pPr>
+      <w:rPr>
+        <w:rFonts w:ascii="Courier New" w:hAnsi="Courier New" w:cs="Courier New" w:hint="default"/>
+      </w:rPr>
+    </w:lvl>
+    <w:lvl w:ilvl="5" w:tplc="04090005" w:tentative="1">
+      <w:start w:val="1"/>
+      <w:numFmt w:val="bullet"/>
+      <w:lvlText w:val=""/>
+      <w:lvlJc w:val="left"/>
+      <w:pPr>
+        <w:ind w:left="4320" w:hanging="360"/>
+      </w:pPr>
+      <w:rPr>
+        <w:rFonts w:ascii="Wingdings" w:hAnsi="Wingdings" w:hint="default"/>
+      </w:rPr>
+    </w:lvl>
+    <w:lvl w:ilvl="6" w:tplc="04090001" w:tentative="1">
+      <w:start w:val="1"/>
+      <w:numFmt w:val="bullet"/>
+      <w:lvlText w:val=""/>
+      <w:lvlJc w:val="left"/>
+      <w:pPr>
+        <w:ind w:left="5040" w:hanging="360"/>
+      </w:pPr>
+      <w:rPr>
+        <w:rFonts w:ascii="Symbol" w:hAnsi="Symbol" w:hint="default"/>
+      </w:rPr>
+    </w:lvl>
+    <w:lvl w:ilvl="7" w:tplc="04090003" w:tentative="1">
+      <w:start w:val="1"/>
+      <w:numFmt w:val="bullet"/>
+      <w:lvlText w:val="o"/>
+      <w:lvlJc w:val="left"/>
+      <w:pPr>
+        <w:ind w:left="5760" w:hanging="360"/>
+      </w:pPr>
+      <w:rPr>
+        <w:rFonts w:ascii="Courier New" w:hAnsi="Courier New" w:cs="Courier New" w:hint="default"/>
+      </w:rPr>
+    </w:lvl>
+    <w:lvl w:ilvl="8" w:tplc="04090005" w:tentative="1">
+      <w:start w:val="1"/>
+      <w:numFmt w:val="bullet"/>
+      <w:lvlText w:val=""/>
+      <w:lvlJc w:val="left"/>
+      <w:pPr>
+        <w:ind w:left="6480" w:hanging="360"/>
+      </w:pPr>
+      <w:rPr>
+        <w:rFonts w:ascii="Wingdings" w:hAnsi="Wingdings" w:hint="default"/>
+      </w:rPr>
+    </w:lvl>
+  </w:abstractNum>
+  <w:abstractNum w:abstractNumId="10" w15:restartNumberingAfterBreak="0">
+    <w:nsid w:val="67D055ED"/>
+    <w:multiLevelType w:val="hybridMultilevel"/>
+    <w:tmpl w:val="5538BCA6"/>
+    <w:lvl w:ilvl="0" w:tplc="04090001">
+      <w:start w:val="1"/>
+      <w:numFmt w:val="bullet"/>
+      <w:lvlText w:val=""/>
+      <w:lvlJc w:val="left"/>
+      <w:pPr>
+        <w:ind w:left="720" w:hanging="360"/>
+      </w:pPr>
+      <w:rPr>
+        <w:rFonts w:ascii="Symbol" w:hAnsi="Symbol" w:hint="default"/>
+      </w:rPr>
+    </w:lvl>
+    <w:lvl w:ilvl="1" w:tplc="04090003" w:tentative="1">
+      <w:start w:val="1"/>
+      <w:numFmt w:val="bullet"/>
+      <w:lvlText w:val="o"/>
+      <w:lvlJc w:val="left"/>
+      <w:pPr>
+        <w:ind w:left="1440" w:hanging="360"/>
+      </w:pPr>
+      <w:rPr>
+        <w:rFonts w:ascii="Courier New" w:hAnsi="Courier New" w:cs="Courier New" w:hint="default"/>
+      </w:rPr>
+    </w:lvl>
+    <w:lvl w:ilvl="2" w:tplc="04090005" w:tentative="1">
+      <w:start w:val="1"/>
+      <w:numFmt w:val="bullet"/>
+      <w:lvlText w:val=""/>
+      <w:lvlJc w:val="left"/>
+      <w:pPr>
+        <w:ind w:left="2160" w:hanging="360"/>
+      </w:pPr>
+      <w:rPr>
+        <w:rFonts w:ascii="Wingdings" w:hAnsi="Wingdings" w:hint="default"/>
+      </w:rPr>
+    </w:lvl>
+    <w:lvl w:ilvl="3" w:tplc="04090001" w:tentative="1">
+      <w:start w:val="1"/>
+      <w:numFmt w:val="bullet"/>
+      <w:lvlText w:val=""/>
+      <w:lvlJc w:val="left"/>
+      <w:pPr>
+        <w:ind w:left="2880" w:hanging="360"/>
+      </w:pPr>
+      <w:rPr>
+        <w:rFonts w:ascii="Symbol" w:hAnsi="Symbol" w:hint="default"/>
+      </w:rPr>
+    </w:lvl>
+    <w:lvl w:ilvl="4" w:tplc="04090003" w:tentative="1">
+      <w:start w:val="1"/>
+      <w:numFmt w:val="bullet"/>
+      <w:lvlText w:val="o"/>
+      <w:lvlJc w:val="left"/>
+      <w:pPr>
+        <w:ind w:left="3600" w:hanging="360"/>
+      </w:pPr>
+      <w:rPr>
+        <w:rFonts w:ascii="Courier New" w:hAnsi="Courier New" w:cs="Courier New" w:hint="default"/>
+      </w:rPr>
+    </w:lvl>
+    <w:lvl w:ilvl="5" w:tplc="04090005" w:tentative="1">
+      <w:start w:val="1"/>
+      <w:numFmt w:val="bullet"/>
+      <w:lvlText w:val=""/>
+      <w:lvlJc w:val="left"/>
+      <w:pPr>
+        <w:ind w:left="4320" w:hanging="360"/>
+      </w:pPr>
+      <w:rPr>
+        <w:rFonts w:ascii="Wingdings" w:hAnsi="Wingdings" w:hint="default"/>
+      </w:rPr>
+    </w:lvl>
+    <w:lvl w:ilvl="6" w:tplc="04090001" w:tentative="1">
+      <w:start w:val="1"/>
+      <w:numFmt w:val="bullet"/>
+      <w:lvlText w:val=""/>
+      <w:lvlJc w:val="left"/>
+      <w:pPr>
+        <w:ind w:left="5040" w:hanging="360"/>
+      </w:pPr>
+      <w:rPr>
+        <w:rFonts w:ascii="Symbol" w:hAnsi="Symbol" w:hint="default"/>
+      </w:rPr>
+    </w:lvl>
+    <w:lvl w:ilvl="7" w:tplc="04090003" w:tentative="1">
+      <w:start w:val="1"/>
+      <w:numFmt w:val="bullet"/>
+      <w:lvlText w:val="o"/>
+      <w:lvlJc w:val="left"/>
+      <w:pPr>
+        <w:ind w:left="5760" w:hanging="360"/>
+      </w:pPr>
+      <w:rPr>
+        <w:rFonts w:ascii="Courier New" w:hAnsi="Courier New" w:cs="Courier New" w:hint="default"/>
+      </w:rPr>
+    </w:lvl>
+    <w:lvl w:ilvl="8" w:tplc="04090005" w:tentative="1">
+      <w:start w:val="1"/>
+      <w:numFmt w:val="bullet"/>
+      <w:lvlText w:val=""/>
+      <w:lvlJc w:val="left"/>
+      <w:pPr>
+        <w:ind w:left="6480" w:hanging="360"/>
+      </w:pPr>
+      <w:rPr>
+        <w:rFonts w:ascii="Wingdings" w:hAnsi="Wingdings" w:hint="default"/>
+      </w:rPr>
+    </w:lvl>
+  </w:abstractNum>
+  <w:abstractNum w:abstractNumId="11" w15:restartNumberingAfterBreak="0">
+    <w:nsid w:val="782F7380"/>
+    <w:multiLevelType w:val="hybridMultilevel"/>
+    <w:tmpl w:val="D5BC158C"/>
+    <w:lvl w:ilvl="0" w:tplc="04090001">
+      <w:start w:val="1"/>
+      <w:numFmt w:val="bullet"/>
+      <w:lvlText w:val=""/>
+      <w:lvlJc w:val="left"/>
+      <w:pPr>
+        <w:ind w:left="720" w:hanging="360"/>
+      </w:pPr>
+      <w:rPr>
+        <w:rFonts w:ascii="Symbol" w:hAnsi="Symbol" w:hint="default"/>
+      </w:rPr>
+    </w:lvl>
+    <w:lvl w:ilvl="1" w:tplc="04090003" w:tentative="1">
+      <w:start w:val="1"/>
+      <w:numFmt w:val="bullet"/>
+      <w:lvlText w:val="o"/>
+      <w:lvlJc w:val="left"/>
+      <w:pPr>
+        <w:ind w:left="1440" w:hanging="360"/>
+      </w:pPr>
+      <w:rPr>
+        <w:rFonts w:ascii="Courier New" w:hAnsi="Courier New" w:cs="Courier New" w:hint="default"/>
+      </w:rPr>
+    </w:lvl>
+    <w:lvl w:ilvl="2" w:tplc="04090005" w:tentative="1">
+      <w:start w:val="1"/>
+      <w:numFmt w:val="bullet"/>
+      <w:lvlText w:val=""/>
+      <w:lvlJc w:val="left"/>
+      <w:pPr>
+        <w:ind w:left="2160" w:hanging="360"/>
+      </w:pPr>
+      <w:rPr>
+        <w:rFonts w:ascii="Wingdings" w:hAnsi="Wingdings" w:hint="default"/>
+      </w:rPr>
+    </w:lvl>
+    <w:lvl w:ilvl="3" w:tplc="04090001" w:tentative="1">
+      <w:start w:val="1"/>
+      <w:numFmt w:val="bullet"/>
+      <w:lvlText w:val=""/>
+      <w:lvlJc w:val="left"/>
+      <w:pPr>
+        <w:ind w:left="2880" w:hanging="360"/>
+      </w:pPr>
+      <w:rPr>
+        <w:rFonts w:ascii="Symbol" w:hAnsi="Symbol" w:hint="default"/>
+      </w:rPr>
+    </w:lvl>
+    <w:lvl w:ilvl="4" w:tplc="04090003" w:tentative="1">
+      <w:start w:val="1"/>
+      <w:numFmt w:val="bullet"/>
+      <w:lvlText w:val="o"/>
+      <w:lvlJc w:val="left"/>
+      <w:pPr>
+        <w:ind w:left="3600" w:hanging="360"/>
+      </w:pPr>
+      <w:rPr>
+        <w:rFonts w:ascii="Courier New" w:hAnsi="Courier New" w:cs="Courier New" w:hint="default"/>
+      </w:rPr>
+    </w:lvl>
+    <w:lvl w:ilvl="5" w:tplc="04090005" w:tentative="1">
+      <w:start w:val="1"/>
+      <w:numFmt w:val="bullet"/>
+      <w:lvlText w:val=""/>
+      <w:lvlJc w:val="left"/>
+      <w:pPr>
+        <w:ind w:left="4320" w:hanging="360"/>
+      </w:pPr>
+      <w:rPr>
+        <w:rFonts w:ascii="Wingdings" w:hAnsi="Wingdings" w:hint="default"/>
+      </w:rPr>
+    </w:lvl>
+    <w:lvl w:ilvl="6" w:tplc="04090001" w:tentative="1">
+      <w:start w:val="1"/>
+      <w:numFmt w:val="bullet"/>
+      <w:lvlText w:val=""/>
+      <w:lvlJc w:val="left"/>
+      <w:pPr>
+        <w:ind w:left="5040" w:hanging="360"/>
+      </w:pPr>
+      <w:rPr>
+        <w:rFonts w:ascii="Symbol" w:hAnsi="Symbol" w:hint="default"/>
+      </w:rPr>
+    </w:lvl>
+    <w:lvl w:ilvl="7" w:tplc="04090003" w:tentative="1">
+      <w:start w:val="1"/>
+      <w:numFmt w:val="bullet"/>
+      <w:lvlText w:val="o"/>
+      <w:lvlJc w:val="left"/>
+      <w:pPr>
+        <w:ind w:left="5760" w:hanging="360"/>
+      </w:pPr>
+      <w:rPr>
+        <w:rFonts w:ascii="Courier New" w:hAnsi="Courier New" w:cs="Courier New" w:hint="default"/>
+      </w:rPr>
+    </w:lvl>
+    <w:lvl w:ilvl="8" w:tplc="04090005" w:tentative="1">
+      <w:start w:val="1"/>
+      <w:numFmt w:val="bullet"/>
+      <w:lvlText w:val=""/>
+      <w:lvlJc w:val="left"/>
+      <w:pPr>
+        <w:ind w:left="6480" w:hanging="360"/>
+      </w:pPr>
+      <w:rPr>
+        <w:rFonts w:ascii="Wingdings" w:hAnsi="Wingdings" w:hint="default"/>
+      </w:rPr>
+    </w:lvl>
+  </w:abstractNum>
   <w:num w:numId="1" w16cid:durableId="1741902239">
+    <w:abstractNumId w:val="3"/>
+  </w:num>
+  <w:num w:numId="2" w16cid:durableId="1625036692">
+    <w:abstractNumId w:val="4"/>
+  </w:num>
+  <w:num w:numId="3" w16cid:durableId="635767949">
+    <w:abstractNumId w:val="6"/>
+  </w:num>
+  <w:num w:numId="4" w16cid:durableId="993335341">
+    <w:abstractNumId w:val="5"/>
+  </w:num>
+  <w:num w:numId="5" w16cid:durableId="1436556432">
+    <w:abstractNumId w:val="10"/>
+  </w:num>
+  <w:num w:numId="6" w16cid:durableId="585041474">
+    <w:abstractNumId w:val="9"/>
+  </w:num>
+  <w:num w:numId="7" w16cid:durableId="930814003">
     <w:abstractNumId w:val="0"/>
   </w:num>
-  <w:num w:numId="2" w16cid:durableId="1625036692">
+  <w:num w:numId="8" w16cid:durableId="316423016">
+    <w:abstractNumId w:val="8"/>
+  </w:num>
+  <w:num w:numId="9" w16cid:durableId="112212899">
+    <w:abstractNumId w:val="2"/>
+  </w:num>
+  <w:num w:numId="10" w16cid:durableId="1243032283">
+    <w:abstractNumId w:val="7"/>
+  </w:num>
+  <w:num w:numId="11" w16cid:durableId="27026851">
+    <w:abstractNumId w:val="11"/>
+  </w:num>
+  <w:num w:numId="12" w16cid:durableId="326131692">
     <w:abstractNumId w:val="1"/>
-  </w:num>
-  <w:num w:numId="3" w16cid:durableId="635767949">
-    <w:abstractNumId w:val="2"/>
   </w:num>
 </w:numbering>
 </file>
@@ -3356,7 +7159,6 @@
   <w:style w:type="character" w:default="1" w:styleId="DefaultParagraphFont">
     <w:name w:val="Default Paragraph Font"/>
     <w:uiPriority w:val="1"/>
-    <w:semiHidden/>
     <w:unhideWhenUsed/>
   </w:style>
   <w:style w:type="table" w:default="1" w:styleId="TableNormal">

</xml_diff>